<commit_message>
Aagaard, Larson, and classification fixes, apendix start 1-13-2025
</commit_message>
<xml_diff>
--- a/ms/BoomBust_ms_v2.3nb.docx
+++ b/ms/BoomBust_ms_v2.3nb.docx
@@ -560,77 +560,23 @@
           <w:sz w:val="24"/>
           <w:szCs w:val="24"/>
         </w:rPr>
-        <w:t xml:space="preserve">Abstract Word </w:t>
-      </w:r>
-      <w:proofErr w:type="gramStart"/>
-      <w:r>
-        <w:rPr>
-          <w:rFonts w:ascii="Times New Roman" w:eastAsia="Times New Roman" w:hAnsi="Times New Roman" w:cs="Times New Roman"/>
-          <w:sz w:val="24"/>
-          <w:szCs w:val="24"/>
-        </w:rPr>
-        <w:t>Count (##</w:t>
-      </w:r>
-      <w:proofErr w:type="gramEnd"/>
-      <w:r>
-        <w:rPr>
-          <w:rFonts w:ascii="Times New Roman" w:eastAsia="Times New Roman" w:hAnsi="Times New Roman" w:cs="Times New Roman"/>
-          <w:sz w:val="24"/>
-          <w:szCs w:val="24"/>
-        </w:rPr>
-        <w:t xml:space="preserve">), </w:t>
-      </w:r>
-      <w:r>
-        <w:rPr>
-          <w:rFonts w:ascii="Times New Roman" w:eastAsia="Times New Roman" w:hAnsi="Times New Roman" w:cs="Times New Roman"/>
-          <w:sz w:val="24"/>
-          <w:szCs w:val="24"/>
-        </w:rPr>
-        <w:t xml:space="preserve">Main </w:t>
-      </w:r>
-      <w:proofErr w:type="gramStart"/>
-      <w:r>
-        <w:rPr>
-          <w:rFonts w:ascii="Times New Roman" w:eastAsia="Times New Roman" w:hAnsi="Times New Roman" w:cs="Times New Roman"/>
-          <w:sz w:val="24"/>
-          <w:szCs w:val="24"/>
-        </w:rPr>
-        <w:t>Text (##</w:t>
-      </w:r>
-      <w:proofErr w:type="gramEnd"/>
-      <w:r>
-        <w:rPr>
-          <w:rFonts w:ascii="Times New Roman" w:eastAsia="Times New Roman" w:hAnsi="Times New Roman" w:cs="Times New Roman"/>
-          <w:sz w:val="24"/>
-          <w:szCs w:val="24"/>
-        </w:rPr>
-        <w:t>), Text Box</w:t>
-      </w:r>
-      <w:r>
-        <w:rPr>
-          <w:rFonts w:ascii="Times New Roman" w:eastAsia="Times New Roman" w:hAnsi="Times New Roman" w:cs="Times New Roman"/>
-          <w:sz w:val="24"/>
-          <w:szCs w:val="24"/>
-        </w:rPr>
-        <w:t xml:space="preserve"> 1 Word </w:t>
-      </w:r>
-      <w:proofErr w:type="gramStart"/>
-      <w:r>
-        <w:rPr>
-          <w:rFonts w:ascii="Times New Roman" w:eastAsia="Times New Roman" w:hAnsi="Times New Roman" w:cs="Times New Roman"/>
-          <w:sz w:val="24"/>
-          <w:szCs w:val="24"/>
-        </w:rPr>
-        <w:t>Count (##</w:t>
-      </w:r>
-      <w:proofErr w:type="gramEnd"/>
-      <w:r>
-        <w:rPr>
-          <w:rFonts w:ascii="Times New Roman" w:eastAsia="Times New Roman" w:hAnsi="Times New Roman" w:cs="Times New Roman"/>
-          <w:sz w:val="24"/>
-          <w:szCs w:val="24"/>
-        </w:rPr>
-        <w:t>)</w:t>
+        <w:t xml:space="preserve">Abstract Word Count (##), </w:t>
+      </w:r>
+      <w:r>
+        <w:rPr>
+          <w:rFonts w:ascii="Times New Roman" w:eastAsia="Times New Roman" w:hAnsi="Times New Roman" w:cs="Times New Roman"/>
+          <w:sz w:val="24"/>
+          <w:szCs w:val="24"/>
+        </w:rPr>
+        <w:t>Main Text (##), Text Box</w:t>
+      </w:r>
+      <w:r>
+        <w:rPr>
+          <w:rFonts w:ascii="Times New Roman" w:eastAsia="Times New Roman" w:hAnsi="Times New Roman" w:cs="Times New Roman"/>
+          <w:sz w:val="24"/>
+          <w:szCs w:val="24"/>
+        </w:rPr>
+        <w:t xml:space="preserve"> 1 Word Count (##)</w:t>
       </w:r>
     </w:p>
     <w:p>
@@ -642,77 +588,13 @@
           <w:szCs w:val="24"/>
         </w:rPr>
       </w:pPr>
-      <w:proofErr w:type="gramStart"/>
-      <w:r>
-        <w:rPr>
-          <w:rFonts w:ascii="Times New Roman" w:eastAsia="Times New Roman" w:hAnsi="Times New Roman" w:cs="Times New Roman"/>
-          <w:sz w:val="24"/>
-          <w:szCs w:val="24"/>
-        </w:rPr>
-        <w:t>References (##</w:t>
-      </w:r>
-      <w:proofErr w:type="gramEnd"/>
-      <w:r>
-        <w:rPr>
-          <w:rFonts w:ascii="Times New Roman" w:eastAsia="Times New Roman" w:hAnsi="Times New Roman" w:cs="Times New Roman"/>
-          <w:sz w:val="24"/>
-          <w:szCs w:val="24"/>
-        </w:rPr>
-        <w:t xml:space="preserve">), </w:t>
-      </w:r>
-      <w:proofErr w:type="gramStart"/>
-      <w:r>
-        <w:rPr>
-          <w:rFonts w:ascii="Times New Roman" w:eastAsia="Times New Roman" w:hAnsi="Times New Roman" w:cs="Times New Roman"/>
-          <w:sz w:val="24"/>
-          <w:szCs w:val="24"/>
-        </w:rPr>
-        <w:t>Figures (##</w:t>
-      </w:r>
-      <w:proofErr w:type="gramEnd"/>
-      <w:r>
-        <w:rPr>
-          <w:rFonts w:ascii="Times New Roman" w:eastAsia="Times New Roman" w:hAnsi="Times New Roman" w:cs="Times New Roman"/>
-          <w:sz w:val="24"/>
-          <w:szCs w:val="24"/>
-        </w:rPr>
-        <w:t xml:space="preserve">), </w:t>
-      </w:r>
-      <w:proofErr w:type="gramStart"/>
-      <w:r>
-        <w:rPr>
-          <w:rFonts w:ascii="Times New Roman" w:eastAsia="Times New Roman" w:hAnsi="Times New Roman" w:cs="Times New Roman"/>
-          <w:sz w:val="24"/>
-          <w:szCs w:val="24"/>
-        </w:rPr>
-        <w:t>Tables (##</w:t>
-      </w:r>
-      <w:proofErr w:type="gramEnd"/>
-      <w:r>
-        <w:rPr>
-          <w:rFonts w:ascii="Times New Roman" w:eastAsia="Times New Roman" w:hAnsi="Times New Roman" w:cs="Times New Roman"/>
-          <w:sz w:val="24"/>
-          <w:szCs w:val="24"/>
-        </w:rPr>
-        <w:t xml:space="preserve">), Text </w:t>
-      </w:r>
-      <w:proofErr w:type="gramStart"/>
-      <w:r>
-        <w:rPr>
-          <w:rFonts w:ascii="Times New Roman" w:eastAsia="Times New Roman" w:hAnsi="Times New Roman" w:cs="Times New Roman"/>
-          <w:sz w:val="24"/>
-          <w:szCs w:val="24"/>
-        </w:rPr>
-        <w:t>boxes (##</w:t>
-      </w:r>
-      <w:proofErr w:type="gramEnd"/>
-      <w:r>
-        <w:rPr>
-          <w:rFonts w:ascii="Times New Roman" w:eastAsia="Times New Roman" w:hAnsi="Times New Roman" w:cs="Times New Roman"/>
-          <w:sz w:val="24"/>
-          <w:szCs w:val="24"/>
-        </w:rPr>
-        <w:t>)</w:t>
+      <w:r>
+        <w:rPr>
+          <w:rFonts w:ascii="Times New Roman" w:eastAsia="Times New Roman" w:hAnsi="Times New Roman" w:cs="Times New Roman"/>
+          <w:sz w:val="24"/>
+          <w:szCs w:val="24"/>
+        </w:rPr>
+        <w:t>References (##), Figures (##), Tables (##), Text boxes (##)</w:t>
       </w:r>
     </w:p>
     <w:p>
@@ -758,25 +640,7 @@
           <w:sz w:val="24"/>
           <w:szCs w:val="24"/>
         </w:rPr>
-        <w:t xml:space="preserve">Upon acceptance, all data and code associated with the manuscript will be provided in </w:t>
-      </w:r>
-      <w:proofErr w:type="spellStart"/>
-      <w:r>
-        <w:rPr>
-          <w:rFonts w:ascii="Times New Roman" w:eastAsia="Times New Roman" w:hAnsi="Times New Roman" w:cs="Times New Roman"/>
-          <w:sz w:val="24"/>
-          <w:szCs w:val="24"/>
-        </w:rPr>
-        <w:t>Zenodo</w:t>
-      </w:r>
-      <w:proofErr w:type="spellEnd"/>
-      <w:r>
-        <w:rPr>
-          <w:rFonts w:ascii="Times New Roman" w:eastAsia="Times New Roman" w:hAnsi="Times New Roman" w:cs="Times New Roman"/>
-          <w:sz w:val="24"/>
-          <w:szCs w:val="24"/>
-        </w:rPr>
-        <w:t>. For review, the data and code can be found in (</w:t>
+        <w:t>Upon acceptance, all data and code associated with the manuscript will be provided in Zenodo. For review, the data and code can be found in (</w:t>
       </w:r>
       <w:r>
         <w:rPr>
@@ -1305,25 +1169,23 @@
           <w:sz w:val="24"/>
           <w:szCs w:val="24"/>
         </w:rPr>
-        <w:t xml:space="preserve"> Of the </w:t>
-      </w:r>
-      <w:proofErr w:type="gramStart"/>
+        <w:t xml:space="preserve"> Of the 452 time series we compiled, 195 met our inclusion criteria</w:t>
+      </w:r>
       <w:r>
         <w:rPr>
           <w:rFonts w:ascii="Times New Roman" w:eastAsia="Gungsuh" w:hAnsi="Times New Roman" w:cs="Times New Roman"/>
           <w:sz w:val="24"/>
           <w:szCs w:val="24"/>
         </w:rPr>
-        <w:t>452 time</w:t>
-      </w:r>
-      <w:proofErr w:type="gramEnd"/>
+        <w:t>, 165 had phases detected using regime shift analysis, 87 had some evidence of sustained declines that were ≥ 90% from the maximum abundance</w:t>
+      </w:r>
       <w:r>
         <w:rPr>
           <w:rFonts w:ascii="Times New Roman" w:eastAsia="Gungsuh" w:hAnsi="Times New Roman" w:cs="Times New Roman"/>
           <w:sz w:val="24"/>
           <w:szCs w:val="24"/>
         </w:rPr>
-        <w:t xml:space="preserve"> series we compiled, 195 met our inclusion criteria</w:t>
+        <w:t>,</w:t>
       </w:r>
       <w:r>
         <w:rPr>
@@ -1331,7 +1193,7 @@
           <w:sz w:val="24"/>
           <w:szCs w:val="24"/>
         </w:rPr>
-        <w:t>, 165 had phases detected using regime shift analysis, 87 had some evidence of sustained declines that were ≥ 90% from the maximum abundance</w:t>
+        <w:t xml:space="preserve"> and 33 met the full definition of a boom-b</w:t>
       </w:r>
       <w:r>
         <w:rPr>
@@ -1339,7 +1201,7 @@
           <w:sz w:val="24"/>
           <w:szCs w:val="24"/>
         </w:rPr>
-        <w:t>,</w:t>
+        <w:t>ust</w:t>
       </w:r>
       <w:r>
         <w:rPr>
@@ -1347,7 +1209,7 @@
           <w:sz w:val="24"/>
           <w:szCs w:val="24"/>
         </w:rPr>
-        <w:t xml:space="preserve"> and 33 met the full definition of a boom-b</w:t>
+        <w:t>.</w:t>
       </w:r>
       <w:r>
         <w:rPr>
@@ -1355,41 +1217,7 @@
           <w:sz w:val="24"/>
           <w:szCs w:val="24"/>
         </w:rPr>
-        <w:t>ust</w:t>
-      </w:r>
-      <w:r>
-        <w:rPr>
-          <w:rFonts w:ascii="Times New Roman" w:eastAsia="Gungsuh" w:hAnsi="Times New Roman" w:cs="Times New Roman"/>
-          <w:sz w:val="24"/>
-          <w:szCs w:val="24"/>
-        </w:rPr>
-        <w:t>.</w:t>
-      </w:r>
-      <w:r>
-        <w:rPr>
-          <w:rFonts w:ascii="Times New Roman" w:eastAsia="Gungsuh" w:hAnsi="Times New Roman" w:cs="Times New Roman"/>
-          <w:sz w:val="24"/>
-          <w:szCs w:val="24"/>
-        </w:rPr>
-        <w:t xml:space="preserve"> The </w:t>
-      </w:r>
-      <w:proofErr w:type="gramStart"/>
-      <w:r>
-        <w:rPr>
-          <w:rFonts w:ascii="Times New Roman" w:eastAsia="Gungsuh" w:hAnsi="Times New Roman" w:cs="Times New Roman"/>
-          <w:sz w:val="24"/>
-          <w:szCs w:val="24"/>
-        </w:rPr>
-        <w:t>87 time</w:t>
-      </w:r>
-      <w:proofErr w:type="gramEnd"/>
-      <w:r>
-        <w:rPr>
-          <w:rFonts w:ascii="Times New Roman" w:eastAsia="Gungsuh" w:hAnsi="Times New Roman" w:cs="Times New Roman"/>
-          <w:sz w:val="24"/>
-          <w:szCs w:val="24"/>
-        </w:rPr>
-        <w:t xml:space="preserve"> series with evidence of sustained declines that were ≥ 90%</w:t>
+        <w:t xml:space="preserve"> The 87 time series with evidence of sustained declines that were ≥ 90%</w:t>
       </w:r>
       <w:r>
         <w:rPr>
@@ -2601,7 +2429,23 @@
           <w:sz w:val="24"/>
           <w:szCs w:val="24"/>
         </w:rPr>
-        <w:t>that some invasions are transient</w:t>
+        <w:t xml:space="preserve">that invasions </w:t>
+      </w:r>
+      <w:r>
+        <w:rPr>
+          <w:rFonts w:ascii="Times New Roman" w:eastAsia="Times New Roman" w:hAnsi="Times New Roman" w:cs="Times New Roman"/>
+          <w:sz w:val="24"/>
+          <w:szCs w:val="24"/>
+        </w:rPr>
+        <w:t>can be</w:t>
+      </w:r>
+      <w:r>
+        <w:rPr>
+          <w:rFonts w:ascii="Times New Roman" w:eastAsia="Times New Roman" w:hAnsi="Times New Roman" w:cs="Times New Roman"/>
+          <w:sz w:val="24"/>
+          <w:szCs w:val="24"/>
+        </w:rPr>
+        <w:t xml:space="preserve"> transient</w:t>
       </w:r>
       <w:r>
         <w:rPr>
@@ -5106,25 +4950,7 @@
           <w:sz w:val="24"/>
           <w:szCs w:val="24"/>
         </w:rPr>
-        <w:t xml:space="preserve"> that </w:t>
-      </w:r>
-      <w:proofErr w:type="gramStart"/>
-      <w:r>
-        <w:rPr>
-          <w:rFonts w:ascii="Times New Roman" w:eastAsia="Times New Roman" w:hAnsi="Times New Roman" w:cs="Times New Roman"/>
-          <w:sz w:val="24"/>
-          <w:szCs w:val="24"/>
-        </w:rPr>
-        <w:t>have</w:t>
-      </w:r>
-      <w:proofErr w:type="gramEnd"/>
-      <w:r>
-        <w:rPr>
-          <w:rFonts w:ascii="Times New Roman" w:eastAsia="Times New Roman" w:hAnsi="Times New Roman" w:cs="Times New Roman"/>
-          <w:sz w:val="24"/>
-          <w:szCs w:val="24"/>
-        </w:rPr>
-        <w:t xml:space="preserve"> previously been described as boom-busts.</w:t>
+        <w:t xml:space="preserve"> that have previously been described as boom-busts.</w:t>
       </w:r>
       <w:r>
         <w:rPr>
@@ -5381,25 +5207,7 @@
           <w:sz w:val="24"/>
           <w:szCs w:val="24"/>
         </w:rPr>
-        <w:t xml:space="preserve"> using Web of Science with the following keywords: boom and bust; explosion and crash; population and explosion; population and outbreak; population and cycles; </w:t>
-      </w:r>
-      <w:proofErr w:type="spellStart"/>
-      <w:r>
-        <w:rPr>
-          <w:rFonts w:ascii="Times New Roman" w:eastAsia="Times New Roman" w:hAnsi="Times New Roman" w:cs="Times New Roman"/>
-          <w:sz w:val="24"/>
-          <w:szCs w:val="24"/>
-        </w:rPr>
-        <w:t>fluctuat</w:t>
-      </w:r>
-      <w:proofErr w:type="spellEnd"/>
-      <w:r>
-        <w:rPr>
-          <w:rFonts w:ascii="Times New Roman" w:eastAsia="Times New Roman" w:hAnsi="Times New Roman" w:cs="Times New Roman"/>
-          <w:sz w:val="24"/>
-          <w:szCs w:val="24"/>
-        </w:rPr>
-        <w:t xml:space="preserve">* populations.  </w:t>
+        <w:t xml:space="preserve"> using Web of Science with the following keywords: boom and bust; explosion and crash; population and explosion; population and outbreak; population and cycles; fluctuat* populations.  </w:t>
       </w:r>
       <w:r>
         <w:rPr>
@@ -5849,25 +5657,7 @@
           <w:sz w:val="24"/>
           <w:szCs w:val="24"/>
         </w:rPr>
-        <w:t xml:space="preserve">s using the </w:t>
-      </w:r>
-      <w:proofErr w:type="spellStart"/>
-      <w:r>
-        <w:rPr>
-          <w:rFonts w:ascii="Times New Roman" w:eastAsia="Times New Roman" w:hAnsi="Times New Roman" w:cs="Times New Roman"/>
-          <w:sz w:val="24"/>
-          <w:szCs w:val="24"/>
-        </w:rPr>
-        <w:t>metaDigitise</w:t>
-      </w:r>
-      <w:proofErr w:type="spellEnd"/>
-      <w:r>
-        <w:rPr>
-          <w:rFonts w:ascii="Times New Roman" w:eastAsia="Times New Roman" w:hAnsi="Times New Roman" w:cs="Times New Roman"/>
-          <w:sz w:val="24"/>
-          <w:szCs w:val="24"/>
-        </w:rPr>
-        <w:t xml:space="preserve"> package</w:t>
+        <w:t>s using the metaDigitise package</w:t>
       </w:r>
       <w:r>
         <w:rPr>
@@ -6383,18 +6173,126 @@
           <w:sz w:val="24"/>
           <w:szCs w:val="24"/>
         </w:rPr>
-        <w:t xml:space="preserve">, respectively. The remaining taxa were found in large trait databases when available (i.e., </w:t>
-      </w:r>
-      <w:proofErr w:type="spellStart"/>
-      <w:r>
-        <w:rPr>
-          <w:rFonts w:ascii="Times New Roman" w:eastAsia="Times New Roman" w:hAnsi="Times New Roman" w:cs="Times New Roman"/>
-          <w:sz w:val="24"/>
-          <w:szCs w:val="24"/>
-        </w:rPr>
-        <w:t>AnAge</w:t>
-      </w:r>
-      <w:proofErr w:type="spellEnd"/>
+        <w:t>, respectively. The remaining taxa were found in large trait databases when available (i.e., AnAge-</w:t>
+      </w:r>
+      <w:r>
+        <w:rPr>
+          <w:rFonts w:ascii="Times New Roman" w:eastAsia="Times New Roman" w:hAnsi="Times New Roman" w:cs="Times New Roman"/>
+          <w:sz w:val="24"/>
+          <w:szCs w:val="24"/>
+        </w:rPr>
+        <w:fldChar w:fldCharType="begin"/>
+      </w:r>
+      <w:r>
+        <w:rPr>
+          <w:rFonts w:ascii="Times New Roman" w:eastAsia="Times New Roman" w:hAnsi="Times New Roman" w:cs="Times New Roman"/>
+          <w:sz w:val="24"/>
+          <w:szCs w:val="24"/>
+        </w:rPr>
+        <w:instrText xml:space="preserve"> ADDIN ZOTERO_ITEM CSL_CITATION {"citationID":"F2ozVks3","properties":{"formattedCitation":"(De Magalh\\uc0\\u227{}es &amp; Costa 2009)","plainCitation":"(De Magalhães &amp; Costa 2009)","dontUpdate":true,"noteIndex":0},"citationItems":[{"id":4154,"uris":["http://zotero.org/users/9972654/items/2DZQVUXN"],"itemData":{"id":4154,"type":"article-journal","abstract":"Longevity is a major characteristic of animals that has long fascinated scientists. In this work, we present a comprehensive database of animal longevity records and related life-history traits entitled AnAge, which we compiled and manually curated from an extensive literature. AnAge started as a collection of longevity records, but has since been expanded to include quantitative data for numerous other life-history traits, including body masses at different developmental stages, reproductive data such as age at sexual maturity and measurements of reproductive output, and physiological traits related to metabolism. AnAge features over 4000 vertebrate species and is a central resource for applying the comparative method to studies of longevity and life-history evolution across the tree of life. Moreover, by providing a reference value for longevity and other life-history traits, AnAge can prove valuable to a broad range of biologists working in evolutionary biology, ecology, zoology, physiology and conservation biology. AnAge is freely available online (http://genomics.senescence.info/species/).","container-title":"Journal of Evolutionary Biology","DOI":"10.1111/j.1420-9101.2009.01783.x","ISSN":"1010-061X, 1420-9101","issue":"8","journalAbbreviation":"J of Evolutionary Biology","language":"en","page":"1770-1774","source":"DOI.org (Crossref)","title":"A database of vertebrate longevity records and their relation to other life‐history traits","volume":"22","author":[{"family":"De Magalhães","given":"J. P."},{"family":"Costa","given":"J."}],"issued":{"date-parts":[["2009",8]]}}}],"schema":"https://github.com/citation-style-language/schema/raw/master/csl-citation.json"} </w:instrText>
+      </w:r>
+      <w:r>
+        <w:rPr>
+          <w:rFonts w:ascii="Times New Roman" w:eastAsia="Times New Roman" w:hAnsi="Times New Roman" w:cs="Times New Roman"/>
+          <w:sz w:val="24"/>
+          <w:szCs w:val="24"/>
+        </w:rPr>
+        <w:fldChar w:fldCharType="separate"/>
+      </w:r>
+      <w:r>
+        <w:rPr>
+          <w:rFonts w:ascii="Times New Roman" w:hAnsi="Times New Roman" w:cs="Times New Roman"/>
+          <w:sz w:val="24"/>
+        </w:rPr>
+        <w:t>De Magalhães &amp; Costa 2009</w:t>
+      </w:r>
+      <w:r>
+        <w:rPr>
+          <w:rFonts w:ascii="Times New Roman" w:eastAsia="Times New Roman" w:hAnsi="Times New Roman" w:cs="Times New Roman"/>
+          <w:sz w:val="24"/>
+          <w:szCs w:val="24"/>
+        </w:rPr>
+        <w:fldChar w:fldCharType="end"/>
+      </w:r>
+      <w:r>
+        <w:rPr>
+          <w:rFonts w:ascii="Times New Roman" w:eastAsia="Times New Roman" w:hAnsi="Times New Roman" w:cs="Times New Roman"/>
+          <w:sz w:val="24"/>
+          <w:szCs w:val="24"/>
+        </w:rPr>
+        <w:t>, FishBase-</w:t>
+      </w:r>
+      <w:r>
+        <w:rPr>
+          <w:rFonts w:ascii="Times New Roman" w:eastAsia="Times New Roman" w:hAnsi="Times New Roman" w:cs="Times New Roman"/>
+          <w:sz w:val="24"/>
+          <w:szCs w:val="24"/>
+        </w:rPr>
+        <w:fldChar w:fldCharType="begin"/>
+      </w:r>
+      <w:r>
+        <w:rPr>
+          <w:rFonts w:ascii="Times New Roman" w:eastAsia="Times New Roman" w:hAnsi="Times New Roman" w:cs="Times New Roman"/>
+          <w:sz w:val="24"/>
+          <w:szCs w:val="24"/>
+        </w:rPr>
+        <w:instrText xml:space="preserve"> ADDIN ZOTERO_ITEM CSL_CITATION {"citationID":"kVk4fCZD","properties":{"formattedCitation":"(Froese {\\i{}et al.} 1992)","plainCitation":"(Froese et al. 1992)","dontUpdate":true,"noteIndex":0},"citationItems":[{"id":4378,"uris":["http://zotero.org/users/9972654/items/LZAMYXRE"],"itemData":{"id":4378,"type":"article-journal","container-title":"ICLARM Software","page":"48","source":"Zotero","title":"Draft User's Manual of Fish Base A Biological Database on Fish (ver. 1.0)","volume":"7","author":[{"family":"Froese","given":"R"},{"family":"Palomares","given":"M L D"},{"family":"Pauly","given":"D"}],"issued":{"date-parts":[["1992",12]]}}}],"schema":"https://github.com/citation-style-language/schema/raw/master/csl-citation.json"} </w:instrText>
+      </w:r>
+      <w:r>
+        <w:rPr>
+          <w:rFonts w:ascii="Times New Roman" w:eastAsia="Times New Roman" w:hAnsi="Times New Roman" w:cs="Times New Roman"/>
+          <w:sz w:val="24"/>
+          <w:szCs w:val="24"/>
+        </w:rPr>
+        <w:fldChar w:fldCharType="separate"/>
+      </w:r>
+      <w:r>
+        <w:rPr>
+          <w:rFonts w:ascii="Times New Roman" w:hAnsi="Times New Roman" w:cs="Times New Roman"/>
+          <w:sz w:val="24"/>
+        </w:rPr>
+        <w:t xml:space="preserve">Froese </w:t>
+      </w:r>
+      <w:r>
+        <w:rPr>
+          <w:rFonts w:ascii="Times New Roman" w:hAnsi="Times New Roman" w:cs="Times New Roman"/>
+          <w:i/>
+          <w:iCs/>
+          <w:sz w:val="24"/>
+        </w:rPr>
+        <w:t>et al.</w:t>
+      </w:r>
+      <w:r>
+        <w:rPr>
+          <w:rFonts w:ascii="Times New Roman" w:hAnsi="Times New Roman" w:cs="Times New Roman"/>
+          <w:sz w:val="24"/>
+        </w:rPr>
+        <w:t xml:space="preserve"> 1992</w:t>
+      </w:r>
+      <w:r>
+        <w:rPr>
+          <w:rFonts w:ascii="Times New Roman" w:eastAsia="Times New Roman" w:hAnsi="Times New Roman" w:cs="Times New Roman"/>
+          <w:sz w:val="24"/>
+          <w:szCs w:val="24"/>
+        </w:rPr>
+        <w:fldChar w:fldCharType="end"/>
+      </w:r>
+      <w:r>
+        <w:rPr>
+          <w:rFonts w:ascii="Times New Roman" w:eastAsia="Times New Roman" w:hAnsi="Times New Roman" w:cs="Times New Roman"/>
+          <w:sz w:val="24"/>
+          <w:szCs w:val="24"/>
+        </w:rPr>
+        <w:t>,</w:t>
+      </w:r>
+      <w:r>
+        <w:rPr>
+          <w:rFonts w:ascii="Times New Roman" w:eastAsia="Times New Roman" w:hAnsi="Times New Roman" w:cs="Times New Roman"/>
+          <w:sz w:val="24"/>
+          <w:szCs w:val="24"/>
+        </w:rPr>
+        <w:t xml:space="preserve"> TRY-trait database</w:t>
+      </w:r>
       <w:r>
         <w:rPr>
           <w:rFonts w:ascii="Times New Roman" w:eastAsia="Times New Roman" w:hAnsi="Times New Roman" w:cs="Times New Roman"/>
@@ -6417,7 +6315,7 @@
           <w:sz w:val="24"/>
           <w:szCs w:val="24"/>
         </w:rPr>
-        <w:instrText xml:space="preserve"> ADDIN ZOTERO_ITEM CSL_CITATION {"citationID":"F2ozVks3","properties":{"formattedCitation":"(De Magalh\\uc0\\u227{}es &amp; Costa 2009)","plainCitation":"(De Magalhães &amp; Costa 2009)","dontUpdate":true,"noteIndex":0},"citationItems":[{"id":4154,"uris":["http://zotero.org/users/9972654/items/2DZQVUXN"],"itemData":{"id":4154,"type":"article-journal","abstract":"Longevity is a major characteristic of animals that has long fascinated scientists. In this work, we present a comprehensive database of animal longevity records and related life-history traits entitled AnAge, which we compiled and manually curated from an extensive literature. AnAge started as a collection of longevity records, but has since been expanded to include quantitative data for numerous other life-history traits, including body masses at different developmental stages, reproductive data such as age at sexual maturity and measurements of reproductive output, and physiological traits related to metabolism. AnAge features over 4000 vertebrate species and is a central resource for applying the comparative method to studies of longevity and life-history evolution across the tree of life. Moreover, by providing a reference value for longevity and other life-history traits, AnAge can prove valuable to a broad range of biologists working in evolutionary biology, ecology, zoology, physiology and conservation biology. AnAge is freely available online (http://genomics.senescence.info/species/).","container-title":"Journal of Evolutionary Biology","DOI":"10.1111/j.1420-9101.2009.01783.x","ISSN":"1010-061X, 1420-9101","issue":"8","journalAbbreviation":"J of Evolutionary Biology","language":"en","page":"1770-1774","source":"DOI.org (Crossref)","title":"A database of vertebrate longevity records and their relation to other life‐history traits","volume":"22","author":[{"family":"De Magalhães","given":"J. P."},{"family":"Costa","given":"J."}],"issued":{"date-parts":[["2009",8]]}}}],"schema":"https://github.com/citation-style-language/schema/raw/master/csl-citation.json"} </w:instrText>
+        <w:instrText xml:space="preserve"> ADDIN ZOTERO_ITEM CSL_CITATION {"citationID":"mvCuItQE","properties":{"formattedCitation":"(Kattge {\\i{}et al.} 2020)","plainCitation":"(Kattge et al. 2020)","dontUpdate":true,"noteIndex":0},"citationItems":[{"id":4381,"uris":["http://zotero.org/users/9972654/items/R5ILBKQ2"],"itemData":{"id":4381,"type":"article-journal","abstract":"Plant traits—the morphological, anatomical, physiological, biochemical and phenological characteristics of plants—determine how plants respond to environmental factors, affect other trophic levels, and influence ecosystem properties and their benefits and detriments to people. Plant trait data thus represent the basis for a vast area of research spanning from evolutionary biology, community and functional ecology, to biodiversity conservation, ecosystem and landscape management, restoration, biogeography and earth system modelling. Since its foundation in 2007, the TRY database of plant traits has grown continuously. It now provides unprecedented data coverage under an open access data policy and is the main plant trait database used by the research community worldwide. Increasingly, the TRY database also supports new frontiers of trait-based plant research, including the identification of data gaps and the subsequent mobilization or measurement of new data. To support this development, in this article we evaluate the extent of the trait data compiled in TRY and analyse emerging patterns of data coverage and representativeness. Best species coverage is achieved for categorical traits—almost complete coverage for ‘plant growth form’. However, most traits relevant for ecology and vegetation modelling are characterized by continuous intraspecific variation and trait–environmental relationships. These traits have to be measured on individual plants in their respective environment. Despite unprecedented data coverage, we observe a humbling lack of completeness and representativeness of these continuous traits in many aspects. We, therefore, conclude that reducing data gaps and biases in the TRY database remains a key challenge and requires a coordinated approach to data mobilization and trait measurements. This can only be achieved in collaboration with other initiatives.","container-title":"Global Change Biology","DOI":"10.1111/gcb.14904","ISSN":"1354-1013, 1365-2486","issue":"1","journalAbbreviation":"Global Change Biology","language":"en","page":"119-188","source":"DOI.org (Crossref)","title":"TRY plant trait database – enhanced coverage and open access","volume":"26","author":[{"family":"Kattge","given":"Jens"},{"family":"Bönisch","given":"Gerhard"},{"family":"Díaz","given":"Sandra"},{"family":"Lavorel","given":"Sandra"},{"family":"Prentice","given":"Iain Colin"},{"family":"Leadley","given":"Paul"},{"family":"Tautenhahn","given":"Susanne"},{"family":"Werner","given":"Gijsbert D. A."},{"family":"Aakala","given":"Tuomas"},{"family":"Abedi","given":"Mehdi"},{"family":"Acosta","given":"Alicia T. R."},{"family":"Adamidis","given":"George C."},{"family":"Adamson","given":"Kairi"},{"family":"Aiba","given":"Masahiro"},{"family":"Albert","given":"Cécile H."},{"family":"Alcántara","given":"Julio M."},{"family":"Alcázar C","given":"Carolina"},{"family":"Aleixo","given":"Izabela"},{"family":"Ali","given":"Hamada"},{"family":"Amiaud","given":"Bernard"},{"family":"Ammer","given":"Christian"},{"family":"Amoroso","given":"Mariano M."},{"family":"Anand","given":"Madhur"},{"family":"Anderson","given":"Carolyn"},{"family":"Anten","given":"Niels"},{"family":"Antos","given":"Joseph"},{"family":"Apgaua","given":"Deborah Mattos Guimarães"},{"family":"Ashman","given":"Tia‐Lynn"},{"family":"Asmara","given":"Degi Harja"},{"family":"Asner","given":"Gregory P."},{"family":"Aspinwall","given":"Michael"},{"family":"Atkin","given":"Owen"},{"family":"Aubin","given":"Isabelle"},{"family":"Baastrup‐Spohr","given":"Lars"},{"family":"Bahalkeh","given":"Khadijeh"},{"family":"Bahn","given":"Michael"},{"family":"Baker","given":"Timothy"},{"family":"Baker","given":"William J."},{"family":"Bakker","given":"Jan P."},{"family":"Baldocchi","given":"Dennis"},{"family":"Baltzer","given":"Jennifer"},{"family":"Banerjee","given":"Arindam"},{"family":"Baranger","given":"Anne"},{"family":"Barlow","given":"Jos"},{"family":"Barneche","given":"Diego R."},{"family":"Baruch","given":"Zdravko"},{"family":"Bastianelli","given":"Denis"},{"family":"Battles","given":"John"},{"family":"Bauerle","given":"William"},{"family":"Bauters","given":"Marijn"},{"family":"Bazzato","given":"Erika"},{"family":"Beckmann","given":"Michael"},{"family":"Beeckman","given":"Hans"},{"family":"Beierkuhnlein","given":"Carl"},{"family":"Bekker","given":"Renee"},{"family":"Belfry","given":"Gavin"},{"family":"Belluau","given":"Michael"},{"family":"Beloiu","given":"Mirela"},{"family":"Benavides","given":"Raquel"},{"family":"Benomar","given":"Lahcen"},{"family":"Berdugo‐Lattke","given":"Mary Lee"},{"family":"Berenguer","given":"Erika"},{"family":"Bergamin","given":"Rodrigo"},{"family":"Bergmann","given":"Joana"},{"family":"Bergmann Carlucci","given":"Marcos"},{"family":"Berner","given":"Logan"},{"family":"Bernhardt‐Römermann","given":"Markus"},{"family":"Bigler","given":"Christof"},{"family":"Bjorkman","given":"Anne D."},{"family":"Blackman","given":"Chris"},{"family":"Blanco","given":"Carolina"},{"family":"Blonder","given":"Benjamin"},{"family":"Blumenthal","given":"Dana"},{"family":"Bocanegra‐González","given":"Kelly T."},{"family":"Boeckx","given":"Pascal"},{"family":"Bohlman","given":"Stephanie"},{"family":"Böhning‐Gaese","given":"Katrin"},{"family":"Boisvert‐Marsh","given":"Laura"},{"family":"Bond","given":"William"},{"family":"Bond‐Lamberty","given":"Ben"},{"family":"Boom","given":"Arnoud"},{"family":"Boonman","given":"Coline C. F."},{"family":"Bordin","given":"Kauane"},{"family":"Boughton","given":"Elizabeth H."},{"family":"Boukili","given":"Vanessa"},{"family":"Bowman","given":"David M. J. S."},{"family":"Bravo","given":"Sandra"},{"family":"Brendel","given":"Marco Richard"},{"family":"Broadley","given":"Martin R."},{"family":"Brown","given":"Kerry A."},{"family":"Bruelheide","given":"Helge"},{"family":"Brumnich","given":"Federico"},{"family":"Bruun","given":"Hans Henrik"},{"family":"Bruy","given":"David"},{"family":"Buchanan","given":"Serra W."},{"family":"Bucher","given":"Solveig Franziska"},{"family":"Buchmann","given":"Nina"},{"family":"Buitenwerf","given":"Robert"},{"family":"Bunker","given":"Daniel E."},{"family":"Bürger","given":"Jana"},{"family":"Burrascano","given":"Sabina"},{"family":"Burslem","given":"David F. R. P."},{"family":"Butterfield","given":"Bradley J."},{"family":"Byun","given":"Chaeho"},{"family":"Marques","given":"Marcia"},{"family":"Scalon","given":"Marina C."},{"family":"Caccianiga","given":"Marco"},{"family":"Cadotte","given":"Marc"},{"family":"Cailleret","given":"Maxime"},{"family":"Camac","given":"James"},{"family":"Camarero","given":"Jesús Julio"},{"family":"Campany","given":"Courtney"},{"family":"Campetella","given":"Giandiego"},{"family":"Campos","given":"Juan Antonio"},{"family":"Cano‐Arboleda","given":"Laura"},{"family":"Canullo","given":"Roberto"},{"family":"Carbognani","given":"Michele"},{"family":"Carvalho","given":"Fabio"},{"family":"Casanoves","given":"Fernando"},{"family":"Castagneyrol","given":"Bastien"},{"family":"Catford","given":"Jane A."},{"family":"Cavender‐Bares","given":"Jeannine"},{"family":"Cerabolini","given":"Bruno E. L."},{"family":"Cervellini","given":"Marco"},{"family":"Chacón‐Madrigal","given":"Eduardo"},{"family":"Chapin","given":"Kenneth"},{"family":"Chapin","given":"F. Stuart"},{"family":"Chelli","given":"Stefano"},{"family":"Chen","given":"Si‐Chong"},{"family":"Chen","given":"Anping"},{"family":"Cherubini","given":"Paolo"},{"family":"Chianucci","given":"Francesco"},{"family":"Choat","given":"Brendan"},{"family":"Chung","given":"Kyong‐Sook"},{"family":"Chytrý","given":"Milan"},{"family":"Ciccarelli","given":"Daniela"},{"family":"Coll","given":"Lluís"},{"family":"Collins","given":"Courtney G."},{"family":"Conti","given":"Luisa"},{"family":"Coomes","given":"David"},{"family":"Cornelissen","given":"Johannes H. C."},{"family":"Cornwell","given":"William K."},{"family":"Corona","given":"Piermaria"},{"family":"Coyea","given":"Marie"},{"family":"Craine","given":"Joseph"},{"family":"Craven","given":"Dylan"},{"family":"Cromsigt","given":"Joris P. G. M."},{"family":"Csecserits","given":"Anikó"},{"family":"Cufar","given":"Katarina"},{"family":"Cuntz","given":"Matthias"},{"family":"Da Silva","given":"Ana Carolina"},{"family":"Dahlin","given":"Kyla M."},{"family":"Dainese","given":"Matteo"},{"family":"Dalke","given":"Igor"},{"family":"Dalle Fratte","given":"Michele"},{"family":"Dang‐Le","given":"Anh Tuan"},{"family":"Danihelka","given":"Jirí"},{"family":"Dannoura","given":"Masako"},{"family":"Dawson","given":"Samantha"},{"family":"De Beer","given":"Arend Jacobus"},{"family":"De Frutos","given":"Angel"},{"family":"De Long","given":"Jonathan R."},{"family":"Dechant","given":"Benjamin"},{"family":"Delagrange","given":"Sylvain"},{"family":"Delpierre","given":"Nicolas"},{"family":"Derroire","given":"Géraldine"},{"family":"Dias","given":"Arildo S."},{"family":"Diaz‐Toribio","given":"Milton Hugo"},{"family":"Dimitrakopoulos","given":"Panayiotis G."},{"family":"Dobrowolski","given":"Mark"},{"family":"Doktor","given":"Daniel"},{"family":"Dřevojan","given":"Pavel"},{"family":"Dong","given":"Ning"},{"family":"Dransfield","given":"John"},{"family":"Dressler","given":"Stefan"},{"family":"Duarte","given":"Leandro"},{"family":"Ducouret","given":"Emilie"},{"family":"Dullinger","given":"Stefan"},{"family":"Durka","given":"Walter"},{"family":"Duursma","given":"Remko"},{"family":"Dymova","given":"Olga"},{"family":"E‐Vojtkó","given":"Anna"},{"family":"Eckstein","given":"Rolf Lutz"},{"family":"Ejtehadi","given":"Hamid"},{"family":"Elser","given":"James"},{"family":"Emilio","given":"Thaise"},{"family":"Engemann","given":"Kristine"},{"family":"Erfanian","given":"Mohammad Bagher"},{"family":"Erfmeier","given":"Alexandra"},{"family":"Esquivel‐Muelbert","given":"Adriane"},{"family":"Esser","given":"Gerd"},{"family":"Estiarte","given":"Marc"},{"family":"Domingues","given":"Tomas F."},{"family":"Fagan","given":"William F."},{"family":"Fagúndez","given":"Jaime"},{"family":"Falster","given":"Daniel S."},{"family":"Fan","given":"Ying"},{"family":"Fang","given":"Jingyun"},{"family":"Farris","given":"Emmanuele"},{"family":"Fazlioglu","given":"Fatih"},{"family":"Feng","given":"Yanhao"},{"family":"Fernandez‐Mendez","given":"Fernando"},{"family":"Ferrara","given":"Carlotta"},{"family":"Ferreira","given":"Joice"},{"family":"Fidelis","given":"Alessandra"},{"family":"Finegan","given":"Bryan"},{"family":"Firn","given":"Jennifer"},{"family":"Flowers","given":"Timothy J."},{"family":"Flynn","given":"Dan F. B."},{"family":"Fontana","given":"Veronika"},{"family":"Forey","given":"Estelle"},{"family":"Forgiarini","given":"Cristiane"},{"family":"François","given":"Louis"},{"family":"Frangipani","given":"Marcelo"},{"family":"Frank","given":"Dorothea"},{"family":"Frenette‐Dussault","given":"Cedric"},{"family":"Freschet","given":"Grégoire T."},{"family":"Fry","given":"Ellen L."},{"family":"Fyllas","given":"Nikolaos M."},{"family":"Mazzochini","given":"Guilherme G."},{"family":"Gachet","given":"Sophie"},{"family":"Gallagher","given":"Rachael"},{"family":"Ganade","given":"Gislene"},{"family":"Ganga","given":"Francesca"},{"family":"García‐Palacios","given":"Pablo"},{"family":"Gargaglione","given":"Verónica"},{"family":"Garnier","given":"Eric"},{"family":"Garrido","given":"Jose Luis"},{"family":"De Gasper","given":"André Luís"},{"family":"Gea‐Izquierdo","given":"Guillermo"},{"family":"Gibson","given":"David"},{"family":"Gillison","given":"Andrew N."},{"family":"Giroldo","given":"Aelton"},{"family":"Glasenhardt","given":"Mary‐Claire"},{"family":"Gleason","given":"Sean"},{"family":"Gliesch","given":"Mariana"},{"family":"Goldberg","given":"Emma"},{"family":"Göldel","given":"Bastian"},{"family":"Gonzalez‐Akre","given":"Erika"},{"family":"Gonzalez‐Andujar","given":"Jose L."},{"family":"González‐Melo","given":"Andrés"},{"family":"González‐Robles","given":"Ana"},{"family":"Graae","given":"Bente Jessen"},{"family":"Granda","given":"Elena"},{"family":"Graves","given":"Sarah"},{"family":"Green","given":"Walton A."},{"family":"Gregor","given":"Thomas"},{"family":"Gross","given":"Nicolas"},{"family":"Guerin","given":"Greg R."},{"family":"Günther","given":"Angela"},{"family":"Gutiérrez","given":"Alvaro G."},{"family":"Haddock","given":"Lillie"},{"family":"Haines","given":"Anna"},{"family":"Hall","given":"Jefferson"},{"family":"Hambuckers","given":"Alain"},{"family":"Han","given":"Wenxuan"},{"family":"Harrison","given":"Sandy P."},{"family":"Hattingh","given":"Wesley"},{"family":"Hawes","given":"Joseph E."},{"family":"He","given":"Tianhua"},{"family":"He","given":"Pengcheng"},{"family":"Heberling","given":"Jacob Mason"},{"family":"Helm","given":"Aveliina"},{"family":"Hempel","given":"Stefan"},{"family":"Hentschel","given":"Jörn"},{"family":"Hérault","given":"Bruno"},{"family":"Hereş","given":"Ana‐Maria"},{"family":"Herz","given":"Katharina"},{"family":"Heuertz","given":"Myriam"},{"family":"Hickler","given":"Thomas"},{"family":"Hietz","given":"Peter"},{"family":"Higuchi","given":"Pedro"},{"family":"Hipp","given":"Andrew L."},{"family":"Hirons","given":"Andrew"},{"family":"Hock","given":"Maria"},{"family":"Hogan","given":"James Aaron"},{"family":"Holl","given":"Karen"},{"family":"Honnay","given":"Olivier"},{"family":"Hornstein","given":"Daniel"},{"family":"Hou","given":"Enqing"},{"family":"Hough‐Snee","given":"Nate"},{"family":"Hovstad","given":"Knut Anders"},{"family":"Ichie","given":"Tomoaki"},{"family":"Igić","given":"Boris"},{"family":"Illa","given":"Estela"},{"family":"Isaac","given":"Marney"},{"family":"Ishihara","given":"Masae"},{"family":"Ivanov","given":"Leonid"},{"family":"Ivanova","given":"Larissa"},{"family":"Iversen","given":"Colleen M."},{"family":"Izquierdo","given":"Jordi"},{"family":"Jackson","given":"Robert B."},{"family":"Jackson","given":"Benjamin"},{"family":"Jactel","given":"Hervé"},{"family":"Jagodzinski","given":"Andrzej M."},{"family":"Jandt","given":"Ute"},{"family":"Jansen","given":"Steven"},{"family":"Jenkins","given":"Thomas"},{"family":"Jentsch","given":"Anke"},{"family":"Jespersen","given":"Jens Rasmus Plantener"},{"family":"Jiang","given":"Guo‐Feng"},{"family":"Johansen","given":"Jesper Liengaard"},{"family":"Johnson","given":"David"},{"family":"Jokela","given":"Eric J."},{"family":"Joly","given":"Carlos Alfredo"},{"family":"Jordan","given":"Gregory J."},{"family":"Joseph","given":"Grant Stuart"},{"family":"Junaedi","given":"Decky"},{"family":"Junker","given":"Robert R."},{"family":"Justes","given":"Eric"},{"family":"Kabzems","given":"Richard"},{"family":"Kane","given":"Jeffrey"},{"family":"Kaplan","given":"Zdenek"},{"family":"Kattenborn","given":"Teja"},{"family":"Kavelenova","given":"Lyudmila"},{"family":"Kearsley","given":"Elizabeth"},{"family":"Kempel","given":"Anne"},{"family":"Kenzo","given":"Tanaka"},{"family":"Kerkhoff","given":"Andrew"},{"family":"Khalil","given":"Mohammed I."},{"family":"Kinlock","given":"Nicole L."},{"family":"Kissling","given":"Wilm Daniel"},{"family":"Kitajima","given":"Kaoru"},{"family":"Kitzberger","given":"Thomas"},{"family":"Kjøller","given":"Rasmus"},{"family":"Klein","given":"Tamir"},{"family":"Kleyer","given":"Michael"},{"family":"Klimešová","given":"Jitka"},{"family":"Klipel","given":"Joice"},{"family":"Kloeppel","given":"Brian"},{"family":"Klotz","given":"Stefan"},{"family":"Knops","given":"Johannes M. H."},{"family":"Kohyama","given":"Takashi"},{"family":"Koike","given":"Fumito"},{"family":"Kollmann","given":"Johannes"},{"family":"Komac","given":"Benjamin"},{"family":"Komatsu","given":"Kimberly"},{"family":"König","given":"Christian"},{"family":"Kraft","given":"Nathan J. B."},{"family":"Kramer","given":"Koen"},{"family":"Kreft","given":"Holger"},{"family":"Kühn","given":"Ingolf"},{"family":"Kumarathunge","given":"Dushan"},{"family":"Kuppler","given":"Jonas"},{"family":"Kurokawa","given":"Hiroko"},{"family":"Kurosawa","given":"Yoko"},{"family":"Kuyah","given":"Shem"},{"family":"Laclau","given":"Jean‐Paul"},{"family":"Lafleur","given":"Benoit"},{"family":"Lallai","given":"Erik"},{"family":"Lamb","given":"Eric"},{"family":"Lamprecht","given":"Andrea"},{"family":"Larkin","given":"Daniel J."},{"family":"Laughlin","given":"Daniel"},{"family":"Le Bagousse‐Pinguet","given":"Yoann"},{"family":"Le Maire","given":"Guerric"},{"family":"Le Roux","given":"Peter C."},{"family":"Le Roux","given":"Elizabeth"},{"family":"Lee","given":"Tali"},{"family":"Lens","given":"Frederic"},{"family":"Lewis","given":"Simon L."},{"family":"Lhotsky","given":"Barbara"},{"family":"Li","given":"Yuanzhi"},{"family":"Li","given":"Xine"},{"family":"Lichstein","given":"Jeremy W."},{"family":"Liebergesell","given":"Mario"},{"family":"Lim","given":"Jun Ying"},{"family":"Lin","given":"Yan‐Shih"},{"family":"Linares","given":"Juan Carlos"},{"family":"Liu","given":"Chunjiang"},{"family":"Liu","given":"Daijun"},{"family":"Liu","given":"Udayangani"},{"family":"Livingstone","given":"Stuart"},{"family":"Llusià","given":"Joan"},{"family":"Lohbeck","given":"Madelon"},{"family":"López‐García","given":"Álvaro"},{"family":"Lopez‐Gonzalez","given":"Gabriela"},{"family":"Lososová","given":"Zdeňka"},{"family":"Louault","given":"Frédérique"},{"family":"Lukács","given":"Balázs A."},{"family":"Lukeš","given":"Petr"},{"family":"Luo","given":"Yunjian"},{"family":"Lussu","given":"Michele"},{"family":"Ma","given":"Siyan"},{"family":"Maciel Rabelo Pereira","given":"Camilla"},{"family":"Mack","given":"Michelle"},{"family":"Maire","given":"Vincent"},{"family":"Mäkelä","given":"Annikki"},{"family":"Mäkinen","given":"Harri"},{"family":"Malhado","given":"Ana Claudia Mendes"},{"family":"Mallik","given":"Azim"},{"family":"Manning","given":"Peter"},{"family":"Manzoni","given":"Stefano"},{"family":"Marchetti","given":"Zuleica"},{"family":"Marchino","given":"Luca"},{"family":"Marcilio‐Silva","given":"Vinicius"},{"family":"Marcon","given":"Eric"},{"family":"Marignani","given":"Michela"},{"family":"Markesteijn","given":"Lars"},{"family":"Martin","given":"Adam"},{"family":"Martínez‐Garza","given":"Cristina"},{"family":"Martínez‐Vilalta","given":"Jordi"},{"family":"Mašková","given":"Tereza"},{"family":"Mason","given":"Kelly"},{"family":"Mason","given":"Norman"},{"family":"Massad","given":"Tara Joy"},{"family":"Masse","given":"Jacynthe"},{"family":"Mayrose","given":"Itay"},{"family":"McCarthy","given":"James"},{"family":"McCormack","given":"M. Luke"},{"family":"McCulloh","given":"Katherine"},{"family":"McFadden","given":"Ian R."},{"family":"McGill","given":"Brian J."},{"family":"McPartland","given":"Mara Y."},{"family":"Medeiros","given":"Juliana S."},{"family":"Medlyn","given":"Belinda"},{"family":"Meerts","given":"Pierre"},{"family":"Mehrabi","given":"Zia"},{"family":"Meir","given":"Patrick"},{"family":"Melo","given":"Felipe P. L."},{"family":"Mencuccini","given":"Maurizio"},{"family":"Meredieu","given":"Céline"},{"family":"Messier","given":"Julie"},{"family":"Mészáros","given":"Ilona"},{"family":"Metsaranta","given":"Juha"},{"family":"Michaletz","given":"Sean T."},{"family":"Michelaki","given":"Chrysanthi"},{"family":"Migalina","given":"Svetlana"},{"family":"Milla","given":"Ruben"},{"family":"Miller","given":"Jesse E. D."},{"family":"Minden","given":"Vanessa"},{"family":"Ming","given":"Ray"},{"family":"Mokany","given":"Karel"},{"family":"Moles","given":"Angela T."},{"family":"Molnár","given":"Attila"},{"family":"Molofsky","given":"Jane"},{"family":"Molz","given":"Martin"},{"family":"Montgomery","given":"Rebecca A."},{"family":"Monty","given":"Arnaud"},{"family":"Moravcová","given":"Lenka"},{"family":"Moreno‐Martínez","given":"Alvaro"},{"family":"Moretti","given":"Marco"},{"family":"Mori","given":"Akira S."},{"family":"Mori","given":"Shigeta"},{"family":"Morris","given":"Dave"},{"family":"Morrison","given":"Jane"},{"family":"Mucina","given":"Ladislav"},{"family":"Mueller","given":"Sandra"},{"family":"Muir","given":"Christopher D."},{"family":"Müller","given":"Sandra Cristina"},{"family":"Munoz","given":"François"},{"family":"Myers‐Smith","given":"Isla H."},{"family":"Myster","given":"Randall W."},{"family":"Nagano","given":"Masahiro"},{"family":"Naidu","given":"Shawna"},{"family":"Narayanan","given":"Ayyappan"},{"family":"Natesan","given":"Balachandran"},{"family":"Negoita","given":"Luka"},{"family":"Nelson","given":"Andrew S."},{"family":"Neuschulz","given":"Eike Lena"},{"family":"Ni","given":"Jian"},{"family":"Niedrist","given":"Georg"},{"family":"Nieto","given":"Jhon"},{"family":"Niinemets","given":"Ülo"},{"family":"Nolan","given":"Rachael"},{"family":"Nottebrock","given":"Henning"},{"family":"Nouvellon","given":"Yann"},{"family":"Novakovskiy","given":"Alexander"},{"literal":"The Nutrient Network"},{"family":"Nystuen","given":"Kristin Odden"},{"family":"O'Grady","given":"Anthony"},{"family":"O'Hara","given":"Kevin"},{"family":"O'Reilly‐Nugent","given":"Andrew"},{"family":"Oakley","given":"Simon"},{"family":"Oberhuber","given":"Walter"},{"family":"Ohtsuka","given":"Toshiyuki"},{"family":"Oliveira","given":"Ricardo"},{"family":"Öllerer","given":"Kinga"},{"family":"Olson","given":"Mark E."},{"family":"Onipchenko","given":"Vladimir"},{"family":"Onoda","given":"Yusuke"},{"family":"Onstein","given":"Renske E."},{"family":"Ordonez","given":"Jenny C."},{"family":"Osada","given":"Noriyuki"},{"family":"Ostonen","given":"Ivika"},{"family":"Ottaviani","given":"Gianluigi"},{"family":"Otto","given":"Sarah"},{"family":"Overbeck","given":"Gerhard E."},{"family":"Ozinga","given":"Wim A."},{"family":"Pahl","given":"Anna T."},{"family":"Paine","given":"C. E. Timothy"},{"family":"Pakeman","given":"Robin J."},{"family":"Papageorgiou","given":"Aristotelis C."},{"family":"Parfionova","given":"Evgeniya"},{"family":"Pärtel","given":"Meelis"},{"family":"Patacca","given":"Marco"},{"family":"Paula","given":"Susana"},{"family":"Paule","given":"Juraj"},{"family":"Pauli","given":"Harald"},{"family":"Pausas","given":"Juli G."},{"family":"Peco","given":"Begoña"},{"family":"Penuelas","given":"Josep"},{"family":"Perea","given":"Antonio"},{"family":"Peri","given":"Pablo Luis"},{"family":"Petisco‐Souza","given":"Ana Carolina"},{"family":"Petraglia","given":"Alessandro"},{"family":"Petritan","given":"Any Mary"},{"family":"Phillips","given":"Oliver L."},{"family":"Pierce","given":"Simon"},{"family":"Pillar","given":"Valério D."},{"family":"Pisek","given":"Jan"},{"family":"Pomogaybin","given":"Alexandr"},{"family":"Poorter","given":"Hendrik"},{"family":"Portsmuth","given":"Angelika"},{"family":"Poschlod","given":"Peter"},{"family":"Potvin","given":"Catherine"},{"family":"Pounds","given":"Devon"},{"family":"Powell","given":"A. Shafer"},{"family":"Power","given":"Sally A."},{"family":"Prinzing","given":"Andreas"},{"family":"Puglielli","given":"Giacomo"},{"family":"Pyšek","given":"Petr"},{"family":"Raevel","given":"Valerie"},{"family":"Rammig","given":"Anja"},{"family":"Ransijn","given":"Johannes"},{"family":"Ray","given":"Courtenay A."},{"family":"Reich","given":"Peter B."},{"family":"Reichstein","given":"Markus"},{"family":"Reid","given":"Douglas E. B."},{"family":"Réjou‐Méchain","given":"Maxime"},{"family":"De Dios","given":"Victor Resco"},{"family":"Ribeiro","given":"Sabina"},{"family":"Richardson","given":"Sarah"},{"family":"Riibak","given":"Kersti"},{"family":"Rillig","given":"Matthias C."},{"family":"Riviera","given":"Fiamma"},{"family":"Robert","given":"Elisabeth M. R."},{"family":"Roberts","given":"Scott"},{"family":"Robroek","given":"Bjorn"},{"family":"Roddy","given":"Adam"},{"family":"Rodrigues","given":"Arthur Vinicius"},{"family":"Rogers","given":"Alistair"},{"family":"Rollinson","given":"Emily"},{"family":"Rolo","given":"Victor"},{"family":"Römermann","given":"Christine"},{"family":"Ronzhina","given":"Dina"},{"family":"Roscher","given":"Christiane"},{"family":"Rosell","given":"Julieta A."},{"family":"Rosenfield","given":"Milena Fermina"},{"family":"Rossi","given":"Christian"},{"family":"Roy","given":"David B."},{"family":"Royer‐Tardif","given":"Samuel"},{"family":"Rüger","given":"Nadja"},{"family":"Ruiz‐Peinado","given":"Ricardo"},{"family":"Rumpf","given":"Sabine B."},{"family":"Rusch","given":"Graciela M."},{"family":"Ryo","given":"Masahiro"},{"family":"Sack","given":"Lawren"},{"family":"Saldaña","given":"Angela"},{"family":"Salgado‐Negret","given":"Beatriz"},{"family":"Salguero‐Gomez","given":"Roberto"},{"family":"Santa‐Regina","given":"Ignacio"},{"family":"Santacruz‐García","given":"Ana Carolina"},{"family":"Santos","given":"Joaquim"},{"family":"Sardans","given":"Jordi"},{"family":"Schamp","given":"Brandon"},{"family":"Scherer‐Lorenzen","given":"Michael"},{"family":"Schleuning","given":"Matthias"},{"family":"Schmid","given":"Bernhard"},{"family":"Schmidt","given":"Marco"},{"family":"Schmitt","given":"Sylvain"},{"family":"Schneider","given":"Julio V."},{"family":"Schowanek","given":"Simon D."},{"family":"Schrader","given":"Julian"},{"family":"Schrodt","given":"Franziska"},{"family":"Schuldt","given":"Bernhard"},{"family":"Schurr","given":"Frank"},{"family":"Selaya Garvizu","given":"Galia"},{"family":"Semchenko","given":"Marina"},{"family":"Seymour","given":"Colleen"},{"family":"Sfair","given":"Julia C."},{"family":"Sharpe","given":"Joanne M."},{"family":"Sheppard","given":"Christine S."},{"family":"Sheremetiev","given":"Serge"},{"family":"Shiodera","given":"Satomi"},{"family":"Shipley","given":"Bill"},{"family":"Shovon","given":"Tanvir Ahmed"},{"family":"Siebenkäs","given":"Alrun"},{"family":"Sierra","given":"Carlos"},{"family":"Silva","given":"Vasco"},{"family":"Silva","given":"Mateus"},{"family":"Sitzia","given":"Tommaso"},{"family":"Sjöman","given":"Henrik"},{"family":"Slot","given":"Martijn"},{"family":"Smith","given":"Nicholas G."},{"family":"Sodhi","given":"Darwin"},{"family":"Soltis","given":"Pamela"},{"family":"Soltis","given":"Douglas"},{"family":"Somers","given":"Ben"},{"family":"Sonnier","given":"Grégory"},{"family":"Sørensen","given":"Mia Vedel"},{"family":"Sosinski","given":"Enio Egon"},{"family":"Soudzilovskaia","given":"Nadejda A."},{"family":"Souza","given":"Alexandre F."},{"family":"Spasojevic","given":"Marko"},{"family":"Sperandii","given":"Marta Gaia"},{"family":"Stan","given":"Amanda B."},{"family":"Stegen","given":"James"},{"family":"Steinbauer","given":"Klaus"},{"family":"Stephan","given":"Jörg G."},{"family":"Sterck","given":"Frank"},{"family":"Stojanovic","given":"Dejan B."},{"family":"Strydom","given":"Tanya"},{"family":"Suarez","given":"Maria Laura"},{"family":"Svenning","given":"Jens‐Christian"},{"family":"Svitková","given":"Ivana"},{"family":"Svitok","given":"Marek"},{"family":"Svoboda","given":"Miroslav"},{"family":"Swaine","given":"Emily"},{"family":"Swenson","given":"Nathan"},{"family":"Tabarelli","given":"Marcelo"},{"family":"Takagi","given":"Kentaro"},{"family":"Tappeiner","given":"Ulrike"},{"family":"Tarifa","given":"Rubén"},{"family":"Tauugourdeau","given":"Simon"},{"family":"Tavsanoglu","given":"Cagatay"},{"family":"Te Beest","given":"Mariska"},{"family":"Tedersoo","given":"Leho"},{"family":"Thiffault","given":"Nelson"},{"family":"Thom","given":"Dominik"},{"family":"Thomas","given":"Evert"},{"family":"Thompson","given":"Ken"},{"family":"Thornton","given":"Peter E."},{"family":"Thuiller","given":"Wilfried"},{"family":"Tichý","given":"Lubomír"},{"family":"Tissue","given":"David"},{"family":"Tjoelker","given":"Mark G."},{"family":"Tng","given":"David Yue Phin"},{"family":"Tobias","given":"Joseph"},{"family":"Török","given":"Péter"},{"family":"Tarin","given":"Tonantzin"},{"family":"Torres‐Ruiz","given":"José M."},{"family":"Tóthmérész","given":"Béla"},{"family":"Treurnicht","given":"Martina"},{"family":"Trivellone","given":"Valeria"},{"family":"Trolliet","given":"Franck"},{"family":"Trotsiuk","given":"Volodymyr"},{"family":"Tsakalos","given":"James L."},{"family":"Tsiripidis","given":"Ioannis"},{"family":"Tysklind","given":"Niklas"},{"family":"Umehara","given":"Toru"},{"family":"Usoltsev","given":"Vladimir"},{"family":"Vadeboncoeur","given":"Matthew"},{"family":"Vaezi","given":"Jamil"},{"family":"Valladares","given":"Fernando"},{"family":"Vamosi","given":"Jana"},{"family":"Van Bodegom","given":"Peter M."},{"family":"Van Breugel","given":"Michiel"},{"family":"Van Cleemput","given":"Elisa"},{"family":"Van De Weg","given":"Martine"},{"family":"Van Der Merwe","given":"Stephni"},{"family":"Van Der Plas","given":"Fons"},{"family":"Van Der Sande","given":"Masha T."},{"family":"Van Kleunen","given":"Mark"},{"family":"Van Meerbeek","given":"Koenraad"},{"family":"Vanderwel","given":"Mark"},{"family":"Vanselow","given":"Kim André"},{"family":"Vårhammar","given":"Angelica"},{"family":"Varone","given":"Laura"},{"family":"Vasquez Valderrama","given":"Maribel Yesenia"},{"family":"Vassilev","given":"Kiril"},{"family":"Vellend","given":"Mark"},{"family":"Veneklaas","given":"Erik J."},{"family":"Verbeeck","given":"Hans"},{"family":"Verheyen","given":"Kris"},{"family":"Vibrans","given":"Alexander"},{"family":"Vieira","given":"Ima"},{"family":"Villacís","given":"Jaime"},{"family":"Violle","given":"Cyrille"},{"family":"Vivek","given":"Pandi"},{"family":"Wagner","given":"Katrin"},{"family":"Waldram","given":"Matthew"},{"family":"Waldron","given":"Anthony"},{"family":"Walker","given":"Anthony P."},{"family":"Waller","given":"Martyn"},{"family":"Walther","given":"Gabriel"},{"family":"Wang","given":"Han"},{"family":"Wang","given":"Feng"},{"family":"Wang","given":"Weiqi"},{"family":"Watkins","given":"Harry"},{"family":"Watkins","given":"James"},{"family":"Weber","given":"Ulrich"},{"family":"Weedon","given":"James T."},{"family":"Wei","given":"Liping"},{"family":"Weigelt","given":"Patrick"},{"family":"Weiher","given":"Evan"},{"family":"Wells","given":"Aidan W."},{"family":"Wellstein","given":"Camilla"},{"family":"Wenk","given":"Elizabeth"},{"family":"Westoby","given":"Mark"},{"family":"Westwood","given":"Alana"},{"family":"White","given":"Philip John"},{"family":"Whitten","given":"Mark"},{"family":"Williams","given":"Mathew"},{"family":"Winkler","given":"Daniel E."},{"family":"Winter","given":"Klaus"},{"family":"Womack","given":"Chevonne"},{"family":"Wright","given":"Ian J."},{"family":"Wright","given":"S. Joseph"},{"family":"Wright","given":"Justin"},{"family":"Pinho","given":"Bruno X."},{"family":"Ximenes","given":"Fabiano"},{"family":"Yamada","given":"Toshihiro"},{"family":"Yamaji","given":"Keiko"},{"family":"Yanai","given":"Ruth"},{"family":"Yankov","given":"Nikolay"},{"family":"Yguel","given":"Benjamin"},{"family":"Zanini","given":"Kátia Janaina"},{"family":"Zanne","given":"Amy E."},{"family":"Zelený","given":"David"},{"family":"Zhao","given":"Yun‐Peng"},{"family":"Zheng","given":"Jingming"},{"family":"Zheng","given":"Ji"},{"family":"Ziemińska","given":"Kasia"},{"family":"Zirbel","given":"Chad R."},{"family":"Zizka","given":"Georg"},{"family":"Zo‐Bi","given":"Irié Casimir"},{"family":"Zotz","given":"Gerhard"},{"family":"Wirth","given":"Christian"}],"issued":{"date-parts":[["2020",1]]}}}],"schema":"https://github.com/citation-style-language/schema/raw/master/csl-citation.json"} </w:instrText>
       </w:r>
       <w:r>
         <w:rPr>
@@ -6432,160 +6330,7 @@
           <w:rFonts w:ascii="Times New Roman" w:hAnsi="Times New Roman" w:cs="Times New Roman"/>
           <w:sz w:val="24"/>
         </w:rPr>
-        <w:t>De Magalhães &amp; Costa 2009</w:t>
-      </w:r>
-      <w:r>
-        <w:rPr>
-          <w:rFonts w:ascii="Times New Roman" w:eastAsia="Times New Roman" w:hAnsi="Times New Roman" w:cs="Times New Roman"/>
-          <w:sz w:val="24"/>
-          <w:szCs w:val="24"/>
-        </w:rPr>
-        <w:fldChar w:fldCharType="end"/>
-      </w:r>
-      <w:r>
-        <w:rPr>
-          <w:rFonts w:ascii="Times New Roman" w:eastAsia="Times New Roman" w:hAnsi="Times New Roman" w:cs="Times New Roman"/>
-          <w:sz w:val="24"/>
-          <w:szCs w:val="24"/>
-        </w:rPr>
-        <w:t xml:space="preserve">, </w:t>
-      </w:r>
-      <w:proofErr w:type="spellStart"/>
-      <w:r>
-        <w:rPr>
-          <w:rFonts w:ascii="Times New Roman" w:eastAsia="Times New Roman" w:hAnsi="Times New Roman" w:cs="Times New Roman"/>
-          <w:sz w:val="24"/>
-          <w:szCs w:val="24"/>
-        </w:rPr>
-        <w:t>FishBase</w:t>
-      </w:r>
-      <w:proofErr w:type="spellEnd"/>
-      <w:r>
-        <w:rPr>
-          <w:rFonts w:ascii="Times New Roman" w:eastAsia="Times New Roman" w:hAnsi="Times New Roman" w:cs="Times New Roman"/>
-          <w:sz w:val="24"/>
-          <w:szCs w:val="24"/>
-        </w:rPr>
-        <w:t>-</w:t>
-      </w:r>
-      <w:r>
-        <w:rPr>
-          <w:rFonts w:ascii="Times New Roman" w:eastAsia="Times New Roman" w:hAnsi="Times New Roman" w:cs="Times New Roman"/>
-          <w:sz w:val="24"/>
-          <w:szCs w:val="24"/>
-        </w:rPr>
-        <w:fldChar w:fldCharType="begin"/>
-      </w:r>
-      <w:r>
-        <w:rPr>
-          <w:rFonts w:ascii="Times New Roman" w:eastAsia="Times New Roman" w:hAnsi="Times New Roman" w:cs="Times New Roman"/>
-          <w:sz w:val="24"/>
-          <w:szCs w:val="24"/>
-        </w:rPr>
-        <w:instrText xml:space="preserve"> ADDIN ZOTERO_ITEM CSL_CITATION {"citationID":"kVk4fCZD","properties":{"formattedCitation":"(Froese {\\i{}et al.} 1992)","plainCitation":"(Froese et al. 1992)","dontUpdate":true,"noteIndex":0},"citationItems":[{"id":4378,"uris":["http://zotero.org/users/9972654/items/LZAMYXRE"],"itemData":{"id":4378,"type":"article-journal","container-title":"ICLARM Software","page":"48","source":"Zotero","title":"Draft User's Manual of Fish Base A Biological Database on Fish (ver. 1.0)","volume":"7","author":[{"family":"Froese","given":"R"},{"family":"Palomares","given":"M L D"},{"family":"Pauly","given":"D"}],"issued":{"date-parts":[["1992",12]]}}}],"schema":"https://github.com/citation-style-language/schema/raw/master/csl-citation.json"} </w:instrText>
-      </w:r>
-      <w:r>
-        <w:rPr>
-          <w:rFonts w:ascii="Times New Roman" w:eastAsia="Times New Roman" w:hAnsi="Times New Roman" w:cs="Times New Roman"/>
-          <w:sz w:val="24"/>
-          <w:szCs w:val="24"/>
-        </w:rPr>
-        <w:fldChar w:fldCharType="separate"/>
-      </w:r>
-      <w:r>
-        <w:rPr>
-          <w:rFonts w:ascii="Times New Roman" w:hAnsi="Times New Roman" w:cs="Times New Roman"/>
-          <w:sz w:val="24"/>
-        </w:rPr>
-        <w:t xml:space="preserve">Froese </w:t>
-      </w:r>
-      <w:r>
-        <w:rPr>
-          <w:rFonts w:ascii="Times New Roman" w:hAnsi="Times New Roman" w:cs="Times New Roman"/>
-          <w:i/>
-          <w:iCs/>
-          <w:sz w:val="24"/>
-        </w:rPr>
-        <w:t>et al.</w:t>
-      </w:r>
-      <w:r>
-        <w:rPr>
-          <w:rFonts w:ascii="Times New Roman" w:hAnsi="Times New Roman" w:cs="Times New Roman"/>
-          <w:sz w:val="24"/>
-        </w:rPr>
-        <w:t xml:space="preserve"> 1992</w:t>
-      </w:r>
-      <w:r>
-        <w:rPr>
-          <w:rFonts w:ascii="Times New Roman" w:eastAsia="Times New Roman" w:hAnsi="Times New Roman" w:cs="Times New Roman"/>
-          <w:sz w:val="24"/>
-          <w:szCs w:val="24"/>
-        </w:rPr>
-        <w:fldChar w:fldCharType="end"/>
-      </w:r>
-      <w:r>
-        <w:rPr>
-          <w:rFonts w:ascii="Times New Roman" w:eastAsia="Times New Roman" w:hAnsi="Times New Roman" w:cs="Times New Roman"/>
-          <w:sz w:val="24"/>
-          <w:szCs w:val="24"/>
-        </w:rPr>
-        <w:t>,</w:t>
-      </w:r>
-      <w:r>
-        <w:rPr>
-          <w:rFonts w:ascii="Times New Roman" w:eastAsia="Times New Roman" w:hAnsi="Times New Roman" w:cs="Times New Roman"/>
-          <w:sz w:val="24"/>
-          <w:szCs w:val="24"/>
-        </w:rPr>
-        <w:t xml:space="preserve"> TRY-trait database</w:t>
-      </w:r>
-      <w:r>
-        <w:rPr>
-          <w:rFonts w:ascii="Times New Roman" w:eastAsia="Times New Roman" w:hAnsi="Times New Roman" w:cs="Times New Roman"/>
-          <w:sz w:val="24"/>
-          <w:szCs w:val="24"/>
-        </w:rPr>
-        <w:t>-</w:t>
-      </w:r>
-      <w:proofErr w:type="spellStart"/>
-      <w:r>
-        <w:rPr>
-          <w:rFonts w:ascii="Times New Roman" w:eastAsia="Times New Roman" w:hAnsi="Times New Roman" w:cs="Times New Roman"/>
-          <w:sz w:val="24"/>
-          <w:szCs w:val="24"/>
-        </w:rPr>
-        <w:fldChar w:fldCharType="begin"/>
-      </w:r>
-      <w:r>
-        <w:rPr>
-          <w:rFonts w:ascii="Times New Roman" w:eastAsia="Times New Roman" w:hAnsi="Times New Roman" w:cs="Times New Roman"/>
-          <w:sz w:val="24"/>
-          <w:szCs w:val="24"/>
-        </w:rPr>
-        <w:instrText xml:space="preserve"> ADDIN ZOTERO_ITEM CSL_CITATION {"citationID":"mvCuItQE","properties":{"formattedCitation":"(Kattge {\\i{}et al.} 2020)","plainCitation":"(Kattge et al. 2020)","dontUpdate":true,"noteIndex":0},"citationItems":[{"id":4381,"uris":["http://zotero.org/users/9972654/items/R5ILBKQ2"],"itemData":{"id":4381,"type":"article-journal","abstract":"Plant traits—the morphological, anatomical, physiological, biochemical and phenological characteristics of plants—determine how plants respond to environmental factors, affect other trophic levels, and influence ecosystem properties and their benefits and detriments to people. Plant trait data thus represent the basis for a vast area of research spanning from evolutionary biology, community and functional ecology, to biodiversity conservation, ecosystem and landscape management, restoration, biogeography and earth system modelling. Since its foundation in 2007, the TRY database of plant traits has grown continuously. It now provides unprecedented data coverage under an open access data policy and is the main plant trait database used by the research community worldwide. Increasingly, the TRY database also supports new frontiers of trait-based plant research, including the identification of data gaps and the subsequent mobilization or measurement of new data. To support this development, in this article we evaluate the extent of the trait data compiled in TRY and analyse emerging patterns of data coverage and representativeness. Best species coverage is achieved for categorical traits—almost complete coverage for ‘plant growth form’. However, most traits relevant for ecology and vegetation modelling are characterized by continuous intraspecific variation and trait–environmental relationships. These traits have to be measured on individual plants in their respective environment. Despite unprecedented data coverage, we observe a humbling lack of completeness and representativeness of these continuous traits in many aspects. We, therefore, conclude that reducing data gaps and biases in the TRY database remains a key challenge and requires a coordinated approach to data mobilization and trait measurements. This can only be achieved in collaboration with other initiatives.","container-title":"Global Change Biology","DOI":"10.1111/gcb.14904","ISSN":"1354-1013, 1365-2486","issue":"1","journalAbbreviation":"Global Change Biology","language":"en","page":"119-188","source":"DOI.org (Crossref)","title":"TRY plant trait database – enhanced coverage and open access","volume":"26","author":[{"family":"Kattge","given":"Jens"},{"family":"Bönisch","given":"Gerhard"},{"family":"Díaz","given":"Sandra"},{"family":"Lavorel","given":"Sandra"},{"family":"Prentice","given":"Iain Colin"},{"family":"Leadley","given":"Paul"},{"family":"Tautenhahn","given":"Susanne"},{"family":"Werner","given":"Gijsbert D. A."},{"family":"Aakala","given":"Tuomas"},{"family":"Abedi","given":"Mehdi"},{"family":"Acosta","given":"Alicia T. R."},{"family":"Adamidis","given":"George C."},{"family":"Adamson","given":"Kairi"},{"family":"Aiba","given":"Masahiro"},{"family":"Albert","given":"Cécile H."},{"family":"Alcántara","given":"Julio M."},{"family":"Alcázar C","given":"Carolina"},{"family":"Aleixo","given":"Izabela"},{"family":"Ali","given":"Hamada"},{"family":"Amiaud","given":"Bernard"},{"family":"Ammer","given":"Christian"},{"family":"Amoroso","given":"Mariano M."},{"family":"Anand","given":"Madhur"},{"family":"Anderson","given":"Carolyn"},{"family":"Anten","given":"Niels"},{"family":"Antos","given":"Joseph"},{"family":"Apgaua","given":"Deborah Mattos Guimarães"},{"family":"Ashman","given":"Tia‐Lynn"},{"family":"Asmara","given":"Degi Harja"},{"family":"Asner","given":"Gregory P."},{"family":"Aspinwall","given":"Michael"},{"family":"Atkin","given":"Owen"},{"family":"Aubin","given":"Isabelle"},{"family":"Baastrup‐Spohr","given":"Lars"},{"family":"Bahalkeh","given":"Khadijeh"},{"family":"Bahn","given":"Michael"},{"family":"Baker","given":"Timothy"},{"family":"Baker","given":"William J."},{"family":"Bakker","given":"Jan P."},{"family":"Baldocchi","given":"Dennis"},{"family":"Baltzer","given":"Jennifer"},{"family":"Banerjee","given":"Arindam"},{"family":"Baranger","given":"Anne"},{"family":"Barlow","given":"Jos"},{"family":"Barneche","given":"Diego R."},{"family":"Baruch","given":"Zdravko"},{"family":"Bastianelli","given":"Denis"},{"family":"Battles","given":"John"},{"family":"Bauerle","given":"William"},{"family":"Bauters","given":"Marijn"},{"family":"Bazzato","given":"Erika"},{"family":"Beckmann","given":"Michael"},{"family":"Beeckman","given":"Hans"},{"family":"Beierkuhnlein","given":"Carl"},{"family":"Bekker","given":"Renee"},{"family":"Belfry","given":"Gavin"},{"family":"Belluau","given":"Michael"},{"family":"Beloiu","given":"Mirela"},{"family":"Benavides","given":"Raquel"},{"family":"Benomar","given":"Lahcen"},{"family":"Berdugo‐Lattke","given":"Mary Lee"},{"family":"Berenguer","given":"Erika"},{"family":"Bergamin","given":"Rodrigo"},{"family":"Bergmann","given":"Joana"},{"family":"Bergmann Carlucci","given":"Marcos"},{"family":"Berner","given":"Logan"},{"family":"Bernhardt‐Römermann","given":"Markus"},{"family":"Bigler","given":"Christof"},{"family":"Bjorkman","given":"Anne D."},{"family":"Blackman","given":"Chris"},{"family":"Blanco","given":"Carolina"},{"family":"Blonder","given":"Benjamin"},{"family":"Blumenthal","given":"Dana"},{"family":"Bocanegra‐González","given":"Kelly T."},{"family":"Boeckx","given":"Pascal"},{"family":"Bohlman","given":"Stephanie"},{"family":"Böhning‐Gaese","given":"Katrin"},{"family":"Boisvert‐Marsh","given":"Laura"},{"family":"Bond","given":"William"},{"family":"Bond‐Lamberty","given":"Ben"},{"family":"Boom","given":"Arnoud"},{"family":"Boonman","given":"Coline C. F."},{"family":"Bordin","given":"Kauane"},{"family":"Boughton","given":"Elizabeth H."},{"family":"Boukili","given":"Vanessa"},{"family":"Bowman","given":"David M. J. S."},{"family":"Bravo","given":"Sandra"},{"family":"Brendel","given":"Marco Richard"},{"family":"Broadley","given":"Martin R."},{"family":"Brown","given":"Kerry A."},{"family":"Bruelheide","given":"Helge"},{"family":"Brumnich","given":"Federico"},{"family":"Bruun","given":"Hans Henrik"},{"family":"Bruy","given":"David"},{"family":"Buchanan","given":"Serra W."},{"family":"Bucher","given":"Solveig Franziska"},{"family":"Buchmann","given":"Nina"},{"family":"Buitenwerf","given":"Robert"},{"family":"Bunker","given":"Daniel E."},{"family":"Bürger","given":"Jana"},{"family":"Burrascano","given":"Sabina"},{"family":"Burslem","given":"David F. R. P."},{"family":"Butterfield","given":"Bradley J."},{"family":"Byun","given":"Chaeho"},{"family":"Marques","given":"Marcia"},{"family":"Scalon","given":"Marina C."},{"family":"Caccianiga","given":"Marco"},{"family":"Cadotte","given":"Marc"},{"family":"Cailleret","given":"Maxime"},{"family":"Camac","given":"James"},{"family":"Camarero","given":"Jesús Julio"},{"family":"Campany","given":"Courtney"},{"family":"Campetella","given":"Giandiego"},{"family":"Campos","given":"Juan Antonio"},{"family":"Cano‐Arboleda","given":"Laura"},{"family":"Canullo","given":"Roberto"},{"family":"Carbognani","given":"Michele"},{"family":"Carvalho","given":"Fabio"},{"family":"Casanoves","given":"Fernando"},{"family":"Castagneyrol","given":"Bastien"},{"family":"Catford","given":"Jane A."},{"family":"Cavender‐Bares","given":"Jeannine"},{"family":"Cerabolini","given":"Bruno E. L."},{"family":"Cervellini","given":"Marco"},{"family":"Chacón‐Madrigal","given":"Eduardo"},{"family":"Chapin","given":"Kenneth"},{"family":"Chapin","given":"F. Stuart"},{"family":"Chelli","given":"Stefano"},{"family":"Chen","given":"Si‐Chong"},{"family":"Chen","given":"Anping"},{"family":"Cherubini","given":"Paolo"},{"family":"Chianucci","given":"Francesco"},{"family":"Choat","given":"Brendan"},{"family":"Chung","given":"Kyong‐Sook"},{"family":"Chytrý","given":"Milan"},{"family":"Ciccarelli","given":"Daniela"},{"family":"Coll","given":"Lluís"},{"family":"Collins","given":"Courtney G."},{"family":"Conti","given":"Luisa"},{"family":"Coomes","given":"David"},{"family":"Cornelissen","given":"Johannes H. C."},{"family":"Cornwell","given":"William K."},{"family":"Corona","given":"Piermaria"},{"family":"Coyea","given":"Marie"},{"family":"Craine","given":"Joseph"},{"family":"Craven","given":"Dylan"},{"family":"Cromsigt","given":"Joris P. G. M."},{"family":"Csecserits","given":"Anikó"},{"family":"Cufar","given":"Katarina"},{"family":"Cuntz","given":"Matthias"},{"family":"Da Silva","given":"Ana Carolina"},{"family":"Dahlin","given":"Kyla M."},{"family":"Dainese","given":"Matteo"},{"family":"Dalke","given":"Igor"},{"family":"Dalle Fratte","given":"Michele"},{"family":"Dang‐Le","given":"Anh Tuan"},{"family":"Danihelka","given":"Jirí"},{"family":"Dannoura","given":"Masako"},{"family":"Dawson","given":"Samantha"},{"family":"De Beer","given":"Arend Jacobus"},{"family":"De Frutos","given":"Angel"},{"family":"De Long","given":"Jonathan R."},{"family":"Dechant","given":"Benjamin"},{"family":"Delagrange","given":"Sylvain"},{"family":"Delpierre","given":"Nicolas"},{"family":"Derroire","given":"Géraldine"},{"family":"Dias","given":"Arildo S."},{"family":"Diaz‐Toribio","given":"Milton Hugo"},{"family":"Dimitrakopoulos","given":"Panayiotis G."},{"family":"Dobrowolski","given":"Mark"},{"family":"Doktor","given":"Daniel"},{"family":"Dřevojan","given":"Pavel"},{"family":"Dong","given":"Ning"},{"family":"Dransfield","given":"John"},{"family":"Dressler","given":"Stefan"},{"family":"Duarte","given":"Leandro"},{"family":"Ducouret","given":"Emilie"},{"family":"Dullinger","given":"Stefan"},{"family":"Durka","given":"Walter"},{"family":"Duursma","given":"Remko"},{"family":"Dymova","given":"Olga"},{"family":"E‐Vojtkó","given":"Anna"},{"family":"Eckstein","given":"Rolf Lutz"},{"family":"Ejtehadi","given":"Hamid"},{"family":"Elser","given":"James"},{"family":"Emilio","given":"Thaise"},{"family":"Engemann","given":"Kristine"},{"family":"Erfanian","given":"Mohammad Bagher"},{"family":"Erfmeier","given":"Alexandra"},{"family":"Esquivel‐Muelbert","given":"Adriane"},{"family":"Esser","given":"Gerd"},{"family":"Estiarte","given":"Marc"},{"family":"Domingues","given":"Tomas F."},{"family":"Fagan","given":"William F."},{"family":"Fagúndez","given":"Jaime"},{"family":"Falster","given":"Daniel S."},{"family":"Fan","given":"Ying"},{"family":"Fang","given":"Jingyun"},{"family":"Farris","given":"Emmanuele"},{"family":"Fazlioglu","given":"Fatih"},{"family":"Feng","given":"Yanhao"},{"family":"Fernandez‐Mendez","given":"Fernando"},{"family":"Ferrara","given":"Carlotta"},{"family":"Ferreira","given":"Joice"},{"family":"Fidelis","given":"Alessandra"},{"family":"Finegan","given":"Bryan"},{"family":"Firn","given":"Jennifer"},{"family":"Flowers","given":"Timothy J."},{"family":"Flynn","given":"Dan F. B."},{"family":"Fontana","given":"Veronika"},{"family":"Forey","given":"Estelle"},{"family":"Forgiarini","given":"Cristiane"},{"family":"François","given":"Louis"},{"family":"Frangipani","given":"Marcelo"},{"family":"Frank","given":"Dorothea"},{"family":"Frenette‐Dussault","given":"Cedric"},{"family":"Freschet","given":"Grégoire T."},{"family":"Fry","given":"Ellen L."},{"family":"Fyllas","given":"Nikolaos M."},{"family":"Mazzochini","given":"Guilherme G."},{"family":"Gachet","given":"Sophie"},{"family":"Gallagher","given":"Rachael"},{"family":"Ganade","given":"Gislene"},{"family":"Ganga","given":"Francesca"},{"family":"García‐Palacios","given":"Pablo"},{"family":"Gargaglione","given":"Verónica"},{"family":"Garnier","given":"Eric"},{"family":"Garrido","given":"Jose Luis"},{"family":"De Gasper","given":"André Luís"},{"family":"Gea‐Izquierdo","given":"Guillermo"},{"family":"Gibson","given":"David"},{"family":"Gillison","given":"Andrew N."},{"family":"Giroldo","given":"Aelton"},{"family":"Glasenhardt","given":"Mary‐Claire"},{"family":"Gleason","given":"Sean"},{"family":"Gliesch","given":"Mariana"},{"family":"Goldberg","given":"Emma"},{"family":"Göldel","given":"Bastian"},{"family":"Gonzalez‐Akre","given":"Erika"},{"family":"Gonzalez‐Andujar","given":"Jose L."},{"family":"González‐Melo","given":"Andrés"},{"family":"González‐Robles","given":"Ana"},{"family":"Graae","given":"Bente Jessen"},{"family":"Granda","given":"Elena"},{"family":"Graves","given":"Sarah"},{"family":"Green","given":"Walton A."},{"family":"Gregor","given":"Thomas"},{"family":"Gross","given":"Nicolas"},{"family":"Guerin","given":"Greg R."},{"family":"Günther","given":"Angela"},{"family":"Gutiérrez","given":"Alvaro G."},{"family":"Haddock","given":"Lillie"},{"family":"Haines","given":"Anna"},{"family":"Hall","given":"Jefferson"},{"family":"Hambuckers","given":"Alain"},{"family":"Han","given":"Wenxuan"},{"family":"Harrison","given":"Sandy P."},{"family":"Hattingh","given":"Wesley"},{"family":"Hawes","given":"Joseph E."},{"family":"He","given":"Tianhua"},{"family":"He","given":"Pengcheng"},{"family":"Heberling","given":"Jacob Mason"},{"family":"Helm","given":"Aveliina"},{"family":"Hempel","given":"Stefan"},{"family":"Hentschel","given":"Jörn"},{"family":"Hérault","given":"Bruno"},{"family":"Hereş","given":"Ana‐Maria"},{"family":"Herz","given":"Katharina"},{"family":"Heuertz","given":"Myriam"},{"family":"Hickler","given":"Thomas"},{"family":"Hietz","given":"Peter"},{"family":"Higuchi","given":"Pedro"},{"family":"Hipp","given":"Andrew L."},{"family":"Hirons","given":"Andrew"},{"family":"Hock","given":"Maria"},{"family":"Hogan","given":"James Aaron"},{"family":"Holl","given":"Karen"},{"family":"Honnay","given":"Olivier"},{"family":"Hornstein","given":"Daniel"},{"family":"Hou","given":"Enqing"},{"family":"Hough‐Snee","given":"Nate"},{"family":"Hovstad","given":"Knut Anders"},{"family":"Ichie","given":"Tomoaki"},{"family":"Igić","given":"Boris"},{"family":"Illa","given":"Estela"},{"family":"Isaac","given":"Marney"},{"family":"Ishihara","given":"Masae"},{"family":"Ivanov","given":"Leonid"},{"family":"Ivanova","given":"Larissa"},{"family":"Iversen","given":"Colleen M."},{"family":"Izquierdo","given":"Jordi"},{"family":"Jackson","given":"Robert B."},{"family":"Jackson","given":"Benjamin"},{"family":"Jactel","given":"Hervé"},{"family":"Jagodzinski","given":"Andrzej M."},{"family":"Jandt","given":"Ute"},{"family":"Jansen","given":"Steven"},{"family":"Jenkins","given":"Thomas"},{"family":"Jentsch","given":"Anke"},{"family":"Jespersen","given":"Jens Rasmus Plantener"},{"family":"Jiang","given":"Guo‐Feng"},{"family":"Johansen","given":"Jesper Liengaard"},{"family":"Johnson","given":"David"},{"family":"Jokela","given":"Eric J."},{"family":"Joly","given":"Carlos Alfredo"},{"family":"Jordan","given":"Gregory J."},{"family":"Joseph","given":"Grant Stuart"},{"family":"Junaedi","given":"Decky"},{"family":"Junker","given":"Robert R."},{"family":"Justes","given":"Eric"},{"family":"Kabzems","given":"Richard"},{"family":"Kane","given":"Jeffrey"},{"family":"Kaplan","given":"Zdenek"},{"family":"Kattenborn","given":"Teja"},{"family":"Kavelenova","given":"Lyudmila"},{"family":"Kearsley","given":"Elizabeth"},{"family":"Kempel","given":"Anne"},{"family":"Kenzo","given":"Tanaka"},{"family":"Kerkhoff","given":"Andrew"},{"family":"Khalil","given":"Mohammed I."},{"family":"Kinlock","given":"Nicole L."},{"family":"Kissling","given":"Wilm Daniel"},{"family":"Kitajima","given":"Kaoru"},{"family":"Kitzberger","given":"Thomas"},{"family":"Kjøller","given":"Rasmus"},{"family":"Klein","given":"Tamir"},{"family":"Kleyer","given":"Michael"},{"family":"Klimešová","given":"Jitka"},{"family":"Klipel","given":"Joice"},{"family":"Kloeppel","given":"Brian"},{"family":"Klotz","given":"Stefan"},{"family":"Knops","given":"Johannes M. H."},{"family":"Kohyama","given":"Takashi"},{"family":"Koike","given":"Fumito"},{"family":"Kollmann","given":"Johannes"},{"family":"Komac","given":"Benjamin"},{"family":"Komatsu","given":"Kimberly"},{"family":"König","given":"Christian"},{"family":"Kraft","given":"Nathan J. B."},{"family":"Kramer","given":"Koen"},{"family":"Kreft","given":"Holger"},{"family":"Kühn","given":"Ingolf"},{"family":"Kumarathunge","given":"Dushan"},{"family":"Kuppler","given":"Jonas"},{"family":"Kurokawa","given":"Hiroko"},{"family":"Kurosawa","given":"Yoko"},{"family":"Kuyah","given":"Shem"},{"family":"Laclau","given":"Jean‐Paul"},{"family":"Lafleur","given":"Benoit"},{"family":"Lallai","given":"Erik"},{"family":"Lamb","given":"Eric"},{"family":"Lamprecht","given":"Andrea"},{"family":"Larkin","given":"Daniel J."},{"family":"Laughlin","given":"Daniel"},{"family":"Le Bagousse‐Pinguet","given":"Yoann"},{"family":"Le Maire","given":"Guerric"},{"family":"Le Roux","given":"Peter C."},{"family":"Le Roux","given":"Elizabeth"},{"family":"Lee","given":"Tali"},{"family":"Lens","given":"Frederic"},{"family":"Lewis","given":"Simon L."},{"family":"Lhotsky","given":"Barbara"},{"family":"Li","given":"Yuanzhi"},{"family":"Li","given":"Xine"},{"family":"Lichstein","given":"Jeremy W."},{"family":"Liebergesell","given":"Mario"},{"family":"Lim","given":"Jun Ying"},{"family":"Lin","given":"Yan‐Shih"},{"family":"Linares","given":"Juan Carlos"},{"family":"Liu","given":"Chunjiang"},{"family":"Liu","given":"Daijun"},{"family":"Liu","given":"Udayangani"},{"family":"Livingstone","given":"Stuart"},{"family":"Llusià","given":"Joan"},{"family":"Lohbeck","given":"Madelon"},{"family":"López‐García","given":"Álvaro"},{"family":"Lopez‐Gonzalez","given":"Gabriela"},{"family":"Lososová","given":"Zdeňka"},{"family":"Louault","given":"Frédérique"},{"family":"Lukács","given":"Balázs A."},{"family":"Lukeš","given":"Petr"},{"family":"Luo","given":"Yunjian"},{"family":"Lussu","given":"Michele"},{"family":"Ma","given":"Siyan"},{"family":"Maciel Rabelo Pereira","given":"Camilla"},{"family":"Mack","given":"Michelle"},{"family":"Maire","given":"Vincent"},{"family":"Mäkelä","given":"Annikki"},{"family":"Mäkinen","given":"Harri"},{"family":"Malhado","given":"Ana Claudia Mendes"},{"family":"Mallik","given":"Azim"},{"family":"Manning","given":"Peter"},{"family":"Manzoni","given":"Stefano"},{"family":"Marchetti","given":"Zuleica"},{"family":"Marchino","given":"Luca"},{"family":"Marcilio‐Silva","given":"Vinicius"},{"family":"Marcon","given":"Eric"},{"family":"Marignani","given":"Michela"},{"family":"Markesteijn","given":"Lars"},{"family":"Martin","given":"Adam"},{"family":"Martínez‐Garza","given":"Cristina"},{"family":"Martínez‐Vilalta","given":"Jordi"},{"family":"Mašková","given":"Tereza"},{"family":"Mason","given":"Kelly"},{"family":"Mason","given":"Norman"},{"family":"Massad","given":"Tara Joy"},{"family":"Masse","given":"Jacynthe"},{"family":"Mayrose","given":"Itay"},{"family":"McCarthy","given":"James"},{"family":"McCormack","given":"M. Luke"},{"family":"McCulloh","given":"Katherine"},{"family":"McFadden","given":"Ian R."},{"family":"McGill","given":"Brian J."},{"family":"McPartland","given":"Mara Y."},{"family":"Medeiros","given":"Juliana S."},{"family":"Medlyn","given":"Belinda"},{"family":"Meerts","given":"Pierre"},{"family":"Mehrabi","given":"Zia"},{"family":"Meir","given":"Patrick"},{"family":"Melo","given":"Felipe P. L."},{"family":"Mencuccini","given":"Maurizio"},{"family":"Meredieu","given":"Céline"},{"family":"Messier","given":"Julie"},{"family":"Mészáros","given":"Ilona"},{"family":"Metsaranta","given":"Juha"},{"family":"Michaletz","given":"Sean T."},{"family":"Michelaki","given":"Chrysanthi"},{"family":"Migalina","given":"Svetlana"},{"family":"Milla","given":"Ruben"},{"family":"Miller","given":"Jesse E. D."},{"family":"Minden","given":"Vanessa"},{"family":"Ming","given":"Ray"},{"family":"Mokany","given":"Karel"},{"family":"Moles","given":"Angela T."},{"family":"Molnár","given":"Attila"},{"family":"Molofsky","given":"Jane"},{"family":"Molz","given":"Martin"},{"family":"Montgomery","given":"Rebecca A."},{"family":"Monty","given":"Arnaud"},{"family":"Moravcová","given":"Lenka"},{"family":"Moreno‐Martínez","given":"Alvaro"},{"family":"Moretti","given":"Marco"},{"family":"Mori","given":"Akira S."},{"family":"Mori","given":"Shigeta"},{"family":"Morris","given":"Dave"},{"family":"Morrison","given":"Jane"},{"family":"Mucina","given":"Ladislav"},{"family":"Mueller","given":"Sandra"},{"family":"Muir","given":"Christopher D."},{"family":"Müller","given":"Sandra Cristina"},{"family":"Munoz","given":"François"},{"family":"Myers‐Smith","given":"Isla H."},{"family":"Myster","given":"Randall W."},{"family":"Nagano","given":"Masahiro"},{"family":"Naidu","given":"Shawna"},{"family":"Narayanan","given":"Ayyappan"},{"family":"Natesan","given":"Balachandran"},{"family":"Negoita","given":"Luka"},{"family":"Nelson","given":"Andrew S."},{"family":"Neuschulz","given":"Eike Lena"},{"family":"Ni","given":"Jian"},{"family":"Niedrist","given":"Georg"},{"family":"Nieto","given":"Jhon"},{"family":"Niinemets","given":"Ülo"},{"family":"Nolan","given":"Rachael"},{"family":"Nottebrock","given":"Henning"},{"family":"Nouvellon","given":"Yann"},{"family":"Novakovskiy","given":"Alexander"},{"literal":"The Nutrient Network"},{"family":"Nystuen","given":"Kristin Odden"},{"family":"O'Grady","given":"Anthony"},{"family":"O'Hara","given":"Kevin"},{"family":"O'Reilly‐Nugent","given":"Andrew"},{"family":"Oakley","given":"Simon"},{"family":"Oberhuber","given":"Walter"},{"family":"Ohtsuka","given":"Toshiyuki"},{"family":"Oliveira","given":"Ricardo"},{"family":"Öllerer","given":"Kinga"},{"family":"Olson","given":"Mark E."},{"family":"Onipchenko","given":"Vladimir"},{"family":"Onoda","given":"Yusuke"},{"family":"Onstein","given":"Renske E."},{"family":"Ordonez","given":"Jenny C."},{"family":"Osada","given":"Noriyuki"},{"family":"Ostonen","given":"Ivika"},{"family":"Ottaviani","given":"Gianluigi"},{"family":"Otto","given":"Sarah"},{"family":"Overbeck","given":"Gerhard E."},{"family":"Ozinga","given":"Wim A."},{"family":"Pahl","given":"Anna T."},{"family":"Paine","given":"C. E. Timothy"},{"family":"Pakeman","given":"Robin J."},{"family":"Papageorgiou","given":"Aristotelis C."},{"family":"Parfionova","given":"Evgeniya"},{"family":"Pärtel","given":"Meelis"},{"family":"Patacca","given":"Marco"},{"family":"Paula","given":"Susana"},{"family":"Paule","given":"Juraj"},{"family":"Pauli","given":"Harald"},{"family":"Pausas","given":"Juli G."},{"family":"Peco","given":"Begoña"},{"family":"Penuelas","given":"Josep"},{"family":"Perea","given":"Antonio"},{"family":"Peri","given":"Pablo Luis"},{"family":"Petisco‐Souza","given":"Ana Carolina"},{"family":"Petraglia","given":"Alessandro"},{"family":"Petritan","given":"Any Mary"},{"family":"Phillips","given":"Oliver L."},{"family":"Pierce","given":"Simon"},{"family":"Pillar","given":"Valério D."},{"family":"Pisek","given":"Jan"},{"family":"Pomogaybin","given":"Alexandr"},{"family":"Poorter","given":"Hendrik"},{"family":"Portsmuth","given":"Angelika"},{"family":"Poschlod","given":"Peter"},{"family":"Potvin","given":"Catherine"},{"family":"Pounds","given":"Devon"},{"family":"Powell","given":"A. Shafer"},{"family":"Power","given":"Sally A."},{"family":"Prinzing","given":"Andreas"},{"family":"Puglielli","given":"Giacomo"},{"family":"Pyšek","given":"Petr"},{"family":"Raevel","given":"Valerie"},{"family":"Rammig","given":"Anja"},{"family":"Ransijn","given":"Johannes"},{"family":"Ray","given":"Courtenay A."},{"family":"Reich","given":"Peter B."},{"family":"Reichstein","given":"Markus"},{"family":"Reid","given":"Douglas E. B."},{"family":"Réjou‐Méchain","given":"Maxime"},{"family":"De Dios","given":"Victor Resco"},{"family":"Ribeiro","given":"Sabina"},{"family":"Richardson","given":"Sarah"},{"family":"Riibak","given":"Kersti"},{"family":"Rillig","given":"Matthias C."},{"family":"Riviera","given":"Fiamma"},{"family":"Robert","given":"Elisabeth M. R."},{"family":"Roberts","given":"Scott"},{"family":"Robroek","given":"Bjorn"},{"family":"Roddy","given":"Adam"},{"family":"Rodrigues","given":"Arthur Vinicius"},{"family":"Rogers","given":"Alistair"},{"family":"Rollinson","given":"Emily"},{"family":"Rolo","given":"Victor"},{"family":"Römermann","given":"Christine"},{"family":"Ronzhina","given":"Dina"},{"family":"Roscher","given":"Christiane"},{"family":"Rosell","given":"Julieta A."},{"family":"Rosenfield","given":"Milena Fermina"},{"family":"Rossi","given":"Christian"},{"family":"Roy","given":"David B."},{"family":"Royer‐Tardif","given":"Samuel"},{"family":"Rüger","given":"Nadja"},{"family":"Ruiz‐Peinado","given":"Ricardo"},{"family":"Rumpf","given":"Sabine B."},{"family":"Rusch","given":"Graciela M."},{"family":"Ryo","given":"Masahiro"},{"family":"Sack","given":"Lawren"},{"family":"Saldaña","given":"Angela"},{"family":"Salgado‐Negret","given":"Beatriz"},{"family":"Salguero‐Gomez","given":"Roberto"},{"family":"Santa‐Regina","given":"Ignacio"},{"family":"Santacruz‐García","given":"Ana Carolina"},{"family":"Santos","given":"Joaquim"},{"family":"Sardans","given":"Jordi"},{"family":"Schamp","given":"Brandon"},{"family":"Scherer‐Lorenzen","given":"Michael"},{"family":"Schleuning","given":"Matthias"},{"family":"Schmid","given":"Bernhard"},{"family":"Schmidt","given":"Marco"},{"family":"Schmitt","given":"Sylvain"},{"family":"Schneider","given":"Julio V."},{"family":"Schowanek","given":"Simon D."},{"family":"Schrader","given":"Julian"},{"family":"Schrodt","given":"Franziska"},{"family":"Schuldt","given":"Bernhard"},{"family":"Schurr","given":"Frank"},{"family":"Selaya Garvizu","given":"Galia"},{"family":"Semchenko","given":"Marina"},{"family":"Seymour","given":"Colleen"},{"family":"Sfair","given":"Julia C."},{"family":"Sharpe","given":"Joanne M."},{"family":"Sheppard","given":"Christine S."},{"family":"Sheremetiev","given":"Serge"},{"family":"Shiodera","given":"Satomi"},{"family":"Shipley","given":"Bill"},{"family":"Shovon","given":"Tanvir Ahmed"},{"family":"Siebenkäs","given":"Alrun"},{"family":"Sierra","given":"Carlos"},{"family":"Silva","given":"Vasco"},{"family":"Silva","given":"Mateus"},{"family":"Sitzia","given":"Tommaso"},{"family":"Sjöman","given":"Henrik"},{"family":"Slot","given":"Martijn"},{"family":"Smith","given":"Nicholas G."},{"family":"Sodhi","given":"Darwin"},{"family":"Soltis","given":"Pamela"},{"family":"Soltis","given":"Douglas"},{"family":"Somers","given":"Ben"},{"family":"Sonnier","given":"Grégory"},{"family":"Sørensen","given":"Mia Vedel"},{"family":"Sosinski","given":"Enio Egon"},{"family":"Soudzilovskaia","given":"Nadejda A."},{"family":"Souza","given":"Alexandre F."},{"family":"Spasojevic","given":"Marko"},{"family":"Sperandii","given":"Marta Gaia"},{"family":"Stan","given":"Amanda B."},{"family":"Stegen","given":"James"},{"family":"Steinbauer","given":"Klaus"},{"family":"Stephan","given":"Jörg G."},{"family":"Sterck","given":"Frank"},{"family":"Stojanovic","given":"Dejan B."},{"family":"Strydom","given":"Tanya"},{"family":"Suarez","given":"Maria Laura"},{"family":"Svenning","given":"Jens‐Christian"},{"family":"Svitková","given":"Ivana"},{"family":"Svitok","given":"Marek"},{"family":"Svoboda","given":"Miroslav"},{"family":"Swaine","given":"Emily"},{"family":"Swenson","given":"Nathan"},{"family":"Tabarelli","given":"Marcelo"},{"family":"Takagi","given":"Kentaro"},{"family":"Tappeiner","given":"Ulrike"},{"family":"Tarifa","given":"Rubén"},{"family":"Tauugourdeau","given":"Simon"},{"family":"Tavsanoglu","given":"Cagatay"},{"family":"Te Beest","given":"Mariska"},{"family":"Tedersoo","given":"Leho"},{"family":"Thiffault","given":"Nelson"},{"family":"Thom","given":"Dominik"},{"family":"Thomas","given":"Evert"},{"family":"Thompson","given":"Ken"},{"family":"Thornton","given":"Peter E."},{"family":"Thuiller","given":"Wilfried"},{"family":"Tichý","given":"Lubomír"},{"family":"Tissue","given":"David"},{"family":"Tjoelker","given":"Mark G."},{"family":"Tng","given":"David Yue Phin"},{"family":"Tobias","given":"Joseph"},{"family":"Török","given":"Péter"},{"family":"Tarin","given":"Tonantzin"},{"family":"Torres‐Ruiz","given":"José M."},{"family":"Tóthmérész","given":"Béla"},{"family":"Treurnicht","given":"Martina"},{"family":"Trivellone","given":"Valeria"},{"family":"Trolliet","given":"Franck"},{"family":"Trotsiuk","given":"Volodymyr"},{"family":"Tsakalos","given":"James L."},{"family":"Tsiripidis","given":"Ioannis"},{"family":"Tysklind","given":"Niklas"},{"family":"Umehara","given":"Toru"},{"family":"Usoltsev","given":"Vladimir"},{"family":"Vadeboncoeur","given":"Matthew"},{"family":"Vaezi","given":"Jamil"},{"family":"Valladares","given":"Fernando"},{"family":"Vamosi","given":"Jana"},{"family":"Van Bodegom","given":"Peter M."},{"family":"Van Breugel","given":"Michiel"},{"family":"Van Cleemput","given":"Elisa"},{"family":"Van De Weg","given":"Martine"},{"family":"Van Der Merwe","given":"Stephni"},{"family":"Van Der Plas","given":"Fons"},{"family":"Van Der Sande","given":"Masha T."},{"family":"Van Kleunen","given":"Mark"},{"family":"Van Meerbeek","given":"Koenraad"},{"family":"Vanderwel","given":"Mark"},{"family":"Vanselow","given":"Kim André"},{"family":"Vårhammar","given":"Angelica"},{"family":"Varone","given":"Laura"},{"family":"Vasquez Valderrama","given":"Maribel Yesenia"},{"family":"Vassilev","given":"Kiril"},{"family":"Vellend","given":"Mark"},{"family":"Veneklaas","given":"Erik J."},{"family":"Verbeeck","given":"Hans"},{"family":"Verheyen","given":"Kris"},{"family":"Vibrans","given":"Alexander"},{"family":"Vieira","given":"Ima"},{"family":"Villacís","given":"Jaime"},{"family":"Violle","given":"Cyrille"},{"family":"Vivek","given":"Pandi"},{"family":"Wagner","given":"Katrin"},{"family":"Waldram","given":"Matthew"},{"family":"Waldron","given":"Anthony"},{"family":"Walker","given":"Anthony P."},{"family":"Waller","given":"Martyn"},{"family":"Walther","given":"Gabriel"},{"family":"Wang","given":"Han"},{"family":"Wang","given":"Feng"},{"family":"Wang","given":"Weiqi"},{"family":"Watkins","given":"Harry"},{"family":"Watkins","given":"James"},{"family":"Weber","given":"Ulrich"},{"family":"Weedon","given":"James T."},{"family":"Wei","given":"Liping"},{"family":"Weigelt","given":"Patrick"},{"family":"Weiher","given":"Evan"},{"family":"Wells","given":"Aidan W."},{"family":"Wellstein","given":"Camilla"},{"family":"Wenk","given":"Elizabeth"},{"family":"Westoby","given":"Mark"},{"family":"Westwood","given":"Alana"},{"family":"White","given":"Philip John"},{"family":"Whitten","given":"Mark"},{"family":"Williams","given":"Mathew"},{"family":"Winkler","given":"Daniel E."},{"family":"Winter","given":"Klaus"},{"family":"Womack","given":"Chevonne"},{"family":"Wright","given":"Ian J."},{"family":"Wright","given":"S. Joseph"},{"family":"Wright","given":"Justin"},{"family":"Pinho","given":"Bruno X."},{"family":"Ximenes","given":"Fabiano"},{"family":"Yamada","given":"Toshihiro"},{"family":"Yamaji","given":"Keiko"},{"family":"Yanai","given":"Ruth"},{"family":"Yankov","given":"Nikolay"},{"family":"Yguel","given":"Benjamin"},{"family":"Zanini","given":"Kátia Janaina"},{"family":"Zanne","given":"Amy E."},{"family":"Zelený","given":"David"},{"family":"Zhao","given":"Yun‐Peng"},{"family":"Zheng","given":"Jingming"},{"family":"Zheng","given":"Ji"},{"family":"Ziemińska","given":"Kasia"},{"family":"Zirbel","given":"Chad R."},{"family":"Zizka","given":"Georg"},{"family":"Zo‐Bi","given":"Irié Casimir"},{"family":"Zotz","given":"Gerhard"},{"family":"Wirth","given":"Christian"}],"issued":{"date-parts":[["2020",1]]}}}],"schema":"https://github.com/citation-style-language/schema/raw/master/csl-citation.json"} </w:instrText>
-      </w:r>
-      <w:r>
-        <w:rPr>
-          <w:rFonts w:ascii="Times New Roman" w:eastAsia="Times New Roman" w:hAnsi="Times New Roman" w:cs="Times New Roman"/>
-          <w:sz w:val="24"/>
-          <w:szCs w:val="24"/>
-        </w:rPr>
-        <w:fldChar w:fldCharType="separate"/>
-      </w:r>
-      <w:r>
-        <w:rPr>
-          <w:rFonts w:ascii="Times New Roman" w:hAnsi="Times New Roman" w:cs="Times New Roman"/>
-          <w:sz w:val="24"/>
-        </w:rPr>
-        <w:t>Kattge</w:t>
-      </w:r>
-      <w:proofErr w:type="spellEnd"/>
-      <w:r>
-        <w:rPr>
-          <w:rFonts w:ascii="Times New Roman" w:hAnsi="Times New Roman" w:cs="Times New Roman"/>
-          <w:sz w:val="24"/>
-        </w:rPr>
-        <w:t xml:space="preserve"> </w:t>
+        <w:t xml:space="preserve">Kattge </w:t>
       </w:r>
       <w:r>
         <w:rPr>
@@ -8006,7 +7751,6 @@
         </w:rPr>
         <w:t xml:space="preserve"> been used to identify the different phases of the invasion of signal crayfish (</w:t>
       </w:r>
-      <w:proofErr w:type="spellStart"/>
       <w:r>
         <w:rPr>
           <w:rFonts w:ascii="Times New Roman" w:eastAsia="Times New Roman" w:hAnsi="Times New Roman" w:cs="Times New Roman"/>
@@ -8015,85 +7759,163 @@
           <w:sz w:val="24"/>
           <w:szCs w:val="24"/>
         </w:rPr>
-        <w:t>Pacifastacus</w:t>
-      </w:r>
-      <w:proofErr w:type="spellEnd"/>
-      <w:r>
-        <w:rPr>
-          <w:rFonts w:ascii="Times New Roman" w:eastAsia="Times New Roman" w:hAnsi="Times New Roman" w:cs="Times New Roman"/>
+        <w:t>Pacifastacus leniusculus</w:t>
+      </w:r>
+      <w:r>
+        <w:rPr>
+          <w:rFonts w:ascii="Times New Roman" w:eastAsia="Times New Roman" w:hAnsi="Times New Roman" w:cs="Times New Roman"/>
+          <w:sz w:val="24"/>
+          <w:szCs w:val="24"/>
+        </w:rPr>
+        <w:t xml:space="preserve">) in Swedish Lakes </w:t>
+      </w:r>
+      <w:r>
+        <w:rPr>
+          <w:rFonts w:ascii="Times New Roman" w:eastAsia="Times New Roman" w:hAnsi="Times New Roman" w:cs="Times New Roman"/>
+          <w:sz w:val="24"/>
+          <w:szCs w:val="24"/>
+        </w:rPr>
+        <w:fldChar w:fldCharType="begin"/>
+      </w:r>
+      <w:r>
+        <w:rPr>
+          <w:rFonts w:ascii="Times New Roman" w:eastAsia="Times New Roman" w:hAnsi="Times New Roman" w:cs="Times New Roman"/>
+          <w:sz w:val="24"/>
+          <w:szCs w:val="24"/>
+        </w:rPr>
+        <w:instrText xml:space="preserve"> ADDIN ZOTERO_ITEM CSL_CITATION {"citationID":"cjHrDUtU","properties":{"formattedCitation":"(Sandstr\\uc0\\u246{}m {\\i{}et al.} 2014)","plainCitation":"(Sandström et al. 2014)","noteIndex":0},"citationItems":[{"id":199,"uris":["http://zotero.org/users/9972654/items/VFU2AJ2S"],"itemData":{"id":199,"type":"article-journal","container-title":"Biological Invasions","DOI":"10.1007/s10530-014-0641-1","ISSN":"1387-3547, 1573-1464","issue":"9","journalAbbreviation":"Biol Invasions","language":"en","page":"1961-1977","source":"DOI.org (Crossref)","title":"Population collapses in introduced non-indigenous crayfish","volume":"16","author":[{"family":"Sandström","given":"Alfred"},{"family":"Andersson","given":"Magnus"},{"family":"Asp","given":"Anders"},{"family":"Bohman","given":"Patrik"},{"family":"Edsman","given":"Lennart"},{"family":"Engdahl","given":"Fredrik"},{"family":"Nyström","given":"Per"},{"family":"Stenberg","given":"Marika"},{"family":"Hertonsson","given":"Pia"},{"family":"Vrålstad","given":"Trude"},{"family":"Granèli","given":"Wilhelm"}],"issued":{"date-parts":[["2014",9]]}}}],"schema":"https://github.com/citation-style-language/schema/raw/master/csl-citation.json"} </w:instrText>
+      </w:r>
+      <w:r>
+        <w:rPr>
+          <w:rFonts w:ascii="Times New Roman" w:eastAsia="Times New Roman" w:hAnsi="Times New Roman" w:cs="Times New Roman"/>
+          <w:sz w:val="24"/>
+          <w:szCs w:val="24"/>
+        </w:rPr>
+        <w:fldChar w:fldCharType="separate"/>
+      </w:r>
+      <w:r>
+        <w:rPr>
+          <w:rFonts w:ascii="Times New Roman" w:hAnsi="Times New Roman" w:cs="Times New Roman"/>
+          <w:sz w:val="24"/>
+        </w:rPr>
+        <w:t xml:space="preserve">(Sandström </w:t>
+      </w:r>
+      <w:r>
+        <w:rPr>
+          <w:rFonts w:ascii="Times New Roman" w:hAnsi="Times New Roman" w:cs="Times New Roman"/>
           <w:i/>
           <w:iCs/>
           <w:sz w:val="24"/>
-          <w:szCs w:val="24"/>
+        </w:rPr>
+        <w:t>et al.</w:t>
+      </w:r>
+      <w:r>
+        <w:rPr>
+          <w:rFonts w:ascii="Times New Roman" w:hAnsi="Times New Roman" w:cs="Times New Roman"/>
+          <w:sz w:val="24"/>
+        </w:rPr>
+        <w:t xml:space="preserve"> 2014)</w:t>
+      </w:r>
+      <w:r>
+        <w:rPr>
+          <w:rFonts w:ascii="Times New Roman" w:eastAsia="Times New Roman" w:hAnsi="Times New Roman" w:cs="Times New Roman"/>
+          <w:sz w:val="24"/>
+          <w:szCs w:val="24"/>
+        </w:rPr>
+        <w:fldChar w:fldCharType="end"/>
+      </w:r>
+      <w:r>
+        <w:rPr>
+          <w:rFonts w:ascii="Times New Roman" w:eastAsia="Times New Roman" w:hAnsi="Times New Roman" w:cs="Times New Roman"/>
+          <w:sz w:val="24"/>
+          <w:szCs w:val="24"/>
+        </w:rPr>
+        <w:t xml:space="preserve">.  </w:t>
+      </w:r>
+      <w:r>
+        <w:rPr>
+          <w:rFonts w:ascii="Times New Roman" w:eastAsia="Times New Roman" w:hAnsi="Times New Roman" w:cs="Times New Roman"/>
+          <w:sz w:val="24"/>
+          <w:szCs w:val="24"/>
+        </w:rPr>
+        <w:t>However,</w:t>
+      </w:r>
+      <w:r>
+        <w:rPr>
+          <w:rFonts w:ascii="Times New Roman" w:eastAsia="Times New Roman" w:hAnsi="Times New Roman" w:cs="Times New Roman"/>
+          <w:sz w:val="24"/>
+          <w:szCs w:val="24"/>
+        </w:rPr>
+        <w:t xml:space="preserve"> t</w:t>
+      </w:r>
+      <w:r>
+        <w:rPr>
+          <w:rFonts w:ascii="Times New Roman" w:eastAsia="Times New Roman" w:hAnsi="Times New Roman" w:cs="Times New Roman"/>
+          <w:sz w:val="24"/>
+          <w:szCs w:val="24"/>
+        </w:rPr>
+        <w:t xml:space="preserve">he regime shift detection required no missing observations in the time series, thus all-time series were modeled using latent variables (i.e., population estimates) from a Bayesian state-space approach developed by </w:t>
+      </w:r>
+      <w:r>
+        <w:rPr>
+          <w:rFonts w:ascii="Times New Roman" w:eastAsia="Times New Roman" w:hAnsi="Times New Roman" w:cs="Times New Roman"/>
+          <w:sz w:val="24"/>
+          <w:szCs w:val="24"/>
+        </w:rPr>
+        <w:fldChar w:fldCharType="begin"/>
+      </w:r>
+      <w:r>
+        <w:rPr>
+          <w:rFonts w:ascii="Times New Roman" w:eastAsia="Times New Roman" w:hAnsi="Times New Roman" w:cs="Times New Roman"/>
+          <w:sz w:val="24"/>
+          <w:szCs w:val="24"/>
+        </w:rPr>
+        <w:instrText xml:space="preserve"> ADDIN ZOTERO_ITEM CSL_CITATION {"citationID":"GKgPkTFY","properties":{"formattedCitation":"(Aagaard {\\i{}et al.} 2016)","plainCitation":"(Aagaard et al. 2016)","dontUpdate":true,"noteIndex":0},"citationItems":[{"id":1932,"uris":["http://zotero.org/users/9972654/items/7PNQ63SZ"],"itemData":{"id":1932,"type":"article-journal","container-title":"Ecological Modelling","DOI":"10.1016/j.ecolmodel.2016.02.014","ISSN":"03043800","journalAbbreviation":"Ecological Modelling","language":"en","page":"78-84","source":"DOI.org (Crossref)","title":"A Bayesian approach for characterizing uncertainty in declaring a population collapse","volume":"328","author":[{"family":"Aagaard","given":"Kevin"},{"family":"Lockwood","given":"Julie L."},{"family":"Green","given":"Edwin J."}],"issued":{"date-parts":[["2016",5]]}}}],"schema":"https://github.com/citation-style-language/schema/raw/master/csl-citation.json"} </w:instrText>
+      </w:r>
+      <w:r>
+        <w:rPr>
+          <w:rFonts w:ascii="Times New Roman" w:eastAsia="Times New Roman" w:hAnsi="Times New Roman" w:cs="Times New Roman"/>
+          <w:sz w:val="24"/>
+          <w:szCs w:val="24"/>
+        </w:rPr>
+        <w:fldChar w:fldCharType="separate"/>
+      </w:r>
+      <w:r>
+        <w:rPr>
+          <w:rFonts w:ascii="Times New Roman" w:hAnsi="Times New Roman" w:cs="Times New Roman"/>
+          <w:sz w:val="24"/>
+        </w:rPr>
+        <w:t xml:space="preserve">Aagaard </w:t>
+      </w:r>
+      <w:r>
+        <w:rPr>
+          <w:rFonts w:ascii="Times New Roman" w:hAnsi="Times New Roman" w:cs="Times New Roman"/>
+          <w:i/>
+          <w:iCs/>
+          <w:sz w:val="24"/>
+        </w:rPr>
+        <w:t>et al.</w:t>
+      </w:r>
+      <w:r>
+        <w:rPr>
+          <w:rFonts w:ascii="Times New Roman" w:hAnsi="Times New Roman" w:cs="Times New Roman"/>
+          <w:sz w:val="24"/>
         </w:rPr>
         <w:t xml:space="preserve"> </w:t>
       </w:r>
-      <w:proofErr w:type="spellStart"/>
-      <w:r>
-        <w:rPr>
-          <w:rFonts w:ascii="Times New Roman" w:eastAsia="Times New Roman" w:hAnsi="Times New Roman" w:cs="Times New Roman"/>
-          <w:i/>
-          <w:iCs/>
-          <w:sz w:val="24"/>
-          <w:szCs w:val="24"/>
-        </w:rPr>
-        <w:t>leniusculus</w:t>
-      </w:r>
-      <w:proofErr w:type="spellEnd"/>
-      <w:r>
-        <w:rPr>
-          <w:rFonts w:ascii="Times New Roman" w:eastAsia="Times New Roman" w:hAnsi="Times New Roman" w:cs="Times New Roman"/>
-          <w:sz w:val="24"/>
-          <w:szCs w:val="24"/>
-        </w:rPr>
-        <w:t xml:space="preserve">) in Swedish Lakes </w:t>
-      </w:r>
-      <w:r>
-        <w:rPr>
-          <w:rFonts w:ascii="Times New Roman" w:eastAsia="Times New Roman" w:hAnsi="Times New Roman" w:cs="Times New Roman"/>
-          <w:sz w:val="24"/>
-          <w:szCs w:val="24"/>
-        </w:rPr>
-        <w:fldChar w:fldCharType="begin"/>
-      </w:r>
-      <w:r>
-        <w:rPr>
-          <w:rFonts w:ascii="Times New Roman" w:eastAsia="Times New Roman" w:hAnsi="Times New Roman" w:cs="Times New Roman"/>
-          <w:sz w:val="24"/>
-          <w:szCs w:val="24"/>
-        </w:rPr>
-        <w:instrText xml:space="preserve"> ADDIN ZOTERO_ITEM CSL_CITATION {"citationID":"cjHrDUtU","properties":{"formattedCitation":"(Sandstr\\uc0\\u246{}m {\\i{}et al.} 2014)","plainCitation":"(Sandström et al. 2014)","noteIndex":0},"citationItems":[{"id":199,"uris":["http://zotero.org/users/9972654/items/VFU2AJ2S"],"itemData":{"id":199,"type":"article-journal","container-title":"Biological Invasions","DOI":"10.1007/s10530-014-0641-1","ISSN":"1387-3547, 1573-1464","issue":"9","journalAbbreviation":"Biol Invasions","language":"en","page":"1961-1977","source":"DOI.org (Crossref)","title":"Population collapses in introduced non-indigenous crayfish","volume":"16","author":[{"family":"Sandström","given":"Alfred"},{"family":"Andersson","given":"Magnus"},{"family":"Asp","given":"Anders"},{"family":"Bohman","given":"Patrik"},{"family":"Edsman","given":"Lennart"},{"family":"Engdahl","given":"Fredrik"},{"family":"Nyström","given":"Per"},{"family":"Stenberg","given":"Marika"},{"family":"Hertonsson","given":"Pia"},{"family":"Vrålstad","given":"Trude"},{"family":"Granèli","given":"Wilhelm"}],"issued":{"date-parts":[["2014",9]]}}}],"schema":"https://github.com/citation-style-language/schema/raw/master/csl-citation.json"} </w:instrText>
-      </w:r>
-      <w:r>
-        <w:rPr>
-          <w:rFonts w:ascii="Times New Roman" w:eastAsia="Times New Roman" w:hAnsi="Times New Roman" w:cs="Times New Roman"/>
-          <w:sz w:val="24"/>
-          <w:szCs w:val="24"/>
-        </w:rPr>
-        <w:fldChar w:fldCharType="separate"/>
-      </w:r>
-      <w:r>
-        <w:rPr>
-          <w:rFonts w:ascii="Times New Roman" w:hAnsi="Times New Roman" w:cs="Times New Roman"/>
-          <w:sz w:val="24"/>
-        </w:rPr>
-        <w:t xml:space="preserve">(Sandström </w:t>
-      </w:r>
-      <w:r>
-        <w:rPr>
-          <w:rFonts w:ascii="Times New Roman" w:hAnsi="Times New Roman" w:cs="Times New Roman"/>
-          <w:i/>
-          <w:iCs/>
-          <w:sz w:val="24"/>
-        </w:rPr>
-        <w:t>et al.</w:t>
-      </w:r>
-      <w:r>
-        <w:rPr>
-          <w:rFonts w:ascii="Times New Roman" w:hAnsi="Times New Roman" w:cs="Times New Roman"/>
-          <w:sz w:val="24"/>
-        </w:rPr>
-        <w:t xml:space="preserve"> 2014)</w:t>
+      <w:r>
+        <w:rPr>
+          <w:rFonts w:ascii="Times New Roman" w:hAnsi="Times New Roman" w:cs="Times New Roman"/>
+          <w:sz w:val="24"/>
+        </w:rPr>
+        <w:t>(</w:t>
+      </w:r>
+      <w:r>
+        <w:rPr>
+          <w:rFonts w:ascii="Times New Roman" w:hAnsi="Times New Roman" w:cs="Times New Roman"/>
+          <w:sz w:val="24"/>
+        </w:rPr>
+        <w:t>2016)</w:t>
       </w:r>
       <w:r>
         <w:rPr>
@@ -8109,124 +7931,39 @@
           <w:sz w:val="24"/>
           <w:szCs w:val="24"/>
         </w:rPr>
-        <w:t xml:space="preserve">.  </w:t>
-      </w:r>
-      <w:r>
-        <w:rPr>
-          <w:rFonts w:ascii="Times New Roman" w:eastAsia="Times New Roman" w:hAnsi="Times New Roman" w:cs="Times New Roman"/>
-          <w:sz w:val="24"/>
-          <w:szCs w:val="24"/>
-        </w:rPr>
-        <w:t>However,</w:t>
-      </w:r>
-      <w:r>
-        <w:rPr>
-          <w:rFonts w:ascii="Times New Roman" w:eastAsia="Times New Roman" w:hAnsi="Times New Roman" w:cs="Times New Roman"/>
-          <w:sz w:val="24"/>
-          <w:szCs w:val="24"/>
-        </w:rPr>
-        <w:t xml:space="preserve"> t</w:t>
-      </w:r>
-      <w:r>
-        <w:rPr>
-          <w:rFonts w:ascii="Times New Roman" w:eastAsia="Times New Roman" w:hAnsi="Times New Roman" w:cs="Times New Roman"/>
-          <w:sz w:val="24"/>
-          <w:szCs w:val="24"/>
-        </w:rPr>
-        <w:t xml:space="preserve">he regime shift detection required no missing observations in the time series, thus all-time series were modeled using latent variables (i.e., population estimates) from a Bayesian state-space approach developed by </w:t>
-      </w:r>
-      <w:r>
-        <w:rPr>
-          <w:rFonts w:ascii="Times New Roman" w:eastAsia="Times New Roman" w:hAnsi="Times New Roman" w:cs="Times New Roman"/>
-          <w:sz w:val="24"/>
-          <w:szCs w:val="24"/>
-        </w:rPr>
-        <w:fldChar w:fldCharType="begin"/>
-      </w:r>
-      <w:r>
-        <w:rPr>
-          <w:rFonts w:ascii="Times New Roman" w:eastAsia="Times New Roman" w:hAnsi="Times New Roman" w:cs="Times New Roman"/>
-          <w:sz w:val="24"/>
-          <w:szCs w:val="24"/>
-        </w:rPr>
-        <w:instrText xml:space="preserve"> ADDIN ZOTERO_ITEM CSL_CITATION {"citationID":"GKgPkTFY","properties":{"formattedCitation":"(Aagaard {\\i{}et al.} 2016)","plainCitation":"(Aagaard et al. 2016)","dontUpdate":true,"noteIndex":0},"citationItems":[{"id":1932,"uris":["http://zotero.org/users/9972654/items/7PNQ63SZ"],"itemData":{"id":1932,"type":"article-journal","container-title":"Ecological Modelling","DOI":"10.1016/j.ecolmodel.2016.02.014","ISSN":"03043800","journalAbbreviation":"Ecological Modelling","language":"en","page":"78-84","source":"DOI.org (Crossref)","title":"A Bayesian approach for characterizing uncertainty in declaring a population collapse","volume":"328","author":[{"family":"Aagaard","given":"Kevin"},{"family":"Lockwood","given":"Julie L."},{"family":"Green","given":"Edwin J."}],"issued":{"date-parts":[["2016",5]]}}}],"schema":"https://github.com/citation-style-language/schema/raw/master/csl-citation.json"} </w:instrText>
-      </w:r>
-      <w:r>
-        <w:rPr>
-          <w:rFonts w:ascii="Times New Roman" w:eastAsia="Times New Roman" w:hAnsi="Times New Roman" w:cs="Times New Roman"/>
-          <w:sz w:val="24"/>
-          <w:szCs w:val="24"/>
-        </w:rPr>
-        <w:fldChar w:fldCharType="separate"/>
-      </w:r>
-      <w:r>
-        <w:rPr>
-          <w:rFonts w:ascii="Times New Roman" w:hAnsi="Times New Roman" w:cs="Times New Roman"/>
-          <w:sz w:val="24"/>
-        </w:rPr>
-        <w:t xml:space="preserve">Aagaard </w:t>
-      </w:r>
-      <w:r>
-        <w:rPr>
-          <w:rFonts w:ascii="Times New Roman" w:hAnsi="Times New Roman" w:cs="Times New Roman"/>
-          <w:i/>
-          <w:iCs/>
-          <w:sz w:val="24"/>
-        </w:rPr>
-        <w:t>et al.</w:t>
-      </w:r>
-      <w:r>
-        <w:rPr>
-          <w:rFonts w:ascii="Times New Roman" w:hAnsi="Times New Roman" w:cs="Times New Roman"/>
-          <w:sz w:val="24"/>
+        <w:t>, and</w:t>
+      </w:r>
+      <w:r>
+        <w:rPr>
+          <w:rFonts w:ascii="Times New Roman" w:eastAsia="Times New Roman" w:hAnsi="Times New Roman" w:cs="Times New Roman"/>
+          <w:sz w:val="24"/>
+          <w:szCs w:val="24"/>
+        </w:rPr>
+        <w:t xml:space="preserve"> estimated values for each data point from the state-space model were used as the input for the regime shift detection method.</w:t>
+      </w:r>
+      <w:r>
+        <w:rPr>
+          <w:rFonts w:ascii="Times New Roman" w:eastAsia="Times New Roman" w:hAnsi="Times New Roman" w:cs="Times New Roman"/>
+          <w:sz w:val="24"/>
+          <w:szCs w:val="24"/>
+        </w:rPr>
+        <w:t xml:space="preserve"> For the regime shift detection method, we used</w:t>
+      </w:r>
+      <w:r>
+        <w:rPr>
+          <w:rFonts w:ascii="Times New Roman" w:eastAsia="Times New Roman" w:hAnsi="Times New Roman" w:cs="Times New Roman"/>
+          <w:sz w:val="24"/>
+          <w:szCs w:val="24"/>
         </w:rPr>
         <w:t xml:space="preserve"> </w:t>
       </w:r>
       <w:r>
         <w:rPr>
-          <w:rFonts w:ascii="Times New Roman" w:hAnsi="Times New Roman" w:cs="Times New Roman"/>
-          <w:sz w:val="24"/>
-        </w:rPr>
-        <w:t>(</w:t>
-      </w:r>
-      <w:r>
-        <w:rPr>
-          <w:rFonts w:ascii="Times New Roman" w:hAnsi="Times New Roman" w:cs="Times New Roman"/>
-          <w:sz w:val="24"/>
-        </w:rPr>
-        <w:t>2016)</w:t>
-      </w:r>
-      <w:r>
-        <w:rPr>
-          <w:rFonts w:ascii="Times New Roman" w:eastAsia="Times New Roman" w:hAnsi="Times New Roman" w:cs="Times New Roman"/>
-          <w:sz w:val="24"/>
-          <w:szCs w:val="24"/>
-        </w:rPr>
-        <w:fldChar w:fldCharType="end"/>
-      </w:r>
-      <w:r>
-        <w:rPr>
-          <w:rFonts w:ascii="Times New Roman" w:eastAsia="Times New Roman" w:hAnsi="Times New Roman" w:cs="Times New Roman"/>
-          <w:sz w:val="24"/>
-          <w:szCs w:val="24"/>
-        </w:rPr>
-        <w:t>, and</w:t>
-      </w:r>
-      <w:r>
-        <w:rPr>
-          <w:rFonts w:ascii="Times New Roman" w:eastAsia="Times New Roman" w:hAnsi="Times New Roman" w:cs="Times New Roman"/>
-          <w:sz w:val="24"/>
-          <w:szCs w:val="24"/>
-        </w:rPr>
-        <w:t xml:space="preserve"> estimated values for each data point from the state-space model were used as the input for the regime shift detection method.</w:t>
-      </w:r>
-      <w:r>
-        <w:rPr>
-          <w:rFonts w:ascii="Times New Roman" w:eastAsia="Times New Roman" w:hAnsi="Times New Roman" w:cs="Times New Roman"/>
-          <w:sz w:val="24"/>
-          <w:szCs w:val="24"/>
-        </w:rPr>
-        <w:t xml:space="preserve"> For the regime shift detection method, we used</w:t>
+          <w:rFonts w:ascii="Times New Roman" w:eastAsia="Times New Roman" w:hAnsi="Times New Roman" w:cs="Times New Roman"/>
+          <w:sz w:val="24"/>
+          <w:szCs w:val="24"/>
+        </w:rPr>
+        <w:t>the “breakpoints” function within the</w:t>
       </w:r>
       <w:r>
         <w:rPr>
@@ -8242,7 +7979,7 @@
           <w:sz w:val="24"/>
           <w:szCs w:val="24"/>
         </w:rPr>
-        <w:t>the “breakpoints” function within the</w:t>
+        <w:t>“strucchange” package in R</w:t>
       </w:r>
       <w:r>
         <w:rPr>
@@ -8258,40 +7995,6 @@
           <w:sz w:val="24"/>
           <w:szCs w:val="24"/>
         </w:rPr>
-        <w:t>“</w:t>
-      </w:r>
-      <w:proofErr w:type="spellStart"/>
-      <w:r>
-        <w:rPr>
-          <w:rFonts w:ascii="Times New Roman" w:eastAsia="Times New Roman" w:hAnsi="Times New Roman" w:cs="Times New Roman"/>
-          <w:sz w:val="24"/>
-          <w:szCs w:val="24"/>
-        </w:rPr>
-        <w:t>strucchange</w:t>
-      </w:r>
-      <w:proofErr w:type="spellEnd"/>
-      <w:r>
-        <w:rPr>
-          <w:rFonts w:ascii="Times New Roman" w:eastAsia="Times New Roman" w:hAnsi="Times New Roman" w:cs="Times New Roman"/>
-          <w:sz w:val="24"/>
-          <w:szCs w:val="24"/>
-        </w:rPr>
-        <w:t>” package in R</w:t>
-      </w:r>
-      <w:r>
-        <w:rPr>
-          <w:rFonts w:ascii="Times New Roman" w:eastAsia="Times New Roman" w:hAnsi="Times New Roman" w:cs="Times New Roman"/>
-          <w:sz w:val="24"/>
-          <w:szCs w:val="24"/>
-        </w:rPr>
-        <w:t xml:space="preserve"> </w:t>
-      </w:r>
-      <w:r>
-        <w:rPr>
-          <w:rFonts w:ascii="Times New Roman" w:eastAsia="Times New Roman" w:hAnsi="Times New Roman" w:cs="Times New Roman"/>
-          <w:sz w:val="24"/>
-          <w:szCs w:val="24"/>
-        </w:rPr>
         <w:t xml:space="preserve">to identify breakpoints in the time series </w:t>
       </w:r>
       <w:r>
@@ -8428,25 +8131,7 @@
           <w:sz w:val="24"/>
           <w:szCs w:val="24"/>
         </w:rPr>
-        <w:t xml:space="preserve">that </w:t>
-      </w:r>
-      <w:proofErr w:type="gramStart"/>
-      <w:r>
-        <w:rPr>
-          <w:rFonts w:ascii="Times New Roman" w:eastAsia="Times New Roman" w:hAnsi="Times New Roman" w:cs="Times New Roman"/>
-          <w:sz w:val="24"/>
-          <w:szCs w:val="24"/>
-        </w:rPr>
-        <w:t>was</w:t>
-      </w:r>
-      <w:proofErr w:type="gramEnd"/>
-      <w:r>
-        <w:rPr>
-          <w:rFonts w:ascii="Times New Roman" w:eastAsia="Times New Roman" w:hAnsi="Times New Roman" w:cs="Times New Roman"/>
-          <w:sz w:val="24"/>
-          <w:szCs w:val="24"/>
-        </w:rPr>
-        <w:t xml:space="preserve"> not found when </w:t>
+        <w:t xml:space="preserve">that was not found when </w:t>
       </w:r>
       <w:r>
         <w:rPr>
@@ -10029,23 +9714,13 @@
         </w:rPr>
         <w:t xml:space="preserve"> time series </w:t>
       </w:r>
-      <w:proofErr w:type="gramStart"/>
-      <w:r>
-        <w:rPr>
-          <w:rFonts w:ascii="Times New Roman" w:eastAsia="Times New Roman" w:hAnsi="Times New Roman" w:cs="Times New Roman"/>
-          <w:sz w:val="24"/>
-          <w:szCs w:val="24"/>
-        </w:rPr>
-        <w:t>were</w:t>
-      </w:r>
-      <w:proofErr w:type="gramEnd"/>
-      <w:r>
-        <w:rPr>
-          <w:rFonts w:ascii="Times New Roman" w:eastAsia="Times New Roman" w:hAnsi="Times New Roman" w:cs="Times New Roman"/>
-          <w:sz w:val="24"/>
-          <w:szCs w:val="24"/>
-        </w:rPr>
-        <w:t xml:space="preserve"> </w:t>
+      <w:r>
+        <w:rPr>
+          <w:rFonts w:ascii="Times New Roman" w:eastAsia="Times New Roman" w:hAnsi="Times New Roman" w:cs="Times New Roman"/>
+          <w:sz w:val="24"/>
+          <w:szCs w:val="24"/>
+        </w:rPr>
+        <w:t xml:space="preserve">were </w:t>
       </w:r>
       <w:r>
         <w:rPr>
@@ -10978,33 +10653,15 @@
           <w:sz w:val="24"/>
           <w:szCs w:val="24"/>
         </w:rPr>
-        <w:t xml:space="preserve">The </w:t>
-      </w:r>
-      <w:proofErr w:type="gramStart"/>
-      <w:r>
-        <w:rPr>
-          <w:rFonts w:ascii="Times New Roman" w:eastAsia="Times New Roman" w:hAnsi="Times New Roman" w:cs="Times New Roman"/>
-          <w:sz w:val="24"/>
-          <w:szCs w:val="24"/>
-        </w:rPr>
-        <w:t>87</w:t>
-      </w:r>
-      <w:r>
-        <w:rPr>
-          <w:rFonts w:ascii="Times New Roman" w:eastAsia="Times New Roman" w:hAnsi="Times New Roman" w:cs="Times New Roman"/>
-          <w:sz w:val="24"/>
-          <w:szCs w:val="24"/>
-        </w:rPr>
-        <w:t xml:space="preserve"> times</w:t>
-      </w:r>
-      <w:proofErr w:type="gramEnd"/>
-      <w:r>
-        <w:rPr>
-          <w:rFonts w:ascii="Times New Roman" w:eastAsia="Times New Roman" w:hAnsi="Times New Roman" w:cs="Times New Roman"/>
-          <w:sz w:val="24"/>
-          <w:szCs w:val="24"/>
-        </w:rPr>
-        <w:t xml:space="preserve"> series </w:t>
+        <w:t>The 87</w:t>
+      </w:r>
+      <w:r>
+        <w:rPr>
+          <w:rFonts w:ascii="Times New Roman" w:eastAsia="Times New Roman" w:hAnsi="Times New Roman" w:cs="Times New Roman"/>
+          <w:sz w:val="24"/>
+          <w:szCs w:val="24"/>
+        </w:rPr>
+        <w:t xml:space="preserve"> times series </w:t>
       </w:r>
       <w:r>
         <w:rPr>
@@ -11020,25 +10677,7 @@
           <w:sz w:val="24"/>
           <w:szCs w:val="24"/>
         </w:rPr>
-        <w:t xml:space="preserve">i.e., </w:t>
-      </w:r>
-      <w:proofErr w:type="gramStart"/>
-      <w:r>
-        <w:rPr>
-          <w:rFonts w:ascii="Times New Roman" w:eastAsia="Times New Roman" w:hAnsi="Times New Roman" w:cs="Times New Roman"/>
-          <w:sz w:val="24"/>
-          <w:szCs w:val="24"/>
-        </w:rPr>
-        <w:t>≥  90</w:t>
-      </w:r>
-      <w:proofErr w:type="gramEnd"/>
-      <w:r>
-        <w:rPr>
-          <w:rFonts w:ascii="Times New Roman" w:eastAsia="Times New Roman" w:hAnsi="Times New Roman" w:cs="Times New Roman"/>
-          <w:sz w:val="24"/>
-          <w:szCs w:val="24"/>
-        </w:rPr>
-        <w:t>% decline)</w:t>
+        <w:t>i.e., ≥  90% decline)</w:t>
       </w:r>
       <w:r>
         <w:rPr>
@@ -11427,7 +11066,6 @@
         </w:rPr>
         <w:t xml:space="preserve"> (</w:t>
       </w:r>
-      <w:proofErr w:type="spellStart"/>
       <w:r>
         <w:rPr>
           <w:rFonts w:ascii="Times New Roman" w:eastAsia="Times New Roman" w:hAnsi="Times New Roman" w:cs="Times New Roman"/>
@@ -11436,31 +11074,8 @@
           <w:sz w:val="24"/>
           <w:szCs w:val="24"/>
         </w:rPr>
-        <w:t>Potamopyrgus</w:t>
-      </w:r>
-      <w:proofErr w:type="spellEnd"/>
-      <w:r>
-        <w:rPr>
-          <w:rFonts w:ascii="Times New Roman" w:eastAsia="Times New Roman" w:hAnsi="Times New Roman" w:cs="Times New Roman"/>
-          <w:i/>
-          <w:iCs/>
-          <w:sz w:val="24"/>
-          <w:szCs w:val="24"/>
-        </w:rPr>
-        <w:t xml:space="preserve"> </w:t>
-      </w:r>
-      <w:proofErr w:type="spellStart"/>
-      <w:r>
-        <w:rPr>
-          <w:rFonts w:ascii="Times New Roman" w:eastAsia="Times New Roman" w:hAnsi="Times New Roman" w:cs="Times New Roman"/>
-          <w:i/>
-          <w:iCs/>
-          <w:sz w:val="24"/>
-          <w:szCs w:val="24"/>
-        </w:rPr>
-        <w:t>antipodarum</w:t>
-      </w:r>
-      <w:proofErr w:type="spellEnd"/>
+        <w:t>Potamopyrgus antipodarum</w:t>
+      </w:r>
       <w:r>
         <w:rPr>
           <w:rFonts w:ascii="Times New Roman" w:eastAsia="Times New Roman" w:hAnsi="Times New Roman" w:cs="Times New Roman"/>
@@ -11574,7 +11189,6 @@
         </w:rPr>
         <w:t xml:space="preserve"> of </w:t>
       </w:r>
-      <w:proofErr w:type="spellStart"/>
       <w:r>
         <w:rPr>
           <w:rFonts w:ascii="Times New Roman" w:eastAsia="Times New Roman" w:hAnsi="Times New Roman" w:cs="Times New Roman"/>
@@ -11605,9 +11219,136 @@
           <w:sz w:val="24"/>
           <w:szCs w:val="24"/>
         </w:rPr>
-        <w:t>a</w:t>
-      </w:r>
-      <w:proofErr w:type="spellEnd"/>
+        <w:t xml:space="preserve">a </w:t>
+      </w:r>
+      <w:r>
+        <w:rPr>
+          <w:rFonts w:ascii="Times New Roman" w:eastAsia="Times New Roman" w:hAnsi="Times New Roman" w:cs="Times New Roman"/>
+          <w:sz w:val="24"/>
+          <w:szCs w:val="24"/>
+        </w:rPr>
+        <w:t>time</w:t>
+      </w:r>
+      <w:r>
+        <w:rPr>
+          <w:rFonts w:ascii="Times New Roman" w:eastAsia="Times New Roman" w:hAnsi="Times New Roman" w:cs="Times New Roman"/>
+          <w:sz w:val="24"/>
+          <w:szCs w:val="24"/>
+        </w:rPr>
+        <w:t xml:space="preserve"> series that</w:t>
+      </w:r>
+      <w:r>
+        <w:rPr>
+          <w:rFonts w:ascii="Times New Roman" w:eastAsia="Times New Roman" w:hAnsi="Times New Roman" w:cs="Times New Roman"/>
+          <w:sz w:val="24"/>
+          <w:szCs w:val="24"/>
+        </w:rPr>
+        <w:t xml:space="preserve"> documented ≥ 90% declines</w:t>
+      </w:r>
+      <w:r>
+        <w:rPr>
+          <w:rFonts w:ascii="Times New Roman" w:eastAsia="Times New Roman" w:hAnsi="Times New Roman" w:cs="Times New Roman"/>
+          <w:sz w:val="24"/>
+          <w:szCs w:val="24"/>
+        </w:rPr>
+        <w:t>. Gastropoda had the most time seri</w:t>
+      </w:r>
+      <w:r>
+        <w:rPr>
+          <w:rFonts w:ascii="Times New Roman" w:eastAsia="Times New Roman" w:hAnsi="Times New Roman" w:cs="Times New Roman"/>
+          <w:sz w:val="24"/>
+          <w:szCs w:val="24"/>
+        </w:rPr>
+        <w:t>e</w:t>
+      </w:r>
+      <w:r>
+        <w:rPr>
+          <w:rFonts w:ascii="Times New Roman" w:eastAsia="Times New Roman" w:hAnsi="Times New Roman" w:cs="Times New Roman"/>
+          <w:sz w:val="24"/>
+          <w:szCs w:val="24"/>
+        </w:rPr>
+        <w:t xml:space="preserve">s (28 out of </w:t>
+      </w:r>
+      <w:r>
+        <w:rPr>
+          <w:rFonts w:ascii="Times New Roman" w:eastAsia="Times New Roman" w:hAnsi="Times New Roman" w:cs="Times New Roman"/>
+          <w:sz w:val="24"/>
+          <w:szCs w:val="24"/>
+        </w:rPr>
+        <w:t>87; 32%) that met criteria 3</w:t>
+      </w:r>
+      <w:r>
+        <w:rPr>
+          <w:rFonts w:ascii="Times New Roman" w:eastAsia="Times New Roman" w:hAnsi="Times New Roman" w:cs="Times New Roman"/>
+          <w:sz w:val="24"/>
+          <w:szCs w:val="24"/>
+        </w:rPr>
+        <w:t xml:space="preserve"> (Fig. 3</w:t>
+      </w:r>
+      <w:r>
+        <w:rPr>
+          <w:rFonts w:ascii="Times New Roman" w:eastAsia="Times New Roman" w:hAnsi="Times New Roman" w:cs="Times New Roman"/>
+          <w:sz w:val="24"/>
+          <w:szCs w:val="24"/>
+        </w:rPr>
+        <w:t>C</w:t>
+      </w:r>
+      <w:r>
+        <w:rPr>
+          <w:rFonts w:ascii="Times New Roman" w:eastAsia="Times New Roman" w:hAnsi="Times New Roman" w:cs="Times New Roman"/>
+          <w:sz w:val="24"/>
+          <w:szCs w:val="24"/>
+        </w:rPr>
+        <w:t>)</w:t>
+      </w:r>
+      <w:r>
+        <w:rPr>
+          <w:rFonts w:ascii="Times New Roman" w:eastAsia="Times New Roman" w:hAnsi="Times New Roman" w:cs="Times New Roman"/>
+          <w:sz w:val="24"/>
+          <w:szCs w:val="24"/>
+        </w:rPr>
+        <w:t xml:space="preserve">.  </w:t>
+      </w:r>
+      <w:r>
+        <w:rPr>
+          <w:rFonts w:ascii="Times New Roman" w:eastAsia="Times New Roman" w:hAnsi="Times New Roman" w:cs="Times New Roman"/>
+          <w:sz w:val="24"/>
+          <w:szCs w:val="24"/>
+        </w:rPr>
+        <w:t>28% of the time series (</w:t>
+      </w:r>
+      <w:r>
+        <w:rPr>
+          <w:rFonts w:ascii="Times New Roman" w:eastAsia="Times New Roman" w:hAnsi="Times New Roman" w:cs="Times New Roman"/>
+          <w:sz w:val="24"/>
+          <w:szCs w:val="24"/>
+        </w:rPr>
+        <w:t>24</w:t>
+      </w:r>
+      <w:r>
+        <w:rPr>
+          <w:rFonts w:ascii="Times New Roman" w:eastAsia="Times New Roman" w:hAnsi="Times New Roman" w:cs="Times New Roman"/>
+          <w:sz w:val="24"/>
+          <w:szCs w:val="24"/>
+        </w:rPr>
+        <w:t xml:space="preserve"> out of </w:t>
+      </w:r>
+      <w:r>
+        <w:rPr>
+          <w:rFonts w:ascii="Times New Roman" w:eastAsia="Times New Roman" w:hAnsi="Times New Roman" w:cs="Times New Roman"/>
+          <w:sz w:val="24"/>
+          <w:szCs w:val="24"/>
+        </w:rPr>
+        <w:t>87)</w:t>
+      </w:r>
+      <w:r>
+        <w:rPr>
+          <w:rFonts w:ascii="Times New Roman" w:eastAsia="Times New Roman" w:hAnsi="Times New Roman" w:cs="Times New Roman"/>
+          <w:sz w:val="24"/>
+          <w:szCs w:val="24"/>
+        </w:rPr>
+        <w:t xml:space="preserve"> and</w:t>
+      </w:r>
       <w:r>
         <w:rPr>
           <w:rFonts w:ascii="Times New Roman" w:eastAsia="Times New Roman" w:hAnsi="Times New Roman" w:cs="Times New Roman"/>
@@ -11622,73 +11363,31 @@
           <w:sz w:val="24"/>
           <w:szCs w:val="24"/>
         </w:rPr>
-        <w:t>time</w:t>
-      </w:r>
-      <w:r>
-        <w:rPr>
-          <w:rFonts w:ascii="Times New Roman" w:eastAsia="Times New Roman" w:hAnsi="Times New Roman" w:cs="Times New Roman"/>
-          <w:sz w:val="24"/>
-          <w:szCs w:val="24"/>
-        </w:rPr>
-        <w:t xml:space="preserve"> series that</w:t>
-      </w:r>
-      <w:r>
-        <w:rPr>
-          <w:rFonts w:ascii="Times New Roman" w:eastAsia="Times New Roman" w:hAnsi="Times New Roman" w:cs="Times New Roman"/>
-          <w:sz w:val="24"/>
-          <w:szCs w:val="24"/>
-        </w:rPr>
-        <w:t xml:space="preserve"> documented ≥ 90% declines</w:t>
-      </w:r>
-      <w:r>
-        <w:rPr>
-          <w:rFonts w:ascii="Times New Roman" w:eastAsia="Times New Roman" w:hAnsi="Times New Roman" w:cs="Times New Roman"/>
-          <w:sz w:val="24"/>
-          <w:szCs w:val="24"/>
-        </w:rPr>
-        <w:t xml:space="preserve">. </w:t>
-      </w:r>
-      <w:proofErr w:type="spellStart"/>
-      <w:r>
-        <w:rPr>
-          <w:rFonts w:ascii="Times New Roman" w:eastAsia="Times New Roman" w:hAnsi="Times New Roman" w:cs="Times New Roman"/>
-          <w:sz w:val="24"/>
-          <w:szCs w:val="24"/>
-        </w:rPr>
-        <w:t>Gastropoda</w:t>
-      </w:r>
-      <w:proofErr w:type="spellEnd"/>
-      <w:r>
-        <w:rPr>
-          <w:rFonts w:ascii="Times New Roman" w:eastAsia="Times New Roman" w:hAnsi="Times New Roman" w:cs="Times New Roman"/>
-          <w:sz w:val="24"/>
-          <w:szCs w:val="24"/>
-        </w:rPr>
-        <w:t xml:space="preserve"> had the most time seri</w:t>
-      </w:r>
-      <w:r>
-        <w:rPr>
-          <w:rFonts w:ascii="Times New Roman" w:eastAsia="Times New Roman" w:hAnsi="Times New Roman" w:cs="Times New Roman"/>
-          <w:sz w:val="24"/>
-          <w:szCs w:val="24"/>
-        </w:rPr>
-        <w:t>e</w:t>
-      </w:r>
-      <w:r>
-        <w:rPr>
-          <w:rFonts w:ascii="Times New Roman" w:eastAsia="Times New Roman" w:hAnsi="Times New Roman" w:cs="Times New Roman"/>
-          <w:sz w:val="24"/>
-          <w:szCs w:val="24"/>
-        </w:rPr>
-        <w:t xml:space="preserve">s (28 out of </w:t>
-      </w:r>
-      <w:r>
-        <w:rPr>
-          <w:rFonts w:ascii="Times New Roman" w:eastAsia="Times New Roman" w:hAnsi="Times New Roman" w:cs="Times New Roman"/>
-          <w:sz w:val="24"/>
-          <w:szCs w:val="24"/>
-        </w:rPr>
-        <w:t>87; 32%) that met criteria 3</w:t>
+        <w:t>20% of the time series (17 out of 87)</w:t>
+      </w:r>
+      <w:r>
+        <w:rPr>
+          <w:rFonts w:ascii="Times New Roman" w:eastAsia="Times New Roman" w:hAnsi="Times New Roman" w:cs="Times New Roman"/>
+          <w:sz w:val="24"/>
+          <w:szCs w:val="24"/>
+        </w:rPr>
+        <w:t xml:space="preserve"> were from</w:t>
+      </w:r>
+      <w:r>
+        <w:rPr>
+          <w:rFonts w:ascii="Times New Roman" w:eastAsia="Times New Roman" w:hAnsi="Times New Roman" w:cs="Times New Roman"/>
+          <w:sz w:val="24"/>
+          <w:szCs w:val="24"/>
+        </w:rPr>
+        <w:t xml:space="preserve"> birds (Aves) and ray-finned fishes (Actinopterygii)</w:t>
+      </w:r>
+      <w:r>
+        <w:rPr>
+          <w:rFonts w:ascii="Times New Roman" w:eastAsia="Times New Roman" w:hAnsi="Times New Roman" w:cs="Times New Roman"/>
+          <w:sz w:val="24"/>
+          <w:szCs w:val="24"/>
+        </w:rPr>
+        <w:t>, respectively</w:t>
       </w:r>
       <w:r>
         <w:rPr>
@@ -11728,136 +11427,6 @@
           <w:sz w:val="24"/>
           <w:szCs w:val="24"/>
         </w:rPr>
-        <w:t>28% of the time series (</w:t>
-      </w:r>
-      <w:r>
-        <w:rPr>
-          <w:rFonts w:ascii="Times New Roman" w:eastAsia="Times New Roman" w:hAnsi="Times New Roman" w:cs="Times New Roman"/>
-          <w:sz w:val="24"/>
-          <w:szCs w:val="24"/>
-        </w:rPr>
-        <w:t>24</w:t>
-      </w:r>
-      <w:r>
-        <w:rPr>
-          <w:rFonts w:ascii="Times New Roman" w:eastAsia="Times New Roman" w:hAnsi="Times New Roman" w:cs="Times New Roman"/>
-          <w:sz w:val="24"/>
-          <w:szCs w:val="24"/>
-        </w:rPr>
-        <w:t xml:space="preserve"> out of </w:t>
-      </w:r>
-      <w:r>
-        <w:rPr>
-          <w:rFonts w:ascii="Times New Roman" w:eastAsia="Times New Roman" w:hAnsi="Times New Roman" w:cs="Times New Roman"/>
-          <w:sz w:val="24"/>
-          <w:szCs w:val="24"/>
-        </w:rPr>
-        <w:t>87)</w:t>
-      </w:r>
-      <w:r>
-        <w:rPr>
-          <w:rFonts w:ascii="Times New Roman" w:eastAsia="Times New Roman" w:hAnsi="Times New Roman" w:cs="Times New Roman"/>
-          <w:sz w:val="24"/>
-          <w:szCs w:val="24"/>
-        </w:rPr>
-        <w:t xml:space="preserve"> and</w:t>
-      </w:r>
-      <w:r>
-        <w:rPr>
-          <w:rFonts w:ascii="Times New Roman" w:eastAsia="Times New Roman" w:hAnsi="Times New Roman" w:cs="Times New Roman"/>
-          <w:sz w:val="24"/>
-          <w:szCs w:val="24"/>
-        </w:rPr>
-        <w:t xml:space="preserve"> </w:t>
-      </w:r>
-      <w:r>
-        <w:rPr>
-          <w:rFonts w:ascii="Times New Roman" w:eastAsia="Times New Roman" w:hAnsi="Times New Roman" w:cs="Times New Roman"/>
-          <w:sz w:val="24"/>
-          <w:szCs w:val="24"/>
-        </w:rPr>
-        <w:t>20% of the time series (17 out of 87)</w:t>
-      </w:r>
-      <w:r>
-        <w:rPr>
-          <w:rFonts w:ascii="Times New Roman" w:eastAsia="Times New Roman" w:hAnsi="Times New Roman" w:cs="Times New Roman"/>
-          <w:sz w:val="24"/>
-          <w:szCs w:val="24"/>
-        </w:rPr>
-        <w:t xml:space="preserve"> were from</w:t>
-      </w:r>
-      <w:r>
-        <w:rPr>
-          <w:rFonts w:ascii="Times New Roman" w:eastAsia="Times New Roman" w:hAnsi="Times New Roman" w:cs="Times New Roman"/>
-          <w:sz w:val="24"/>
-          <w:szCs w:val="24"/>
-        </w:rPr>
-        <w:t xml:space="preserve"> birds (Aves) and ray-finned </w:t>
-      </w:r>
-      <w:proofErr w:type="gramStart"/>
-      <w:r>
-        <w:rPr>
-          <w:rFonts w:ascii="Times New Roman" w:eastAsia="Times New Roman" w:hAnsi="Times New Roman" w:cs="Times New Roman"/>
-          <w:sz w:val="24"/>
-          <w:szCs w:val="24"/>
-        </w:rPr>
-        <w:t>fishes</w:t>
-      </w:r>
-      <w:proofErr w:type="gramEnd"/>
-      <w:r>
-        <w:rPr>
-          <w:rFonts w:ascii="Times New Roman" w:eastAsia="Times New Roman" w:hAnsi="Times New Roman" w:cs="Times New Roman"/>
-          <w:sz w:val="24"/>
-          <w:szCs w:val="24"/>
-        </w:rPr>
-        <w:t xml:space="preserve"> (Actinopterygii)</w:t>
-      </w:r>
-      <w:r>
-        <w:rPr>
-          <w:rFonts w:ascii="Times New Roman" w:eastAsia="Times New Roman" w:hAnsi="Times New Roman" w:cs="Times New Roman"/>
-          <w:sz w:val="24"/>
-          <w:szCs w:val="24"/>
-        </w:rPr>
-        <w:t>, respectively</w:t>
-      </w:r>
-      <w:r>
-        <w:rPr>
-          <w:rFonts w:ascii="Times New Roman" w:eastAsia="Times New Roman" w:hAnsi="Times New Roman" w:cs="Times New Roman"/>
-          <w:sz w:val="24"/>
-          <w:szCs w:val="24"/>
-        </w:rPr>
-        <w:t xml:space="preserve"> (Fig. 3</w:t>
-      </w:r>
-      <w:r>
-        <w:rPr>
-          <w:rFonts w:ascii="Times New Roman" w:eastAsia="Times New Roman" w:hAnsi="Times New Roman" w:cs="Times New Roman"/>
-          <w:sz w:val="24"/>
-          <w:szCs w:val="24"/>
-        </w:rPr>
-        <w:t>C</w:t>
-      </w:r>
-      <w:r>
-        <w:rPr>
-          <w:rFonts w:ascii="Times New Roman" w:eastAsia="Times New Roman" w:hAnsi="Times New Roman" w:cs="Times New Roman"/>
-          <w:sz w:val="24"/>
-          <w:szCs w:val="24"/>
-        </w:rPr>
-        <w:t>)</w:t>
-      </w:r>
-      <w:r>
-        <w:rPr>
-          <w:rFonts w:ascii="Times New Roman" w:eastAsia="Times New Roman" w:hAnsi="Times New Roman" w:cs="Times New Roman"/>
-          <w:sz w:val="24"/>
-          <w:szCs w:val="24"/>
-        </w:rPr>
-        <w:t xml:space="preserve">.  </w:t>
-      </w:r>
-      <w:r>
-        <w:rPr>
-          <w:rFonts w:ascii="Times New Roman" w:eastAsia="Times New Roman" w:hAnsi="Times New Roman" w:cs="Times New Roman"/>
-          <w:sz w:val="24"/>
-          <w:szCs w:val="24"/>
-        </w:rPr>
         <w:t xml:space="preserve">8% of the time series were from populations of </w:t>
       </w:r>
       <w:r>
@@ -11890,25 +11459,7 @@
           <w:sz w:val="24"/>
           <w:szCs w:val="24"/>
         </w:rPr>
-        <w:t xml:space="preserve">6% of the time </w:t>
-      </w:r>
-      <w:proofErr w:type="spellStart"/>
-      <w:r>
-        <w:rPr>
-          <w:rFonts w:ascii="Times New Roman" w:eastAsia="Times New Roman" w:hAnsi="Times New Roman" w:cs="Times New Roman"/>
-          <w:sz w:val="24"/>
-          <w:szCs w:val="24"/>
-        </w:rPr>
-        <w:t>sereis</w:t>
-      </w:r>
-      <w:proofErr w:type="spellEnd"/>
-      <w:r>
-        <w:rPr>
-          <w:rFonts w:ascii="Times New Roman" w:eastAsia="Times New Roman" w:hAnsi="Times New Roman" w:cs="Times New Roman"/>
-          <w:sz w:val="24"/>
-          <w:szCs w:val="24"/>
-        </w:rPr>
-        <w:t xml:space="preserve"> were from M</w:t>
+        <w:t>6% of the time sereis were from M</w:t>
       </w:r>
       <w:r>
         <w:rPr>
@@ -12250,25 +11801,7 @@
           <w:sz w:val="24"/>
           <w:szCs w:val="24"/>
         </w:rPr>
-        <w:t xml:space="preserve"> that were </w:t>
-      </w:r>
-      <w:proofErr w:type="gramStart"/>
-      <w:r>
-        <w:rPr>
-          <w:rFonts w:ascii="Times New Roman" w:eastAsia="Times New Roman" w:hAnsi="Times New Roman" w:cs="Times New Roman"/>
-          <w:sz w:val="24"/>
-          <w:szCs w:val="24"/>
-        </w:rPr>
-        <w:t>classifiable</w:t>
-      </w:r>
-      <w:proofErr w:type="gramEnd"/>
-      <w:r>
-        <w:rPr>
-          <w:rFonts w:ascii="Times New Roman" w:eastAsia="Times New Roman" w:hAnsi="Times New Roman" w:cs="Times New Roman"/>
-          <w:sz w:val="24"/>
-          <w:szCs w:val="24"/>
-        </w:rPr>
-        <w:t xml:space="preserve"> were distributed disproportionately across </w:t>
+        <w:t xml:space="preserve"> that were classifiable were distributed disproportionately across </w:t>
       </w:r>
       <w:r>
         <w:rPr>
@@ -12356,25 +11889,7 @@
           <w:sz w:val="24"/>
           <w:szCs w:val="24"/>
         </w:rPr>
-        <w:t xml:space="preserve">, gastropods made up </w:t>
-      </w:r>
-      <w:proofErr w:type="gramStart"/>
-      <w:r>
-        <w:rPr>
-          <w:rFonts w:ascii="Times New Roman" w:eastAsia="Times New Roman" w:hAnsi="Times New Roman" w:cs="Times New Roman"/>
-          <w:sz w:val="24"/>
-          <w:szCs w:val="24"/>
-        </w:rPr>
-        <w:t>the majority of</w:t>
-      </w:r>
-      <w:proofErr w:type="gramEnd"/>
-      <w:r>
-        <w:rPr>
-          <w:rFonts w:ascii="Times New Roman" w:eastAsia="Times New Roman" w:hAnsi="Times New Roman" w:cs="Times New Roman"/>
-          <w:sz w:val="24"/>
-          <w:szCs w:val="24"/>
-        </w:rPr>
-        <w:t xml:space="preserve"> the compiled time series</w:t>
+        <w:t>, gastropods made up the majority of the compiled time series</w:t>
       </w:r>
       <w:r>
         <w:rPr>
@@ -12921,25 +12436,7 @@
           <w:sz w:val="24"/>
           <w:szCs w:val="24"/>
         </w:rPr>
-        <w:t xml:space="preserve">The </w:t>
-      </w:r>
-      <w:proofErr w:type="gramStart"/>
-      <w:r>
-        <w:rPr>
-          <w:rFonts w:ascii="Times New Roman" w:eastAsia="Times New Roman" w:hAnsi="Times New Roman" w:cs="Times New Roman"/>
-          <w:sz w:val="24"/>
-          <w:szCs w:val="24"/>
-        </w:rPr>
-        <w:t>33 time</w:t>
-      </w:r>
-      <w:proofErr w:type="gramEnd"/>
-      <w:r>
-        <w:rPr>
-          <w:rFonts w:ascii="Times New Roman" w:eastAsia="Times New Roman" w:hAnsi="Times New Roman" w:cs="Times New Roman"/>
-          <w:sz w:val="24"/>
-          <w:szCs w:val="24"/>
-        </w:rPr>
-        <w:t xml:space="preserve"> series that we classified as boom-bust were found in</w:t>
+        <w:t>The 33 time series that we classified as boom-bust were found in</w:t>
       </w:r>
       <w:r>
         <w:rPr>
@@ -14442,27 +13939,7 @@
           <w:sz w:val="24"/>
           <w:szCs w:val="24"/>
         </w:rPr>
-        <w:t xml:space="preserve">of the </w:t>
-      </w:r>
-      <w:proofErr w:type="gramStart"/>
-      <w:r>
-        <w:rPr>
-          <w:rFonts w:ascii="Times New Roman" w:eastAsia="Times New Roman" w:hAnsi="Times New Roman" w:cs="Times New Roman"/>
-          <w:iCs/>
-          <w:sz w:val="24"/>
-          <w:szCs w:val="24"/>
-        </w:rPr>
-        <w:t>195 time</w:t>
-      </w:r>
-      <w:proofErr w:type="gramEnd"/>
-      <w:r>
-        <w:rPr>
-          <w:rFonts w:ascii="Times New Roman" w:eastAsia="Times New Roman" w:hAnsi="Times New Roman" w:cs="Times New Roman"/>
-          <w:iCs/>
-          <w:sz w:val="24"/>
-          <w:szCs w:val="24"/>
-        </w:rPr>
-        <w:t xml:space="preserve"> series that </w:t>
+        <w:t xml:space="preserve">of the 195 time series that </w:t>
       </w:r>
       <w:r>
         <w:rPr>
@@ -14861,7 +14338,6 @@
         </w:rPr>
         <w:t xml:space="preserve"> (</w:t>
       </w:r>
-      <w:proofErr w:type="spellStart"/>
       <w:r>
         <w:rPr>
           <w:rFonts w:ascii="Times New Roman" w:eastAsia="Times New Roman" w:hAnsi="Times New Roman" w:cs="Times New Roman"/>
@@ -14869,94 +14345,73 @@
           <w:sz w:val="24"/>
           <w:szCs w:val="24"/>
         </w:rPr>
-        <w:t>Potamopyrgus</w:t>
-      </w:r>
-      <w:proofErr w:type="spellEnd"/>
-      <w:r>
-        <w:rPr>
-          <w:rFonts w:ascii="Times New Roman" w:eastAsia="Times New Roman" w:hAnsi="Times New Roman" w:cs="Times New Roman"/>
+        <w:t>Potamopyrgus antipodarum</w:t>
+      </w:r>
+      <w:r>
+        <w:rPr>
+          <w:rFonts w:ascii="Times New Roman" w:eastAsia="Times New Roman" w:hAnsi="Times New Roman" w:cs="Times New Roman"/>
+          <w:iCs/>
+          <w:sz w:val="24"/>
+          <w:szCs w:val="24"/>
+        </w:rPr>
+        <w:t>)</w:t>
+      </w:r>
+      <w:r>
+        <w:rPr>
+          <w:rFonts w:ascii="Times New Roman" w:eastAsia="Times New Roman" w:hAnsi="Times New Roman" w:cs="Times New Roman"/>
+          <w:iCs/>
+          <w:sz w:val="24"/>
+          <w:szCs w:val="24"/>
+        </w:rPr>
+        <w:t xml:space="preserve"> </w:t>
+      </w:r>
+      <w:r>
+        <w:rPr>
+          <w:rFonts w:ascii="Times New Roman" w:eastAsia="Times New Roman" w:hAnsi="Times New Roman" w:cs="Times New Roman"/>
+          <w:iCs/>
+          <w:sz w:val="24"/>
+          <w:szCs w:val="24"/>
+        </w:rPr>
+        <w:t xml:space="preserve">which had been compiled in Europe </w:t>
+      </w:r>
+      <w:r>
+        <w:rPr>
+          <w:rFonts w:ascii="Times New Roman" w:eastAsia="Times New Roman" w:hAnsi="Times New Roman" w:cs="Times New Roman"/>
+          <w:iCs/>
+          <w:sz w:val="24"/>
+          <w:szCs w:val="24"/>
+        </w:rPr>
+        <w:fldChar w:fldCharType="begin"/>
+      </w:r>
+      <w:r>
+        <w:rPr>
+          <w:rFonts w:ascii="Times New Roman" w:eastAsia="Times New Roman" w:hAnsi="Times New Roman" w:cs="Times New Roman"/>
+          <w:iCs/>
+          <w:sz w:val="24"/>
+          <w:szCs w:val="24"/>
+        </w:rPr>
+        <w:instrText xml:space="preserve"> ADDIN ZOTERO_ITEM CSL_CITATION {"citationID":"DFoe4TBG","properties":{"formattedCitation":"(Haubrock {\\i{}et al.} 2022)","plainCitation":"(Haubrock et al. 2022)","noteIndex":0},"citationItems":[{"id":90,"uris":["http://zotero.org/users/9972654/items/IPV6Z6PT"],"itemData":{"id":90,"type":"article-journal","abstract":"Globalization has led to the introduction of thousands of alien species worldwide. With growing impacts by invasive species, understanding the invasion process remains critical for predicting adverse effects and informing efficient management. Theoretically, invasion dynamics have been assumed to follow an “invasion curve” (S-­shaped curve of available area invaded over time), but this dynamic has lacked empirical testing using large-­scale data and neglects to consider invader abundances. We propose an “impact curve” describing the impacts generated by invasive species over time based on cumulative abundances. To test this curve's large-­scale applicability, we used the data-r­ ich New Zealand mud snail Potamopyrgus antipodarum, one of the most damaging freshwater invaders that has invaded almost all of Europe. Using long-­term (1979–­2020) abundance and environmental data collected across 306 European sites, we observed that P. antipodarum abundance generally increased through time, with slower population growth at higher latitudes and with lower runoff depth. Fifty-­nine percent of these populations followed the impact curve, characterized by first occurrence, exponential growth, then long-­term saturation. This behaviour is consistent with boom-­bust dynamics, as saturation occurs due to a rapid decline in abundance over time. Across sites, we estimated that impact peaked approximately two decades after first detection, but the rate of progression along the invasion process was influenced by local abiotic conditions. The S-­shaped impact curve may be common among many invasive species that undergo complex invasion dynamics. This provides a potentially unifying approach to advance understanding of large-­scale invasion dynamics and could inform timely management actions to mitigate impacts on ecosystems and economies.","container-title":"Global Change Biology","DOI":"10.1111/gcb.16207","ISSN":"1354-1013, 1365-2486","issue":"15","journalAbbreviation":"Global Change Biology","language":"en","page":"4620-4632","source":"DOI.org (Crossref)","title":"Invasion impacts and dynamics of a European‐wide introduced species","volume":"28","author":[{"family":"Haubrock","given":"Phillip J."},{"family":"Ahmed","given":"Danish A."},{"family":"Cuthbert","given":"Ross N."},{"family":"Stubbington","given":"Rachel"},{"family":"Domisch","given":"Sami"},{"family":"Marquez","given":"Jaime R. G."},{"family":"Beidas","given":"Ayah"},{"family":"Amatulli","given":"Giuseppe"},{"family":"Kiesel","given":"Jens"},{"family":"Shen","given":"Longzhu Q."},{"family":"Soto","given":"Ismael"},{"family":"Angeler","given":"David G."},{"family":"Bonada","given":"Núria"},{"family":"Cañedo‐Argüelles","given":"Miguel"},{"family":"Csabai","given":"Zoltán"},{"family":"Datry","given":"Thibault"},{"family":"Eyto","given":"Elvira","non-dropping-particle":"de"},{"family":"Dohet","given":"Alain"},{"family":"Drohan","given":"Emma"},{"family":"England","given":"Judy"},{"family":"Feio","given":"Maria J."},{"family":"Forio","given":"Marie A. E."},{"family":"Goethals","given":"Peter"},{"family":"Graf","given":"Wolfram"},{"family":"Heino","given":"Jani"},{"family":"Hudgins","given":"Emma J."},{"family":"Jähnig","given":"Sonja C."},{"family":"Johnson","given":"Richard K."},{"family":"Larrañaga","given":"Aitor"},{"family":"Leitner","given":"Patrick"},{"family":"L'Hoste","given":"Lionel"},{"family":"Lizee","given":"Marie‐Helene"},{"family":"Maire","given":"Anthony"},{"family":"Rasmussen","given":"Jes J."},{"family":"Schäfer","given":"Ralf B."},{"family":"Schmidt‐Kloiber","given":"Astrid"},{"family":"Vannevel","given":"Rudy"},{"family":"Várbíró","given":"Gábor"},{"family":"Wiberg‐Larsen","given":"Peter"},{"family":"Haase","given":"Peter"}],"issued":{"date-parts":[["2022",8]]}}}],"schema":"https://github.com/citation-style-language/schema/raw/master/csl-citation.json"} </w:instrText>
+      </w:r>
+      <w:r>
+        <w:rPr>
+          <w:rFonts w:ascii="Times New Roman" w:eastAsia="Times New Roman" w:hAnsi="Times New Roman" w:cs="Times New Roman"/>
+          <w:iCs/>
+          <w:sz w:val="24"/>
+          <w:szCs w:val="24"/>
+        </w:rPr>
+        <w:fldChar w:fldCharType="separate"/>
+      </w:r>
+      <w:r>
+        <w:rPr>
+          <w:rFonts w:ascii="Times New Roman" w:hAnsi="Times New Roman" w:cs="Times New Roman"/>
+          <w:sz w:val="24"/>
+        </w:rPr>
+        <w:t xml:space="preserve">(Haubrock </w:t>
+      </w:r>
+      <w:r>
+        <w:rPr>
+          <w:rFonts w:ascii="Times New Roman" w:hAnsi="Times New Roman" w:cs="Times New Roman"/>
           <w:i/>
-          <w:sz w:val="24"/>
-          <w:szCs w:val="24"/>
-        </w:rPr>
-        <w:t xml:space="preserve"> </w:t>
-      </w:r>
-      <w:proofErr w:type="spellStart"/>
-      <w:r>
-        <w:rPr>
-          <w:rFonts w:ascii="Times New Roman" w:eastAsia="Times New Roman" w:hAnsi="Times New Roman" w:cs="Times New Roman"/>
-          <w:i/>
-          <w:sz w:val="24"/>
-          <w:szCs w:val="24"/>
-        </w:rPr>
-        <w:t>antipodarum</w:t>
-      </w:r>
-      <w:proofErr w:type="spellEnd"/>
-      <w:r>
-        <w:rPr>
-          <w:rFonts w:ascii="Times New Roman" w:eastAsia="Times New Roman" w:hAnsi="Times New Roman" w:cs="Times New Roman"/>
-          <w:iCs/>
-          <w:sz w:val="24"/>
-          <w:szCs w:val="24"/>
-        </w:rPr>
-        <w:t>)</w:t>
-      </w:r>
-      <w:r>
-        <w:rPr>
-          <w:rFonts w:ascii="Times New Roman" w:eastAsia="Times New Roman" w:hAnsi="Times New Roman" w:cs="Times New Roman"/>
-          <w:iCs/>
-          <w:sz w:val="24"/>
-          <w:szCs w:val="24"/>
-        </w:rPr>
-        <w:t xml:space="preserve"> </w:t>
-      </w:r>
-      <w:r>
-        <w:rPr>
-          <w:rFonts w:ascii="Times New Roman" w:eastAsia="Times New Roman" w:hAnsi="Times New Roman" w:cs="Times New Roman"/>
-          <w:iCs/>
-          <w:sz w:val="24"/>
-          <w:szCs w:val="24"/>
-        </w:rPr>
-        <w:t xml:space="preserve">which had been compiled in Europe </w:t>
-      </w:r>
-      <w:r>
-        <w:rPr>
-          <w:rFonts w:ascii="Times New Roman" w:eastAsia="Times New Roman" w:hAnsi="Times New Roman" w:cs="Times New Roman"/>
-          <w:iCs/>
-          <w:sz w:val="24"/>
-          <w:szCs w:val="24"/>
-        </w:rPr>
-        <w:fldChar w:fldCharType="begin"/>
-      </w:r>
-      <w:r>
-        <w:rPr>
-          <w:rFonts w:ascii="Times New Roman" w:eastAsia="Times New Roman" w:hAnsi="Times New Roman" w:cs="Times New Roman"/>
-          <w:iCs/>
-          <w:sz w:val="24"/>
-          <w:szCs w:val="24"/>
-        </w:rPr>
-        <w:instrText xml:space="preserve"> ADDIN ZOTERO_ITEM CSL_CITATION {"citationID":"DFoe4TBG","properties":{"formattedCitation":"(Haubrock {\\i{}et al.} 2022)","plainCitation":"(Haubrock et al. 2022)","noteIndex":0},"citationItems":[{"id":90,"uris":["http://zotero.org/users/9972654/items/IPV6Z6PT"],"itemData":{"id":90,"type":"article-journal","abstract":"Globalization has led to the introduction of thousands of alien species worldwide. With growing impacts by invasive species, understanding the invasion process remains critical for predicting adverse effects and informing efficient management. Theoretically, invasion dynamics have been assumed to follow an “invasion curve” (S-­shaped curve of available area invaded over time), but this dynamic has lacked empirical testing using large-­scale data and neglects to consider invader abundances. We propose an “impact curve” describing the impacts generated by invasive species over time based on cumulative abundances. To test this curve's large-­scale applicability, we used the data-r­ ich New Zealand mud snail Potamopyrgus antipodarum, one of the most damaging freshwater invaders that has invaded almost all of Europe. Using long-­term (1979–­2020) abundance and environmental data collected across 306 European sites, we observed that P. antipodarum abundance generally increased through time, with slower population growth at higher latitudes and with lower runoff depth. Fifty-­nine percent of these populations followed the impact curve, characterized by first occurrence, exponential growth, then long-­term saturation. This behaviour is consistent with boom-­bust dynamics, as saturation occurs due to a rapid decline in abundance over time. Across sites, we estimated that impact peaked approximately two decades after first detection, but the rate of progression along the invasion process was influenced by local abiotic conditions. The S-­shaped impact curve may be common among many invasive species that undergo complex invasion dynamics. This provides a potentially unifying approach to advance understanding of large-­scale invasion dynamics and could inform timely management actions to mitigate impacts on ecosystems and economies.","container-title":"Global Change Biology","DOI":"10.1111/gcb.16207","ISSN":"1354-1013, 1365-2486","issue":"15","journalAbbreviation":"Global Change Biology","language":"en","page":"4620-4632","source":"DOI.org (Crossref)","title":"Invasion impacts and dynamics of a European‐wide introduced species","volume":"28","author":[{"family":"Haubrock","given":"Phillip J."},{"family":"Ahmed","given":"Danish A."},{"family":"Cuthbert","given":"Ross N."},{"family":"Stubbington","given":"Rachel"},{"family":"Domisch","given":"Sami"},{"family":"Marquez","given":"Jaime R. G."},{"family":"Beidas","given":"Ayah"},{"family":"Amatulli","given":"Giuseppe"},{"family":"Kiesel","given":"Jens"},{"family":"Shen","given":"Longzhu Q."},{"family":"Soto","given":"Ismael"},{"family":"Angeler","given":"David G."},{"family":"Bonada","given":"Núria"},{"family":"Cañedo‐Argüelles","given":"Miguel"},{"family":"Csabai","given":"Zoltán"},{"family":"Datry","given":"Thibault"},{"family":"Eyto","given":"Elvira","non-dropping-particle":"de"},{"family":"Dohet","given":"Alain"},{"family":"Drohan","given":"Emma"},{"family":"England","given":"Judy"},{"family":"Feio","given":"Maria J."},{"family":"Forio","given":"Marie A. E."},{"family":"Goethals","given":"Peter"},{"family":"Graf","given":"Wolfram"},{"family":"Heino","given":"Jani"},{"family":"Hudgins","given":"Emma J."},{"family":"Jähnig","given":"Sonja C."},{"family":"Johnson","given":"Richard K."},{"family":"Larrañaga","given":"Aitor"},{"family":"Leitner","given":"Patrick"},{"family":"L'Hoste","given":"Lionel"},{"family":"Lizee","given":"Marie‐Helene"},{"family":"Maire","given":"Anthony"},{"family":"Rasmussen","given":"Jes J."},{"family":"Schäfer","given":"Ralf B."},{"family":"Schmidt‐Kloiber","given":"Astrid"},{"family":"Vannevel","given":"Rudy"},{"family":"Várbíró","given":"Gábor"},{"family":"Wiberg‐Larsen","given":"Peter"},{"family":"Haase","given":"Peter"}],"issued":{"date-parts":[["2022",8]]}}}],"schema":"https://github.com/citation-style-language/schema/raw/master/csl-citation.json"} </w:instrText>
-      </w:r>
-      <w:r>
-        <w:rPr>
-          <w:rFonts w:ascii="Times New Roman" w:eastAsia="Times New Roman" w:hAnsi="Times New Roman" w:cs="Times New Roman"/>
-          <w:iCs/>
-          <w:sz w:val="24"/>
-          <w:szCs w:val="24"/>
-        </w:rPr>
-        <w:fldChar w:fldCharType="separate"/>
-      </w:r>
-      <w:r>
-        <w:rPr>
-          <w:rFonts w:ascii="Times New Roman" w:hAnsi="Times New Roman" w:cs="Times New Roman"/>
-          <w:sz w:val="24"/>
-        </w:rPr>
-        <w:t xml:space="preserve">(Haubrock </w:t>
-      </w:r>
-      <w:r>
-        <w:rPr>
-          <w:rFonts w:ascii="Times New Roman" w:hAnsi="Times New Roman" w:cs="Times New Roman"/>
-          <w:i/>
           <w:iCs/>
           <w:sz w:val="24"/>
         </w:rPr>
@@ -15012,27 +14467,7 @@
           <w:sz w:val="24"/>
           <w:szCs w:val="24"/>
         </w:rPr>
-        <w:t xml:space="preserve">categories that include New Zealand mud snails (i.e., Europe, Freshwater, </w:t>
-      </w:r>
-      <w:proofErr w:type="spellStart"/>
-      <w:r>
-        <w:rPr>
-          <w:rFonts w:ascii="Times New Roman" w:eastAsia="Times New Roman" w:hAnsi="Times New Roman" w:cs="Times New Roman"/>
-          <w:iCs/>
-          <w:sz w:val="24"/>
-          <w:szCs w:val="24"/>
-        </w:rPr>
-        <w:t>Gastropoda</w:t>
-      </w:r>
-      <w:proofErr w:type="spellEnd"/>
-      <w:r>
-        <w:rPr>
-          <w:rFonts w:ascii="Times New Roman" w:eastAsia="Times New Roman" w:hAnsi="Times New Roman" w:cs="Times New Roman"/>
-          <w:iCs/>
-          <w:sz w:val="24"/>
-          <w:szCs w:val="24"/>
-        </w:rPr>
-        <w:t xml:space="preserve">, and longevity &lt; 1 year) may be reflecting New Zealand mud snails rather than </w:t>
+        <w:t xml:space="preserve">categories that include New Zealand mud snails (i.e., Europe, Freshwater, Gastropoda, and longevity &lt; 1 year) may be reflecting New Zealand mud snails rather than </w:t>
       </w:r>
       <w:r>
         <w:rPr>
@@ -16262,7 +15697,6 @@
         </w:rPr>
         <w:t>Rusty Crayfish (</w:t>
       </w:r>
-      <w:proofErr w:type="spellStart"/>
       <w:r>
         <w:rPr>
           <w:rFonts w:ascii="Times New Roman" w:eastAsia="Times New Roman" w:hAnsi="Times New Roman" w:cs="Times New Roman"/>
@@ -16279,19 +15713,121 @@
           <w:sz w:val="24"/>
           <w:szCs w:val="24"/>
         </w:rPr>
-        <w:t>axonius</w:t>
-      </w:r>
-      <w:proofErr w:type="spellEnd"/>
-      <w:r>
-        <w:rPr>
-          <w:rFonts w:ascii="Times New Roman" w:eastAsia="Times New Roman" w:hAnsi="Times New Roman" w:cs="Times New Roman"/>
+        <w:t>axonius rusticus</w:t>
+      </w:r>
+      <w:r>
+        <w:rPr>
+          <w:rFonts w:ascii="Times New Roman" w:eastAsia="Times New Roman" w:hAnsi="Times New Roman" w:cs="Times New Roman"/>
+          <w:iCs/>
+          <w:sz w:val="24"/>
+          <w:szCs w:val="24"/>
+        </w:rPr>
+        <w:t>) were shown to experienced declines in 47% of 17 lakes in Wisconsin, USA</w:t>
+      </w:r>
+      <w:r>
+        <w:rPr>
+          <w:rFonts w:ascii="Times New Roman" w:eastAsia="Times New Roman" w:hAnsi="Times New Roman" w:cs="Times New Roman"/>
+          <w:iCs/>
+          <w:sz w:val="24"/>
+          <w:szCs w:val="24"/>
+        </w:rPr>
+        <w:t xml:space="preserve"> </w:t>
+      </w:r>
+      <w:r>
+        <w:rPr>
+          <w:rFonts w:ascii="Times New Roman" w:eastAsia="Times New Roman" w:hAnsi="Times New Roman" w:cs="Times New Roman"/>
+          <w:iCs/>
+          <w:sz w:val="24"/>
+          <w:szCs w:val="24"/>
+        </w:rPr>
+        <w:fldChar w:fldCharType="begin"/>
+      </w:r>
+      <w:r>
+        <w:rPr>
+          <w:rFonts w:ascii="Times New Roman" w:eastAsia="Times New Roman" w:hAnsi="Times New Roman" w:cs="Times New Roman"/>
+          <w:iCs/>
+          <w:sz w:val="24"/>
+          <w:szCs w:val="24"/>
+        </w:rPr>
+        <w:instrText xml:space="preserve"> ADDIN ZOTERO_ITEM CSL_CITATION {"citationID":"KOuwsCEP","properties":{"formattedCitation":"(Larson {\\i{}et al.} 2019)","plainCitation":"(Larson et al. 2019)","noteIndex":0},"citationItems":[{"id":1311,"uris":["http://zotero.org/users/9972654/items/FJ4Y6MBA"],"itemData":{"id":1311,"type":"article-journal","abstract":"Invasive nonindigenous species are defined by their impacts: they substantially change native communities or ecosystems. Accordingly, invasive species might transform their habitats in ways that eventually become unfavorable to them, causing population declines or even extirpations. Here we use over 40 yr of systematically collected data on the abundance of the invasive rusty crayfish Faxonius rusticus from 17 lakes in northern Wisconsin, USA to explore whether population declines of this invader are related to the prevalence of rocky habitat, which shelters crayfish from predators and is unchanged by crayfish. We predicted that lakes with rock-dominated substrates would be resistant to F. rusticus population declines, whereas lakes lacking rock-dominated substrates would experience F. rusticus declines due to crayfish destruction of shelter-providing macrophytes. We found that in nearly one-half (47%) of the study lakes, F. rusticus experienced population declines over the study time period, and these lakes had significantly lower proportions of rock substrate than lakes that did not experience population declines. We recommend that more studies should investigate the potential for invasive species-mediated community or ecosystem feedbacks to eventually contribute to their own population declines.","container-title":"Ecology","DOI":"10.1002/ecy.2659","ISSN":"0012-9658, 1939-9170","issue":"5","journalAbbreviation":"Ecology","language":"en","page":"e02659","source":"DOI.org (Crossref)","title":"Habitat explains patterns of population decline for an invasive crayfish","volume":"100","author":[{"family":"Larson","given":"Eric R."},{"family":"Kreps","given":"Timothy A."},{"family":"Peters","given":"Brett"},{"family":"Peters","given":"Jody A."},{"family":"Lodge","given":"David M."}],"issued":{"date-parts":[["2019",5]]}}}],"schema":"https://github.com/citation-style-language/schema/raw/master/csl-citation.json"} </w:instrText>
+      </w:r>
+      <w:r>
+        <w:rPr>
+          <w:rFonts w:ascii="Times New Roman" w:eastAsia="Times New Roman" w:hAnsi="Times New Roman" w:cs="Times New Roman"/>
+          <w:iCs/>
+          <w:sz w:val="24"/>
+          <w:szCs w:val="24"/>
+        </w:rPr>
+        <w:fldChar w:fldCharType="separate"/>
+      </w:r>
+      <w:r>
+        <w:rPr>
+          <w:rFonts w:ascii="Times New Roman" w:hAnsi="Times New Roman" w:cs="Times New Roman"/>
+          <w:sz w:val="24"/>
+        </w:rPr>
+        <w:t xml:space="preserve">(Larson </w:t>
+      </w:r>
+      <w:r>
+        <w:rPr>
+          <w:rFonts w:ascii="Times New Roman" w:hAnsi="Times New Roman" w:cs="Times New Roman"/>
           <w:i/>
+          <w:iCs/>
+          <w:sz w:val="24"/>
+        </w:rPr>
+        <w:t>et al.</w:t>
+      </w:r>
+      <w:r>
+        <w:rPr>
+          <w:rFonts w:ascii="Times New Roman" w:hAnsi="Times New Roman" w:cs="Times New Roman"/>
+          <w:sz w:val="24"/>
+        </w:rPr>
+        <w:t xml:space="preserve"> 2019)</w:t>
+      </w:r>
+      <w:r>
+        <w:rPr>
+          <w:rFonts w:ascii="Times New Roman" w:eastAsia="Times New Roman" w:hAnsi="Times New Roman" w:cs="Times New Roman"/>
+          <w:iCs/>
+          <w:sz w:val="24"/>
+          <w:szCs w:val="24"/>
+        </w:rPr>
+        <w:fldChar w:fldCharType="end"/>
+      </w:r>
+      <w:r>
+        <w:rPr>
+          <w:rFonts w:ascii="Times New Roman" w:eastAsia="Times New Roman" w:hAnsi="Times New Roman" w:cs="Times New Roman"/>
+          <w:iCs/>
+          <w:sz w:val="24"/>
+          <w:szCs w:val="24"/>
+        </w:rPr>
+        <w:t xml:space="preserve">, </w:t>
+      </w:r>
+      <w:r>
+        <w:rPr>
+          <w:rFonts w:ascii="Times New Roman" w:eastAsia="Times New Roman" w:hAnsi="Times New Roman" w:cs="Times New Roman"/>
+          <w:iCs/>
+          <w:sz w:val="24"/>
+          <w:szCs w:val="24"/>
+        </w:rPr>
+        <w:t>Signal Crayfish</w:t>
+      </w:r>
+      <w:r>
+        <w:rPr>
+          <w:rFonts w:ascii="Times New Roman" w:eastAsia="Times New Roman" w:hAnsi="Times New Roman" w:cs="Times New Roman"/>
+          <w:iCs/>
           <w:sz w:val="24"/>
           <w:szCs w:val="24"/>
         </w:rPr>
         <w:t xml:space="preserve"> </w:t>
       </w:r>
-      <w:proofErr w:type="spellStart"/>
+      <w:r>
+        <w:rPr>
+          <w:rFonts w:ascii="Times New Roman" w:eastAsia="Times New Roman" w:hAnsi="Times New Roman" w:cs="Times New Roman"/>
+          <w:iCs/>
+          <w:sz w:val="24"/>
+          <w:szCs w:val="24"/>
+        </w:rPr>
+        <w:t>(</w:t>
+      </w:r>
       <w:r>
         <w:rPr>
           <w:rFonts w:ascii="Times New Roman" w:eastAsia="Times New Roman" w:hAnsi="Times New Roman" w:cs="Times New Roman"/>
@@ -16299,153 +15835,8 @@
           <w:sz w:val="24"/>
           <w:szCs w:val="24"/>
         </w:rPr>
-        <w:t>rusticus</w:t>
-      </w:r>
-      <w:proofErr w:type="spellEnd"/>
-      <w:r>
-        <w:rPr>
-          <w:rFonts w:ascii="Times New Roman" w:eastAsia="Times New Roman" w:hAnsi="Times New Roman" w:cs="Times New Roman"/>
-          <w:iCs/>
-          <w:sz w:val="24"/>
-          <w:szCs w:val="24"/>
-        </w:rPr>
-        <w:t>) were shown to experienced declines in 47% of 17 lakes in Wisconsin, USA</w:t>
-      </w:r>
-      <w:r>
-        <w:rPr>
-          <w:rFonts w:ascii="Times New Roman" w:eastAsia="Times New Roman" w:hAnsi="Times New Roman" w:cs="Times New Roman"/>
-          <w:iCs/>
-          <w:sz w:val="24"/>
-          <w:szCs w:val="24"/>
-        </w:rPr>
-        <w:t xml:space="preserve"> </w:t>
-      </w:r>
-      <w:r>
-        <w:rPr>
-          <w:rFonts w:ascii="Times New Roman" w:eastAsia="Times New Roman" w:hAnsi="Times New Roman" w:cs="Times New Roman"/>
-          <w:iCs/>
-          <w:sz w:val="24"/>
-          <w:szCs w:val="24"/>
-        </w:rPr>
-        <w:fldChar w:fldCharType="begin"/>
-      </w:r>
-      <w:r>
-        <w:rPr>
-          <w:rFonts w:ascii="Times New Roman" w:eastAsia="Times New Roman" w:hAnsi="Times New Roman" w:cs="Times New Roman"/>
-          <w:iCs/>
-          <w:sz w:val="24"/>
-          <w:szCs w:val="24"/>
-        </w:rPr>
-        <w:instrText xml:space="preserve"> ADDIN ZOTERO_ITEM CSL_CITATION {"citationID":"KOuwsCEP","properties":{"formattedCitation":"(Larson {\\i{}et al.} 2019)","plainCitation":"(Larson et al. 2019)","noteIndex":0},"citationItems":[{"id":1311,"uris":["http://zotero.org/users/9972654/items/FJ4Y6MBA"],"itemData":{"id":1311,"type":"article-journal","abstract":"Invasive nonindigenous species are defined by their impacts: they substantially change native communities or ecosystems. Accordingly, invasive species might transform their habitats in ways that eventually become unfavorable to them, causing population declines or even extirpations. Here we use over 40 yr of systematically collected data on the abundance of the invasive rusty crayfish Faxonius rusticus from 17 lakes in northern Wisconsin, USA to explore whether population declines of this invader are related to the prevalence of rocky habitat, which shelters crayfish from predators and is unchanged by crayfish. We predicted that lakes with rock-dominated substrates would be resistant to F. rusticus population declines, whereas lakes lacking rock-dominated substrates would experience F. rusticus declines due to crayfish destruction of shelter-providing macrophytes. We found that in nearly one-half (47%) of the study lakes, F. rusticus experienced population declines over the study time period, and these lakes had significantly lower proportions of rock substrate than lakes that did not experience population declines. We recommend that more studies should investigate the potential for invasive species-mediated community or ecosystem feedbacks to eventually contribute to their own population declines.","container-title":"Ecology","DOI":"10.1002/ecy.2659","ISSN":"0012-9658, 1939-9170","issue":"5","journalAbbreviation":"Ecology","language":"en","page":"e02659","source":"DOI.org (Crossref)","title":"Habitat explains patterns of population decline for an invasive crayfish","volume":"100","author":[{"family":"Larson","given":"Eric R."},{"family":"Kreps","given":"Timothy A."},{"family":"Peters","given":"Brett"},{"family":"Peters","given":"Jody A."},{"family":"Lodge","given":"David M."}],"issued":{"date-parts":[["2019",5]]}}}],"schema":"https://github.com/citation-style-language/schema/raw/master/csl-citation.json"} </w:instrText>
-      </w:r>
-      <w:r>
-        <w:rPr>
-          <w:rFonts w:ascii="Times New Roman" w:eastAsia="Times New Roman" w:hAnsi="Times New Roman" w:cs="Times New Roman"/>
-          <w:iCs/>
-          <w:sz w:val="24"/>
-          <w:szCs w:val="24"/>
-        </w:rPr>
-        <w:fldChar w:fldCharType="separate"/>
-      </w:r>
-      <w:r>
-        <w:rPr>
-          <w:rFonts w:ascii="Times New Roman" w:hAnsi="Times New Roman" w:cs="Times New Roman"/>
-          <w:sz w:val="24"/>
-        </w:rPr>
-        <w:t xml:space="preserve">(Larson </w:t>
-      </w:r>
-      <w:r>
-        <w:rPr>
-          <w:rFonts w:ascii="Times New Roman" w:hAnsi="Times New Roman" w:cs="Times New Roman"/>
-          <w:i/>
-          <w:iCs/>
-          <w:sz w:val="24"/>
-        </w:rPr>
-        <w:t>et al.</w:t>
-      </w:r>
-      <w:r>
-        <w:rPr>
-          <w:rFonts w:ascii="Times New Roman" w:hAnsi="Times New Roman" w:cs="Times New Roman"/>
-          <w:sz w:val="24"/>
-        </w:rPr>
-        <w:t xml:space="preserve"> 2019)</w:t>
-      </w:r>
-      <w:r>
-        <w:rPr>
-          <w:rFonts w:ascii="Times New Roman" w:eastAsia="Times New Roman" w:hAnsi="Times New Roman" w:cs="Times New Roman"/>
-          <w:iCs/>
-          <w:sz w:val="24"/>
-          <w:szCs w:val="24"/>
-        </w:rPr>
-        <w:fldChar w:fldCharType="end"/>
-      </w:r>
-      <w:r>
-        <w:rPr>
-          <w:rFonts w:ascii="Times New Roman" w:eastAsia="Times New Roman" w:hAnsi="Times New Roman" w:cs="Times New Roman"/>
-          <w:iCs/>
-          <w:sz w:val="24"/>
-          <w:szCs w:val="24"/>
-        </w:rPr>
-        <w:t xml:space="preserve">, </w:t>
-      </w:r>
-      <w:r>
-        <w:rPr>
-          <w:rFonts w:ascii="Times New Roman" w:eastAsia="Times New Roman" w:hAnsi="Times New Roman" w:cs="Times New Roman"/>
-          <w:iCs/>
-          <w:sz w:val="24"/>
-          <w:szCs w:val="24"/>
-        </w:rPr>
-        <w:t>Signal Crayfish</w:t>
-      </w:r>
-      <w:r>
-        <w:rPr>
-          <w:rFonts w:ascii="Times New Roman" w:eastAsia="Times New Roman" w:hAnsi="Times New Roman" w:cs="Times New Roman"/>
-          <w:iCs/>
-          <w:sz w:val="24"/>
-          <w:szCs w:val="24"/>
-        </w:rPr>
-        <w:t xml:space="preserve"> </w:t>
-      </w:r>
-      <w:r>
-        <w:rPr>
-          <w:rFonts w:ascii="Times New Roman" w:eastAsia="Times New Roman" w:hAnsi="Times New Roman" w:cs="Times New Roman"/>
-          <w:iCs/>
-          <w:sz w:val="24"/>
-          <w:szCs w:val="24"/>
-        </w:rPr>
-        <w:t>(</w:t>
-      </w:r>
-      <w:proofErr w:type="spellStart"/>
-      <w:r>
-        <w:rPr>
-          <w:rFonts w:ascii="Times New Roman" w:eastAsia="Times New Roman" w:hAnsi="Times New Roman" w:cs="Times New Roman"/>
-          <w:i/>
-          <w:sz w:val="24"/>
-          <w:szCs w:val="24"/>
-        </w:rPr>
-        <w:t>Pacifastacus</w:t>
-      </w:r>
-      <w:proofErr w:type="spellEnd"/>
-      <w:r>
-        <w:rPr>
-          <w:rFonts w:ascii="Times New Roman" w:eastAsia="Times New Roman" w:hAnsi="Times New Roman" w:cs="Times New Roman"/>
-          <w:i/>
-          <w:sz w:val="24"/>
-          <w:szCs w:val="24"/>
-        </w:rPr>
-        <w:t xml:space="preserve"> </w:t>
-      </w:r>
-      <w:proofErr w:type="spellStart"/>
-      <w:r>
-        <w:rPr>
-          <w:rFonts w:ascii="Times New Roman" w:eastAsia="Times New Roman" w:hAnsi="Times New Roman" w:cs="Times New Roman"/>
-          <w:i/>
-          <w:sz w:val="24"/>
-          <w:szCs w:val="24"/>
-        </w:rPr>
-        <w:t>leniusculus</w:t>
-      </w:r>
-      <w:proofErr w:type="spellEnd"/>
+        <w:t>Pacifastacus leniusculus</w:t>
+      </w:r>
       <w:r>
         <w:rPr>
           <w:rFonts w:ascii="Times New Roman" w:eastAsia="Times New Roman" w:hAnsi="Times New Roman" w:cs="Times New Roman"/>
@@ -18114,27 +17505,7 @@
           <w:sz w:val="24"/>
           <w:szCs w:val="24"/>
         </w:rPr>
-        <w:t>boom-</w:t>
-      </w:r>
-      <w:proofErr w:type="gramStart"/>
-      <w:r>
-        <w:rPr>
-          <w:rFonts w:ascii="Times New Roman" w:eastAsia="Times New Roman" w:hAnsi="Times New Roman" w:cs="Times New Roman"/>
-          <w:i/>
-          <w:sz w:val="24"/>
-          <w:szCs w:val="24"/>
-        </w:rPr>
-        <w:t>busts</w:t>
-      </w:r>
-      <w:proofErr w:type="gramEnd"/>
-      <w:r>
-        <w:rPr>
-          <w:rFonts w:ascii="Times New Roman" w:eastAsia="Times New Roman" w:hAnsi="Times New Roman" w:cs="Times New Roman"/>
-          <w:i/>
-          <w:sz w:val="24"/>
-          <w:szCs w:val="24"/>
-        </w:rPr>
-        <w:t>?</w:t>
+        <w:t>boom-busts?</w:t>
       </w:r>
     </w:p>
     <w:p>
@@ -19017,23 +18388,13 @@
         </w:rPr>
         <w:t xml:space="preserve"> </w:t>
       </w:r>
-      <w:proofErr w:type="gramStart"/>
-      <w:r>
-        <w:rPr>
-          <w:rFonts w:ascii="Times New Roman" w:eastAsia="Times New Roman" w:hAnsi="Times New Roman" w:cs="Times New Roman"/>
-          <w:sz w:val="24"/>
-          <w:szCs w:val="24"/>
-        </w:rPr>
-        <w:t>Similar to</w:t>
-      </w:r>
-      <w:proofErr w:type="gramEnd"/>
-      <w:r>
-        <w:rPr>
-          <w:rFonts w:ascii="Times New Roman" w:eastAsia="Times New Roman" w:hAnsi="Times New Roman" w:cs="Times New Roman"/>
-          <w:sz w:val="24"/>
-          <w:szCs w:val="24"/>
-        </w:rPr>
-        <w:t xml:space="preserve"> this mechanism, if the thermal condition (or other environmental driver) in an introduced environment is at or near the species threshold of tolerance, then inter annual variation in thermal conditions could produce irruptive dynamics. In </w:t>
+      <w:r>
+        <w:rPr>
+          <w:rFonts w:ascii="Times New Roman" w:eastAsia="Times New Roman" w:hAnsi="Times New Roman" w:cs="Times New Roman"/>
+          <w:sz w:val="24"/>
+          <w:szCs w:val="24"/>
+        </w:rPr>
+        <w:t xml:space="preserve">Similar to this mechanism, if the thermal condition (or other environmental driver) in an introduced environment is at or near the species threshold of tolerance, then inter annual variation in thermal conditions could produce irruptive dynamics. In </w:t>
       </w:r>
       <w:r>
         <w:rPr>
@@ -19545,25 +18906,7 @@
           <w:sz w:val="24"/>
           <w:szCs w:val="24"/>
         </w:rPr>
-        <w:t xml:space="preserve"> repeat at regular intervals rather than stochastically like population </w:t>
-      </w:r>
-      <w:proofErr w:type="gramStart"/>
-      <w:r>
-        <w:rPr>
-          <w:rFonts w:ascii="Times New Roman" w:eastAsia="Times New Roman" w:hAnsi="Times New Roman" w:cs="Times New Roman"/>
-          <w:sz w:val="24"/>
-          <w:szCs w:val="24"/>
-        </w:rPr>
-        <w:t>irruptions</w:t>
-      </w:r>
-      <w:proofErr w:type="gramEnd"/>
-      <w:r>
-        <w:rPr>
-          <w:rFonts w:ascii="Times New Roman" w:eastAsia="Times New Roman" w:hAnsi="Times New Roman" w:cs="Times New Roman"/>
-          <w:sz w:val="24"/>
-          <w:szCs w:val="24"/>
-        </w:rPr>
-        <w:t xml:space="preserve">. In this case, </w:t>
+        <w:t xml:space="preserve"> repeat at regular intervals rather than stochastically like population irruptions. In this case, </w:t>
       </w:r>
       <w:r>
         <w:rPr>
@@ -21309,27 +20652,7 @@
           <w:sz w:val="24"/>
           <w:szCs w:val="24"/>
         </w:rPr>
-        <w:t xml:space="preserve">summary of the mechanisms and grouped by their strength of evidence of boom-busts as presented by the papers that had </w:t>
-      </w:r>
-      <w:proofErr w:type="gramStart"/>
-      <w:r>
-        <w:rPr>
-          <w:rFonts w:ascii="Times New Roman" w:eastAsia="Times New Roman" w:hAnsi="Times New Roman" w:cs="Times New Roman"/>
-          <w:bCs/>
-          <w:sz w:val="24"/>
-          <w:szCs w:val="24"/>
-        </w:rPr>
-        <w:t>timeseries</w:t>
-      </w:r>
-      <w:proofErr w:type="gramEnd"/>
-      <w:r>
-        <w:rPr>
-          <w:rFonts w:ascii="Times New Roman" w:eastAsia="Times New Roman" w:hAnsi="Times New Roman" w:cs="Times New Roman"/>
-          <w:bCs/>
-          <w:sz w:val="24"/>
-          <w:szCs w:val="24"/>
-        </w:rPr>
-        <w:t xml:space="preserve"> documenting boom-busts. The strength of evidence was evaluated using a predefined rubric </w:t>
+        <w:t xml:space="preserve">summary of the mechanisms and grouped by their strength of evidence of boom-busts as presented by the papers that had timeseries documenting boom-busts. The strength of evidence was evaluated using a predefined rubric </w:t>
       </w:r>
       <w:commentRangeStart w:id="9"/>
       <w:r>
@@ -24509,9 +23832,105 @@
           <w:sz w:val="24"/>
           <w:szCs w:val="24"/>
         </w:rPr>
-        <w:t xml:space="preserve">Sargassum </w:t>
-      </w:r>
-      <w:proofErr w:type="spellStart"/>
+        <w:t>Sargassum muticum</w:t>
+      </w:r>
+      <w:r>
+        <w:rPr>
+          <w:rFonts w:ascii="Times New Roman" w:eastAsia="Times New Roman" w:hAnsi="Times New Roman" w:cs="Times New Roman"/>
+          <w:bCs/>
+          <w:sz w:val="24"/>
+          <w:szCs w:val="24"/>
+        </w:rPr>
+        <w:t xml:space="preserve"> </w:t>
+      </w:r>
+      <w:r>
+        <w:rPr>
+          <w:rFonts w:ascii="Times New Roman" w:eastAsia="Times New Roman" w:hAnsi="Times New Roman" w:cs="Times New Roman"/>
+          <w:bCs/>
+          <w:sz w:val="24"/>
+          <w:szCs w:val="24"/>
+        </w:rPr>
+        <w:t xml:space="preserve">biomass </w:t>
+      </w:r>
+      <w:r>
+        <w:rPr>
+          <w:rFonts w:ascii="Times New Roman" w:eastAsia="Times New Roman" w:hAnsi="Times New Roman" w:cs="Times New Roman"/>
+          <w:bCs/>
+          <w:sz w:val="24"/>
+          <w:szCs w:val="24"/>
+        </w:rPr>
+        <w:t>in Spain</w:t>
+      </w:r>
+      <w:r>
+        <w:rPr>
+          <w:rFonts w:ascii="Times New Roman" w:eastAsia="Times New Roman" w:hAnsi="Times New Roman" w:cs="Times New Roman"/>
+          <w:bCs/>
+          <w:sz w:val="24"/>
+          <w:szCs w:val="24"/>
+        </w:rPr>
+        <w:t xml:space="preserve"> that was classified as a Boom-Bust </w:t>
+      </w:r>
+      <w:r>
+        <w:rPr>
+          <w:rFonts w:ascii="Times New Roman" w:eastAsia="Times New Roman" w:hAnsi="Times New Roman" w:cs="Times New Roman"/>
+          <w:bCs/>
+          <w:sz w:val="24"/>
+          <w:szCs w:val="24"/>
+        </w:rPr>
+        <w:fldChar w:fldCharType="begin"/>
+      </w:r>
+      <w:r>
+        <w:rPr>
+          <w:rFonts w:ascii="Times New Roman" w:eastAsia="Times New Roman" w:hAnsi="Times New Roman" w:cs="Times New Roman"/>
+          <w:bCs/>
+          <w:sz w:val="24"/>
+          <w:szCs w:val="24"/>
+        </w:rPr>
+        <w:instrText xml:space="preserve"> ADDIN ZOTERO_ITEM CSL_CITATION {"citationID":"OfocdJHL","properties":{"formattedCitation":"(Fern\\uc0\\u225{}ndez 2020)","plainCitation":"(Fernández 2020)","noteIndex":0},"citationItems":[{"id":60,"uris":["http://zotero.org/users/9972654/items/D98GJARG"],"itemData":{"id":60,"type":"article-journal","abstract":"The brown seaweed Sargassum muticum is one of the best-studied invasive marine species, although most studies are shortterm and focus on the expansion phase of invasion. Here I report 30 years of observations of the invasion of the north coast of Spain by S. muticum at regional (400 km coastline) and local scales (at the site where the invasion was first detected). At the local scale, this long-term series reveals a ‘boom-bust’ process where the expansion (‘boom’) phase lasted 12 years and the decline (‘bust’) was completed in 8 years. This cycle is supported by evidence at the regional scale. The impact of S. muticum on the recipient assemblages was only moderate during the initial ‘boom’ phase of the invasion and negligible afterwards. In conclusion, 30 years after its first observation in the region, Sargassum muticum can be considered an addition to the algal flora rather than a threat to the native assemblages.","container-title":"European Journal of Phycology","DOI":"10.1080/09670262.2020.1715489","ISSN":"0967-0262, 1469-4433","issue":"3","journalAbbreviation":"European Journal of Phycology","language":"en","page":"285-295","source":"DOI.org (Crossref)","title":"Boom-bust of &lt;i&gt;Sargassum muticum&lt;/i&gt; in northern Spain: 30 years of invasion","title-short":"Boom-bust of &lt;i&gt;Sargassum muticum&lt;/i&gt; in northern Spain","volume":"55","author":[{"family":"Fernández","given":"C."}],"issued":{"date-parts":[["2020",7,2]]}}}],"schema":"https://github.com/citation-style-language/schema/raw/master/csl-citation.json"} </w:instrText>
+      </w:r>
+      <w:r>
+        <w:rPr>
+          <w:rFonts w:ascii="Times New Roman" w:eastAsia="Times New Roman" w:hAnsi="Times New Roman" w:cs="Times New Roman"/>
+          <w:bCs/>
+          <w:sz w:val="24"/>
+          <w:szCs w:val="24"/>
+        </w:rPr>
+        <w:fldChar w:fldCharType="separate"/>
+      </w:r>
+      <w:r>
+        <w:rPr>
+          <w:rFonts w:ascii="Times New Roman" w:hAnsi="Times New Roman" w:cs="Times New Roman"/>
+          <w:sz w:val="24"/>
+        </w:rPr>
+        <w:t>(Fernández 2020)</w:t>
+      </w:r>
+      <w:r>
+        <w:rPr>
+          <w:rFonts w:ascii="Times New Roman" w:eastAsia="Times New Roman" w:hAnsi="Times New Roman" w:cs="Times New Roman"/>
+          <w:bCs/>
+          <w:sz w:val="24"/>
+          <w:szCs w:val="24"/>
+        </w:rPr>
+        <w:fldChar w:fldCharType="end"/>
+      </w:r>
+      <w:r>
+        <w:rPr>
+          <w:rFonts w:ascii="Times New Roman" w:eastAsia="Times New Roman" w:hAnsi="Times New Roman" w:cs="Times New Roman"/>
+          <w:bCs/>
+          <w:sz w:val="24"/>
+          <w:szCs w:val="24"/>
+        </w:rPr>
+        <w:t xml:space="preserve">, B) </w:t>
+      </w:r>
+      <w:r>
+        <w:rPr>
+          <w:rFonts w:ascii="Times New Roman" w:eastAsia="Times New Roman" w:hAnsi="Times New Roman" w:cs="Times New Roman"/>
+          <w:bCs/>
+          <w:sz w:val="24"/>
+          <w:szCs w:val="24"/>
+        </w:rPr>
+        <w:t>Signal Crayfish (</w:t>
+      </w:r>
       <w:r>
         <w:rPr>
           <w:rFonts w:ascii="Times New Roman" w:eastAsia="Times New Roman" w:hAnsi="Times New Roman" w:cs="Times New Roman"/>
@@ -24521,9 +23940,8 @@
           <w:sz w:val="24"/>
           <w:szCs w:val="24"/>
         </w:rPr>
-        <w:t>muticum</w:t>
-      </w:r>
-      <w:proofErr w:type="spellEnd"/>
+        <w:t>Pacifastacus leniusculus</w:t>
+      </w:r>
       <w:r>
         <w:rPr>
           <w:rFonts w:ascii="Times New Roman" w:eastAsia="Times New Roman" w:hAnsi="Times New Roman" w:cs="Times New Roman"/>
@@ -24531,7 +23949,7 @@
           <w:sz w:val="24"/>
           <w:szCs w:val="24"/>
         </w:rPr>
-        <w:t xml:space="preserve"> </w:t>
+        <w:t xml:space="preserve">) catch per unit effort (CPUE) </w:t>
       </w:r>
       <w:r>
         <w:rPr>
@@ -24540,7 +23958,7 @@
           <w:sz w:val="24"/>
           <w:szCs w:val="24"/>
         </w:rPr>
-        <w:t xml:space="preserve">biomass </w:t>
+        <w:t xml:space="preserve">in a Swedish Lake </w:t>
       </w:r>
       <w:r>
         <w:rPr>
@@ -24549,7 +23967,7 @@
           <w:sz w:val="24"/>
           <w:szCs w:val="24"/>
         </w:rPr>
-        <w:t>in Spain</w:t>
+        <w:t xml:space="preserve">that was classified as Boom-Bust Sustained Unknown </w:t>
       </w:r>
       <w:r>
         <w:rPr>
@@ -24558,7 +23976,7 @@
           <w:sz w:val="24"/>
           <w:szCs w:val="24"/>
         </w:rPr>
-        <w:t xml:space="preserve"> that was classified as a Boom-Bust </w:t>
+        <w:fldChar w:fldCharType="begin"/>
       </w:r>
       <w:r>
         <w:rPr>
@@ -24567,7 +23985,7 @@
           <w:sz w:val="24"/>
           <w:szCs w:val="24"/>
         </w:rPr>
-        <w:fldChar w:fldCharType="begin"/>
+        <w:instrText xml:space="preserve"> ADDIN ZOTERO_ITEM CSL_CITATION {"citationID":"EJ4lp6Xf","properties":{"formattedCitation":"(Sandstr\\uc0\\u246{}m {\\i{}et al.} 2014)","plainCitation":"(Sandström et al. 2014)","noteIndex":0},"citationItems":[{"id":199,"uris":["http://zotero.org/users/9972654/items/VFU2AJ2S"],"itemData":{"id":199,"type":"article-journal","container-title":"Biological Invasions","DOI":"10.1007/s10530-014-0641-1","ISSN":"1387-3547, 1573-1464","issue":"9","journalAbbreviation":"Biol Invasions","language":"en","page":"1961-1977","source":"DOI.org (Crossref)","title":"Population collapses in introduced non-indigenous crayfish","volume":"16","author":[{"family":"Sandström","given":"Alfred"},{"family":"Andersson","given":"Magnus"},{"family":"Asp","given":"Anders"},{"family":"Bohman","given":"Patrik"},{"family":"Edsman","given":"Lennart"},{"family":"Engdahl","given":"Fredrik"},{"family":"Nyström","given":"Per"},{"family":"Stenberg","given":"Marika"},{"family":"Hertonsson","given":"Pia"},{"family":"Vrålstad","given":"Trude"},{"family":"Granèli","given":"Wilhelm"}],"issued":{"date-parts":[["2014",9]]}}}],"schema":"https://github.com/citation-style-language/schema/raw/master/csl-citation.json"} </w:instrText>
       </w:r>
       <w:r>
         <w:rPr>
@@ -24576,7 +23994,30 @@
           <w:sz w:val="24"/>
           <w:szCs w:val="24"/>
         </w:rPr>
-        <w:instrText xml:space="preserve"> ADDIN ZOTERO_ITEM CSL_CITATION {"citationID":"OfocdJHL","properties":{"formattedCitation":"(Fern\\uc0\\u225{}ndez 2020)","plainCitation":"(Fernández 2020)","noteIndex":0},"citationItems":[{"id":60,"uris":["http://zotero.org/users/9972654/items/D98GJARG"],"itemData":{"id":60,"type":"article-journal","abstract":"The brown seaweed Sargassum muticum is one of the best-studied invasive marine species, although most studies are shortterm and focus on the expansion phase of invasion. Here I report 30 years of observations of the invasion of the north coast of Spain by S. muticum at regional (400 km coastline) and local scales (at the site where the invasion was first detected). At the local scale, this long-term series reveals a ‘boom-bust’ process where the expansion (‘boom’) phase lasted 12 years and the decline (‘bust’) was completed in 8 years. This cycle is supported by evidence at the regional scale. The impact of S. muticum on the recipient assemblages was only moderate during the initial ‘boom’ phase of the invasion and negligible afterwards. In conclusion, 30 years after its first observation in the region, Sargassum muticum can be considered an addition to the algal flora rather than a threat to the native assemblages.","container-title":"European Journal of Phycology","DOI":"10.1080/09670262.2020.1715489","ISSN":"0967-0262, 1469-4433","issue":"3","journalAbbreviation":"European Journal of Phycology","language":"en","page":"285-295","source":"DOI.org (Crossref)","title":"Boom-bust of &lt;i&gt;Sargassum muticum&lt;/i&gt; in northern Spain: 30 years of invasion","title-short":"Boom-bust of &lt;i&gt;Sargassum muticum&lt;/i&gt; in northern Spain","volume":"55","author":[{"family":"Fernández","given":"C."}],"issued":{"date-parts":[["2020",7,2]]}}}],"schema":"https://github.com/citation-style-language/schema/raw/master/csl-citation.json"} </w:instrText>
+        <w:fldChar w:fldCharType="separate"/>
+      </w:r>
+      <w:r>
+        <w:rPr>
+          <w:rFonts w:ascii="Times New Roman" w:hAnsi="Times New Roman" w:cs="Times New Roman"/>
+          <w:sz w:val="24"/>
+        </w:rPr>
+        <w:t xml:space="preserve">(Sandström </w:t>
+      </w:r>
+      <w:r>
+        <w:rPr>
+          <w:rFonts w:ascii="Times New Roman" w:hAnsi="Times New Roman" w:cs="Times New Roman"/>
+          <w:i/>
+          <w:iCs/>
+          <w:sz w:val="24"/>
+        </w:rPr>
+        <w:t>et al.</w:t>
+      </w:r>
+      <w:r>
+        <w:rPr>
+          <w:rFonts w:ascii="Times New Roman" w:hAnsi="Times New Roman" w:cs="Times New Roman"/>
+          <w:sz w:val="24"/>
+        </w:rPr>
+        <w:t xml:space="preserve"> 2014)</w:t>
       </w:r>
       <w:r>
         <w:rPr>
@@ -24585,14 +24026,7 @@
           <w:sz w:val="24"/>
           <w:szCs w:val="24"/>
         </w:rPr>
-        <w:fldChar w:fldCharType="separate"/>
-      </w:r>
-      <w:r>
-        <w:rPr>
-          <w:rFonts w:ascii="Times New Roman" w:hAnsi="Times New Roman" w:cs="Times New Roman"/>
-          <w:sz w:val="24"/>
-        </w:rPr>
-        <w:t>(Fernández 2020)</w:t>
+        <w:fldChar w:fldCharType="end"/>
       </w:r>
       <w:r>
         <w:rPr>
@@ -24601,27 +24035,8 @@
           <w:sz w:val="24"/>
           <w:szCs w:val="24"/>
         </w:rPr>
-        <w:fldChar w:fldCharType="end"/>
-      </w:r>
-      <w:r>
-        <w:rPr>
-          <w:rFonts w:ascii="Times New Roman" w:eastAsia="Times New Roman" w:hAnsi="Times New Roman" w:cs="Times New Roman"/>
-          <w:bCs/>
-          <w:sz w:val="24"/>
-          <w:szCs w:val="24"/>
-        </w:rPr>
-        <w:t xml:space="preserve">, B) </w:t>
-      </w:r>
-      <w:r>
-        <w:rPr>
-          <w:rFonts w:ascii="Times New Roman" w:eastAsia="Times New Roman" w:hAnsi="Times New Roman" w:cs="Times New Roman"/>
-          <w:bCs/>
-          <w:sz w:val="24"/>
-          <w:szCs w:val="24"/>
-        </w:rPr>
-        <w:t>Signal Crayfish (</w:t>
-      </w:r>
-      <w:proofErr w:type="spellStart"/>
+        <w:t>, House Sparrow (</w:t>
+      </w:r>
       <w:r>
         <w:rPr>
           <w:rFonts w:ascii="Times New Roman" w:eastAsia="Times New Roman" w:hAnsi="Times New Roman" w:cs="Times New Roman"/>
@@ -24631,152 +24046,8 @@
           <w:sz w:val="24"/>
           <w:szCs w:val="24"/>
         </w:rPr>
-        <w:t>Pacifastacus</w:t>
-      </w:r>
-      <w:proofErr w:type="spellEnd"/>
-      <w:r>
-        <w:rPr>
-          <w:rFonts w:ascii="Times New Roman" w:eastAsia="Times New Roman" w:hAnsi="Times New Roman" w:cs="Times New Roman"/>
-          <w:bCs/>
-          <w:i/>
-          <w:iCs/>
-          <w:sz w:val="24"/>
-          <w:szCs w:val="24"/>
-        </w:rPr>
-        <w:t xml:space="preserve"> </w:t>
-      </w:r>
-      <w:proofErr w:type="spellStart"/>
-      <w:r>
-        <w:rPr>
-          <w:rFonts w:ascii="Times New Roman" w:eastAsia="Times New Roman" w:hAnsi="Times New Roman" w:cs="Times New Roman"/>
-          <w:bCs/>
-          <w:i/>
-          <w:iCs/>
-          <w:sz w:val="24"/>
-          <w:szCs w:val="24"/>
-        </w:rPr>
-        <w:t>leniusculus</w:t>
-      </w:r>
-      <w:proofErr w:type="spellEnd"/>
-      <w:r>
-        <w:rPr>
-          <w:rFonts w:ascii="Times New Roman" w:eastAsia="Times New Roman" w:hAnsi="Times New Roman" w:cs="Times New Roman"/>
-          <w:bCs/>
-          <w:sz w:val="24"/>
-          <w:szCs w:val="24"/>
-        </w:rPr>
-        <w:t xml:space="preserve">) catch per unit effort (CPUE) </w:t>
-      </w:r>
-      <w:r>
-        <w:rPr>
-          <w:rFonts w:ascii="Times New Roman" w:eastAsia="Times New Roman" w:hAnsi="Times New Roman" w:cs="Times New Roman"/>
-          <w:bCs/>
-          <w:sz w:val="24"/>
-          <w:szCs w:val="24"/>
-        </w:rPr>
-        <w:t xml:space="preserve">in a Swedish Lake </w:t>
-      </w:r>
-      <w:r>
-        <w:rPr>
-          <w:rFonts w:ascii="Times New Roman" w:eastAsia="Times New Roman" w:hAnsi="Times New Roman" w:cs="Times New Roman"/>
-          <w:bCs/>
-          <w:sz w:val="24"/>
-          <w:szCs w:val="24"/>
-        </w:rPr>
-        <w:t xml:space="preserve">that was classified as Boom-Bust Sustained Unknown </w:t>
-      </w:r>
-      <w:r>
-        <w:rPr>
-          <w:rFonts w:ascii="Times New Roman" w:eastAsia="Times New Roman" w:hAnsi="Times New Roman" w:cs="Times New Roman"/>
-          <w:bCs/>
-          <w:sz w:val="24"/>
-          <w:szCs w:val="24"/>
-        </w:rPr>
-        <w:fldChar w:fldCharType="begin"/>
-      </w:r>
-      <w:r>
-        <w:rPr>
-          <w:rFonts w:ascii="Times New Roman" w:eastAsia="Times New Roman" w:hAnsi="Times New Roman" w:cs="Times New Roman"/>
-          <w:bCs/>
-          <w:sz w:val="24"/>
-          <w:szCs w:val="24"/>
-        </w:rPr>
-        <w:instrText xml:space="preserve"> ADDIN ZOTERO_ITEM CSL_CITATION {"citationID":"EJ4lp6Xf","properties":{"formattedCitation":"(Sandstr\\uc0\\u246{}m {\\i{}et al.} 2014)","plainCitation":"(Sandström et al. 2014)","noteIndex":0},"citationItems":[{"id":199,"uris":["http://zotero.org/users/9972654/items/VFU2AJ2S"],"itemData":{"id":199,"type":"article-journal","container-title":"Biological Invasions","DOI":"10.1007/s10530-014-0641-1","ISSN":"1387-3547, 1573-1464","issue":"9","journalAbbreviation":"Biol Invasions","language":"en","page":"1961-1977","source":"DOI.org (Crossref)","title":"Population collapses in introduced non-indigenous crayfish","volume":"16","author":[{"family":"Sandström","given":"Alfred"},{"family":"Andersson","given":"Magnus"},{"family":"Asp","given":"Anders"},{"family":"Bohman","given":"Patrik"},{"family":"Edsman","given":"Lennart"},{"family":"Engdahl","given":"Fredrik"},{"family":"Nyström","given":"Per"},{"family":"Stenberg","given":"Marika"},{"family":"Hertonsson","given":"Pia"},{"family":"Vrålstad","given":"Trude"},{"family":"Granèli","given":"Wilhelm"}],"issued":{"date-parts":[["2014",9]]}}}],"schema":"https://github.com/citation-style-language/schema/raw/master/csl-citation.json"} </w:instrText>
-      </w:r>
-      <w:r>
-        <w:rPr>
-          <w:rFonts w:ascii="Times New Roman" w:eastAsia="Times New Roman" w:hAnsi="Times New Roman" w:cs="Times New Roman"/>
-          <w:bCs/>
-          <w:sz w:val="24"/>
-          <w:szCs w:val="24"/>
-        </w:rPr>
-        <w:fldChar w:fldCharType="separate"/>
-      </w:r>
-      <w:r>
-        <w:rPr>
-          <w:rFonts w:ascii="Times New Roman" w:hAnsi="Times New Roman" w:cs="Times New Roman"/>
-          <w:sz w:val="24"/>
-        </w:rPr>
-        <w:t xml:space="preserve">(Sandström </w:t>
-      </w:r>
-      <w:r>
-        <w:rPr>
-          <w:rFonts w:ascii="Times New Roman" w:hAnsi="Times New Roman" w:cs="Times New Roman"/>
-          <w:i/>
-          <w:iCs/>
-          <w:sz w:val="24"/>
-        </w:rPr>
-        <w:t>et al.</w:t>
-      </w:r>
-      <w:r>
-        <w:rPr>
-          <w:rFonts w:ascii="Times New Roman" w:hAnsi="Times New Roman" w:cs="Times New Roman"/>
-          <w:sz w:val="24"/>
-        </w:rPr>
-        <w:t xml:space="preserve"> 2014)</w:t>
-      </w:r>
-      <w:r>
-        <w:rPr>
-          <w:rFonts w:ascii="Times New Roman" w:eastAsia="Times New Roman" w:hAnsi="Times New Roman" w:cs="Times New Roman"/>
-          <w:bCs/>
-          <w:sz w:val="24"/>
-          <w:szCs w:val="24"/>
-        </w:rPr>
-        <w:fldChar w:fldCharType="end"/>
-      </w:r>
-      <w:r>
-        <w:rPr>
-          <w:rFonts w:ascii="Times New Roman" w:eastAsia="Times New Roman" w:hAnsi="Times New Roman" w:cs="Times New Roman"/>
-          <w:bCs/>
-          <w:sz w:val="24"/>
-          <w:szCs w:val="24"/>
-        </w:rPr>
-        <w:t>, House Sparrow (</w:t>
-      </w:r>
-      <w:r>
-        <w:rPr>
-          <w:rFonts w:ascii="Times New Roman" w:eastAsia="Times New Roman" w:hAnsi="Times New Roman" w:cs="Times New Roman"/>
-          <w:bCs/>
-          <w:i/>
-          <w:iCs/>
-          <w:sz w:val="24"/>
-          <w:szCs w:val="24"/>
-        </w:rPr>
-        <w:t xml:space="preserve">Passer </w:t>
-      </w:r>
-      <w:proofErr w:type="spellStart"/>
-      <w:r>
-        <w:rPr>
-          <w:rFonts w:ascii="Times New Roman" w:eastAsia="Times New Roman" w:hAnsi="Times New Roman" w:cs="Times New Roman"/>
-          <w:bCs/>
-          <w:i/>
-          <w:iCs/>
-          <w:sz w:val="24"/>
-          <w:szCs w:val="24"/>
-        </w:rPr>
-        <w:t>domesticus</w:t>
-      </w:r>
-      <w:proofErr w:type="spellEnd"/>
+        <w:t>Passer domesticus</w:t>
+      </w:r>
       <w:r>
         <w:rPr>
           <w:rFonts w:ascii="Times New Roman" w:eastAsia="Times New Roman" w:hAnsi="Times New Roman" w:cs="Times New Roman"/>
@@ -25242,27 +24513,7 @@
           <w:sz w:val="24"/>
           <w:szCs w:val="24"/>
         </w:rPr>
-        <w:t xml:space="preserve"> of the </w:t>
-      </w:r>
-      <w:proofErr w:type="gramStart"/>
-      <w:r>
-        <w:rPr>
-          <w:rFonts w:ascii="Times New Roman" w:eastAsia="Times New Roman" w:hAnsi="Times New Roman" w:cs="Times New Roman"/>
-          <w:bCs/>
-          <w:sz w:val="24"/>
-          <w:szCs w:val="24"/>
-        </w:rPr>
-        <w:t>counts of time</w:t>
-      </w:r>
-      <w:proofErr w:type="gramEnd"/>
-      <w:r>
-        <w:rPr>
-          <w:rFonts w:ascii="Times New Roman" w:eastAsia="Times New Roman" w:hAnsi="Times New Roman" w:cs="Times New Roman"/>
-          <w:bCs/>
-          <w:sz w:val="24"/>
-          <w:szCs w:val="24"/>
-        </w:rPr>
-        <w:t xml:space="preserve"> series that had </w:t>
+        <w:t xml:space="preserve"> of the counts of time series that had </w:t>
       </w:r>
       <w:r>
         <w:rPr>
@@ -27310,25 +26561,7 @@
           <w:sz w:val="24"/>
           <w:szCs w:val="24"/>
         </w:rPr>
-        <w:t xml:space="preserve">to the </w:t>
-      </w:r>
-      <w:proofErr w:type="gramStart"/>
-      <w:r>
-        <w:rPr>
-          <w:rFonts w:ascii="Times New Roman" w:eastAsia="Times New Roman" w:hAnsi="Times New Roman" w:cs="Times New Roman"/>
-          <w:sz w:val="24"/>
-          <w:szCs w:val="24"/>
-        </w:rPr>
-        <w:t>collapse phase</w:t>
-      </w:r>
-      <w:proofErr w:type="gramEnd"/>
-      <w:r>
-        <w:rPr>
-          <w:rFonts w:ascii="Times New Roman" w:eastAsia="Times New Roman" w:hAnsi="Times New Roman" w:cs="Times New Roman"/>
-          <w:sz w:val="24"/>
-          <w:szCs w:val="24"/>
-        </w:rPr>
-        <w:t xml:space="preserve"> </w:t>
+        <w:t xml:space="preserve">to the collapse phase </w:t>
       </w:r>
       <w:r>
         <w:rPr>
@@ -27354,7 +26587,6 @@
         </w:rPr>
         <w:t xml:space="preserve">), </w:t>
       </w:r>
-      <w:proofErr w:type="gramStart"/>
       <w:r>
         <w:rPr>
           <w:rFonts w:ascii="Times New Roman" w:eastAsia="Gungsuh" w:hAnsi="Times New Roman" w:cs="Times New Roman"/>
@@ -27369,16 +26601,7 @@
           <w:sz w:val="24"/>
           <w:szCs w:val="24"/>
         </w:rPr>
-        <w:t>produce</w:t>
-      </w:r>
-      <w:proofErr w:type="gramEnd"/>
-      <w:r>
-        <w:rPr>
-          <w:rFonts w:ascii="Times New Roman" w:eastAsia="Gungsuh" w:hAnsi="Times New Roman" w:cs="Times New Roman"/>
-          <w:sz w:val="24"/>
-          <w:szCs w:val="24"/>
-        </w:rPr>
-        <w:t xml:space="preserve"> large reductions </w:t>
+        <w:t xml:space="preserve">produce large reductions </w:t>
       </w:r>
       <w:r>
         <w:rPr>

</xml_diff>